<commit_message>
Embed evidence images in generated staff Profiles
Profile generation now downloads the Candidate Documents used by
{%images.<key>} tags in the four staff profile templates and embeds them
in the evidence column: PNG/JPG as-is, PDFs rendered to PNG (first page)
with mupdf. Slots without a Candidate Document stay blank; any download
or render failure fails generation before anything is uploaded.

Co-Authored-By: Claude Opus 5.5 <noreply@anthropic.com>
</commit_message>
<xml_diff>
--- a/src/assets/profiles/Clarity-Staff-Profile_-_Care_UK_Care_Profile_Template_updated_May_2026.docx
+++ b/src/assets/profiles/Clarity-Staff-Profile_-_Care_UK_Care_Profile_Template_updated_May_2026.docx
@@ -1274,7 +1274,7 @@
             </w:pPr>
             <w:r>
               <w:rPr>
-                <w:rFonts w:cs="Calibri" w:ascii="Calibri" w:hAnsi="Calibri" w:asciiTheme="minorHAnsi" w:cstheme="minorHAnsi" w:hAnsiTheme="minorHAnsi"/>
+                <w:rFonts w:cs="Calibri" w:cstheme="minorHAnsi"/>
               </w:rPr>
               <w:t>All compliance has been carried out by the agency, as per CQC Regulation 19 (</w:t>
             </w:r>
@@ -1282,14 +1282,14 @@
               <w:r>
                 <w:rPr>
                   <w:rStyle w:val="Hyperlink"/>
-                  <w:rFonts w:cs="Calibri" w:ascii="Calibri" w:hAnsi="Calibri" w:asciiTheme="minorHAnsi" w:cstheme="minorHAnsi" w:hAnsiTheme="minorHAnsi"/>
+                  <w:rFonts w:cs="Calibri" w:cstheme="minorHAnsi"/>
                 </w:rPr>
                 <w:t>https://www.cqc.org.uk/sites/default/files/fid2932547-employment-requirements-regulation-19.pdf</w:t>
               </w:r>
             </w:hyperlink>
             <w:r>
               <w:rPr>
-                <w:rFonts w:cs="Calibri" w:ascii="Calibri" w:hAnsi="Calibri" w:asciiTheme="minorHAnsi" w:cstheme="minorHAnsi" w:hAnsiTheme="minorHAnsi"/>
+                <w:rFonts w:cs="Calibri" w:cstheme="minorHAnsi"/>
               </w:rPr>
               <w:t>), specifically, that the agency, as the employer, holds on record:</w:t>
             </w:r>
@@ -1483,7 +1483,7 @@
             </w:pPr>
             <w:r>
               <w:rPr>
-                <w:rFonts w:eastAsia="Times New Roman" w:cs="Calibri" w:ascii="Calibri" w:hAnsi="Calibri" w:asciiTheme="minorHAnsi" w:cstheme="minorHAnsi" w:hAnsiTheme="minorHAnsi"/>
+                <w:rFonts w:eastAsia="Times New Roman" w:cs="Calibri" w:cstheme="minorHAnsi"/>
               </w:rPr>
               <w:t>The individuals’ full right to work in the UK, which has been verified according to the statutory requirements.</w:t>
             </w:r>
@@ -1562,44 +1562,7 @@
             </w:pPr>
             <w:r>
               <w:rPr/>
-              <w:drawing>
-                <wp:inline distT="0" distB="0" distL="0" distR="0">
-                  <wp:extent cx="815340" cy="1151890"/>
-                  <wp:effectExtent l="0" t="0" r="0" b="0"/>
-                  <wp:docPr id="1" name="Picture 1"/>
-                  <wp:cNvGraphicFramePr>
-                    <a:graphicFrameLocks xmlns:a="http://schemas.openxmlformats.org/drawingml/2006/main" noChangeAspect="1"/>
-                  </wp:cNvGraphicFramePr>
-                  <a:graphic xmlns:a="http://schemas.openxmlformats.org/drawingml/2006/main">
-                    <a:graphicData uri="http://schemas.openxmlformats.org/drawingml/2006/picture">
-                      <pic:pic xmlns:pic="http://schemas.openxmlformats.org/drawingml/2006/picture">
-                        <pic:nvPicPr>
-                          <pic:cNvPr id="1" name="Picture 1"/>
-                          <pic:cNvPicPr>
-                            <a:picLocks noChangeAspect="1" noChangeArrowheads="1"/>
-                          </pic:cNvPicPr>
-                        </pic:nvPicPr>
-                        <pic:blipFill>
-                          <a:blip r:embed="rId3"/>
-                          <a:stretch>
-                            <a:fillRect/>
-                          </a:stretch>
-                        </pic:blipFill>
-                        <pic:spPr bwMode="auto">
-                          <a:xfrm>
-                            <a:off x="0" y="0"/>
-                            <a:ext cx="815340" cy="1151890"/>
-                          </a:xfrm>
-                          <a:prstGeom prst="rect">
-                            <a:avLst/>
-                          </a:prstGeom>
-                          <a:noFill/>
-                        </pic:spPr>
-                      </pic:pic>
-                    </a:graphicData>
-                  </a:graphic>
-                </wp:inline>
-              </w:drawing>
+              <w:t>{%images.RightToWorkShareCode}</w:t>
             </w:r>
           </w:p>
         </w:tc>
@@ -1705,7 +1668,7 @@
             </w:pPr>
             <w:r>
               <w:rPr>
-                <w:rFonts w:cs="Calibri" w:ascii="Calibri" w:hAnsi="Calibri" w:asciiTheme="minorHAnsi" w:cstheme="minorHAnsi" w:hAnsiTheme="minorHAnsi"/>
+                <w:rFonts w:cs="Calibri" w:cstheme="minorHAnsi"/>
                 <w:b/>
                 <w:bCs/>
                 <w:sz w:val="20"/>
@@ -1810,44 +1773,7 @@
             </w:pPr>
             <w:r>
               <w:rPr/>
-              <w:drawing>
-                <wp:inline distT="0" distB="0" distL="0" distR="0">
-                  <wp:extent cx="1118235" cy="1511935"/>
-                  <wp:effectExtent l="0" t="0" r="0" b="0"/>
-                  <wp:docPr id="2" name="Picture 2"/>
-                  <wp:cNvGraphicFramePr>
-                    <a:graphicFrameLocks xmlns:a="http://schemas.openxmlformats.org/drawingml/2006/main" noChangeAspect="1"/>
-                  </wp:cNvGraphicFramePr>
-                  <a:graphic xmlns:a="http://schemas.openxmlformats.org/drawingml/2006/main">
-                    <a:graphicData uri="http://schemas.openxmlformats.org/drawingml/2006/picture">
-                      <pic:pic xmlns:pic="http://schemas.openxmlformats.org/drawingml/2006/picture">
-                        <pic:nvPicPr>
-                          <pic:cNvPr id="2" name="Picture 2"/>
-                          <pic:cNvPicPr>
-                            <a:picLocks noChangeAspect="1" noChangeArrowheads="1"/>
-                          </pic:cNvPicPr>
-                        </pic:nvPicPr>
-                        <pic:blipFill>
-                          <a:blip r:embed="rId4"/>
-                          <a:stretch>
-                            <a:fillRect/>
-                          </a:stretch>
-                        </pic:blipFill>
-                        <pic:spPr bwMode="auto">
-                          <a:xfrm>
-                            <a:off x="0" y="0"/>
-                            <a:ext cx="1118235" cy="1511935"/>
-                          </a:xfrm>
-                          <a:prstGeom prst="rect">
-                            <a:avLst/>
-                          </a:prstGeom>
-                          <a:noFill/>
-                        </pic:spPr>
-                      </pic:pic>
-                    </a:graphicData>
-                  </a:graphic>
-                </wp:inline>
-              </w:drawing>
+              <w:t>{%images.Passport}</w:t>
             </w:r>
           </w:p>
         </w:tc>
@@ -1988,50 +1914,19 @@
               <w:pStyle w:val="Normal"/>
               <w:rPr>
                 <w:rFonts w:ascii="Calibri" w:hAnsi="Calibri" w:cs="Calibri" w:asciiTheme="minorHAnsi" w:cstheme="minorHAnsi" w:hAnsiTheme="minorHAnsi"/>
+                <w:b/>
+                <w:bCs/>
                 <w:sz w:val="22"/>
                 <w:szCs w:val="22"/>
               </w:rPr>
             </w:pPr>
             <w:r>
               <w:rPr/>
-              <w:drawing>
-                <wp:inline distT="0" distB="0" distL="0" distR="0">
-                  <wp:extent cx="1062990" cy="1511935"/>
-                  <wp:effectExtent l="0" t="0" r="0" b="0"/>
-                  <wp:docPr id="3" name="Image2"/>
-                  <wp:cNvGraphicFramePr>
-                    <a:graphicFrameLocks xmlns:a="http://schemas.openxmlformats.org/drawingml/2006/main" noChangeAspect="1"/>
-                  </wp:cNvGraphicFramePr>
-                  <a:graphic xmlns:a="http://schemas.openxmlformats.org/drawingml/2006/main">
-                    <a:graphicData uri="http://schemas.openxmlformats.org/drawingml/2006/picture">
-                      <pic:pic xmlns:pic="http://schemas.openxmlformats.org/drawingml/2006/picture">
-                        <pic:nvPicPr>
-                          <pic:cNvPr id="3" name="Image2"/>
-                          <pic:cNvPicPr>
-                            <a:picLocks noChangeAspect="1" noChangeArrowheads="1"/>
-                          </pic:cNvPicPr>
-                        </pic:nvPicPr>
-                        <pic:blipFill>
-                          <a:blip r:embed="rId5"/>
-                          <a:stretch>
-                            <a:fillRect/>
-                          </a:stretch>
-                        </pic:blipFill>
-                        <pic:spPr bwMode="auto">
-                          <a:xfrm>
-                            <a:off x="0" y="0"/>
-                            <a:ext cx="1062990" cy="1511935"/>
-                          </a:xfrm>
-                          <a:prstGeom prst="rect">
-                            <a:avLst/>
-                          </a:prstGeom>
-                          <a:noFill/>
-                        </pic:spPr>
-                      </pic:pic>
-                    </a:graphicData>
-                  </a:graphic>
-                </wp:inline>
-              </w:drawing>
+              <w:t>{%images.TermLetter}</w:t>
+            </w:r>
+            <w:r>
+              <w:rPr/>
+              <w:t>{%images.CosLetter}</w:t>
             </w:r>
           </w:p>
         </w:tc>
@@ -2317,44 +2212,7 @@
             </w:pPr>
             <w:r>
               <w:rPr/>
-              <w:drawing>
-                <wp:inline distT="0" distB="0" distL="0" distR="0">
-                  <wp:extent cx="1583055" cy="2239010"/>
-                  <wp:effectExtent l="0" t="0" r="0" b="0"/>
-                  <wp:docPr id="4" name="Picture 3"/>
-                  <wp:cNvGraphicFramePr>
-                    <a:graphicFrameLocks xmlns:a="http://schemas.openxmlformats.org/drawingml/2006/main" noChangeAspect="1"/>
-                  </wp:cNvGraphicFramePr>
-                  <a:graphic xmlns:a="http://schemas.openxmlformats.org/drawingml/2006/main">
-                    <a:graphicData uri="http://schemas.openxmlformats.org/drawingml/2006/picture">
-                      <pic:pic xmlns:pic="http://schemas.openxmlformats.org/drawingml/2006/picture">
-                        <pic:nvPicPr>
-                          <pic:cNvPr id="4" name="Picture 3"/>
-                          <pic:cNvPicPr>
-                            <a:picLocks noChangeAspect="1" noChangeArrowheads="1"/>
-                          </pic:cNvPicPr>
-                        </pic:nvPicPr>
-                        <pic:blipFill>
-                          <a:blip r:embed="rId6"/>
-                          <a:stretch>
-                            <a:fillRect/>
-                          </a:stretch>
-                        </pic:blipFill>
-                        <pic:spPr bwMode="auto">
-                          <a:xfrm>
-                            <a:off x="0" y="0"/>
-                            <a:ext cx="1583055" cy="2239010"/>
-                          </a:xfrm>
-                          <a:prstGeom prst="rect">
-                            <a:avLst/>
-                          </a:prstGeom>
-                          <a:noFill/>
-                        </pic:spPr>
-                      </pic:pic>
-                    </a:graphicData>
-                  </a:graphic>
-                </wp:inline>
-              </w:drawing>
+              <w:t>{%images.EnhancedDbsCertificate}</w:t>
             </w:r>
           </w:p>
         </w:tc>
@@ -3497,7 +3355,7 @@
           <w:tbl>
             <w:tblPr>
               <w:tblStyle w:val="TableGrid"/>
-              <w:tblpPr w:vertAnchor="margin" w:horzAnchor="margin" w:leftFromText="180" w:rightFromText="180" w:tblpX="-142" w:tblpY="-1020"/>
+              <w:tblpPr w:vertAnchor="margin" w:horzAnchor="margin" w:leftFromText="180" w:rightFromText="180" w:tblpX="-137" w:tblpY="-1020"/>
               <w:tblOverlap w:val="never"/>
               <w:tblW w:w="10454" w:type="dxa"/>
               <w:jc w:val="start"/>
@@ -3514,8 +3372,8 @@
             <w:tblGrid>
               <w:gridCol w:w="6942"/>
               <w:gridCol w:w="706"/>
-              <w:gridCol w:w="705"/>
-              <w:gridCol w:w="2101"/>
+              <w:gridCol w:w="704"/>
+              <w:gridCol w:w="2102"/>
             </w:tblGrid>
             <w:tr>
               <w:trPr>
@@ -3531,6 +3389,7 @@
                   <w:pPr>
                     <w:pStyle w:val="Normal"/>
                     <w:widowControl/>
+                    <w:suppressAutoHyphens w:val="true"/>
                     <w:spacing w:before="0" w:after="0"/>
                     <w:jc w:val="start"/>
                     <w:rPr>
@@ -3565,6 +3424,7 @@
                   <w:pPr>
                     <w:pStyle w:val="Normal"/>
                     <w:widowControl/>
+                    <w:suppressAutoHyphens w:val="true"/>
                     <w:spacing w:before="0" w:after="0"/>
                     <w:jc w:val="start"/>
                     <w:rPr>
@@ -3603,14 +3463,15 @@
               </w:tc>
               <w:tc>
                 <w:tcPr>
-                  <w:tcW w:w="705" w:type="dxa"/>
-                  <w:tcBorders/>
-                  <w:vAlign w:val="center"/>
-                </w:tcPr>
-                <w:p>
-                  <w:pPr>
-                    <w:pStyle w:val="Normal"/>
-                    <w:widowControl/>
+                  <w:tcW w:w="704" w:type="dxa"/>
+                  <w:tcBorders/>
+                  <w:vAlign w:val="center"/>
+                </w:tcPr>
+                <w:p>
+                  <w:pPr>
+                    <w:pStyle w:val="Normal"/>
+                    <w:widowControl/>
+                    <w:suppressAutoHyphens w:val="true"/>
                     <w:spacing w:before="0" w:after="0"/>
                     <w:jc w:val="start"/>
                     <w:rPr>
@@ -3649,14 +3510,15 @@
               </w:tc>
               <w:tc>
                 <w:tcPr>
-                  <w:tcW w:w="2101" w:type="dxa"/>
-                  <w:tcBorders/>
-                  <w:vAlign w:val="center"/>
-                </w:tcPr>
-                <w:p>
-                  <w:pPr>
-                    <w:pStyle w:val="Normal"/>
-                    <w:widowControl/>
+                  <w:tcW w:w="2102" w:type="dxa"/>
+                  <w:tcBorders/>
+                  <w:vAlign w:val="center"/>
+                </w:tcPr>
+                <w:p>
+                  <w:pPr>
+                    <w:pStyle w:val="Normal"/>
+                    <w:widowControl/>
+                    <w:suppressAutoHyphens w:val="true"/>
                     <w:spacing w:before="0" w:after="0"/>
                     <w:jc w:val="start"/>
                     <w:rPr>
@@ -3697,6 +3559,7 @@
                   <w:pPr>
                     <w:pStyle w:val="Normal"/>
                     <w:widowControl/>
+                    <w:suppressAutoHyphens w:val="true"/>
                     <w:spacing w:before="0" w:after="0"/>
                     <w:jc w:val="start"/>
                     <w:rPr>
@@ -3732,6 +3595,7 @@
                   <w:pPr>
                     <w:pStyle w:val="Normal"/>
                     <w:widowControl/>
+                    <w:suppressAutoHyphens w:val="true"/>
                     <w:spacing w:before="0" w:after="0"/>
                     <w:jc w:val="start"/>
                     <w:rPr>
@@ -3762,6 +3626,7 @@
                   <w:pPr>
                     <w:pStyle w:val="Normal"/>
                     <w:widowControl/>
+                    <w:suppressAutoHyphens w:val="true"/>
                     <w:spacing w:before="0" w:after="0"/>
                     <w:jc w:val="start"/>
                     <w:rPr>
@@ -3799,14 +3664,15 @@
               </w:tc>
               <w:tc>
                 <w:tcPr>
-                  <w:tcW w:w="705" w:type="dxa"/>
-                  <w:tcBorders/>
-                  <w:vAlign w:val="center"/>
-                </w:tcPr>
-                <w:p>
-                  <w:pPr>
-                    <w:pStyle w:val="Normal"/>
-                    <w:widowControl/>
+                  <w:tcW w:w="704" w:type="dxa"/>
+                  <w:tcBorders/>
+                  <w:vAlign w:val="center"/>
+                </w:tcPr>
+                <w:p>
+                  <w:pPr>
+                    <w:pStyle w:val="Normal"/>
+                    <w:widowControl/>
+                    <w:suppressAutoHyphens w:val="true"/>
                     <w:spacing w:before="0" w:after="0"/>
                     <w:jc w:val="start"/>
                     <w:rPr>
@@ -3844,7 +3710,7 @@
               </w:tc>
               <w:tc>
                 <w:tcPr>
-                  <w:tcW w:w="2101" w:type="dxa"/>
+                  <w:tcW w:w="2102" w:type="dxa"/>
                   <w:tcBorders/>
                   <w:vAlign w:val="bottom"/>
                 </w:tcPr>
@@ -3852,6 +3718,7 @@
                   <w:pPr>
                     <w:pStyle w:val="Normal"/>
                     <w:widowControl/>
+                    <w:suppressAutoHyphens w:val="true"/>
                     <w:spacing w:before="0" w:after="0"/>
                     <w:jc w:val="start"/>
                     <w:rPr>
@@ -3889,6 +3756,7 @@
                   <w:pPr>
                     <w:pStyle w:val="Normal"/>
                     <w:widowControl/>
+                    <w:suppressAutoHyphens w:val="true"/>
                     <w:spacing w:before="0" w:after="0"/>
                     <w:jc w:val="start"/>
                     <w:rPr>
@@ -3919,6 +3787,7 @@
                   <w:pPr>
                     <w:pStyle w:val="Normal"/>
                     <w:widowControl/>
+                    <w:suppressAutoHyphens w:val="true"/>
                     <w:spacing w:before="0" w:after="0"/>
                     <w:jc w:val="start"/>
                     <w:rPr>
@@ -3956,14 +3825,15 @@
               </w:tc>
               <w:tc>
                 <w:tcPr>
-                  <w:tcW w:w="705" w:type="dxa"/>
-                  <w:tcBorders/>
-                  <w:vAlign w:val="center"/>
-                </w:tcPr>
-                <w:p>
-                  <w:pPr>
-                    <w:pStyle w:val="Normal"/>
-                    <w:widowControl/>
+                  <w:tcW w:w="704" w:type="dxa"/>
+                  <w:tcBorders/>
+                  <w:vAlign w:val="center"/>
+                </w:tcPr>
+                <w:p>
+                  <w:pPr>
+                    <w:pStyle w:val="Normal"/>
+                    <w:widowControl/>
+                    <w:suppressAutoHyphens w:val="true"/>
                     <w:spacing w:before="0" w:after="0"/>
                     <w:jc w:val="start"/>
                     <w:rPr>
@@ -4001,7 +3871,7 @@
               </w:tc>
               <w:tc>
                 <w:tcPr>
-                  <w:tcW w:w="2101" w:type="dxa"/>
+                  <w:tcW w:w="2102" w:type="dxa"/>
                   <w:tcBorders/>
                   <w:vAlign w:val="bottom"/>
                 </w:tcPr>
@@ -4009,6 +3879,7 @@
                   <w:pPr>
                     <w:pStyle w:val="Normal"/>
                     <w:widowControl/>
+                    <w:suppressAutoHyphens w:val="true"/>
                     <w:spacing w:before="0" w:after="0"/>
                     <w:jc w:val="start"/>
                     <w:rPr>
@@ -4038,7 +3909,7 @@
               </w:trPr>
               <w:tc>
                 <w:tcPr>
-                  <w:tcW w:w="8353" w:type="dxa"/>
+                  <w:tcW w:w="8352" w:type="dxa"/>
                   <w:gridSpan w:val="3"/>
                   <w:tcBorders/>
                   <w:vAlign w:val="center"/>
@@ -4047,6 +3918,7 @@
                   <w:pPr>
                     <w:pStyle w:val="Normal"/>
                     <w:widowControl/>
+                    <w:suppressAutoHyphens w:val="true"/>
                     <w:spacing w:before="0" w:after="0"/>
                     <w:jc w:val="start"/>
                     <w:rPr>
@@ -4070,50 +3942,48 @@
                   <w:pPr>
                     <w:pStyle w:val="Normal"/>
                     <w:widowControl/>
-                    <w:spacing w:before="0" w:after="0"/>
-                    <w:jc w:val="start"/>
-                    <w:rPr>
-                      <w:rFonts w:ascii="Calibri" w:hAnsi="Calibri" w:cs="Calibri" w:asciiTheme="minorHAnsi" w:cstheme="minorHAnsi" w:hAnsiTheme="minorHAnsi"/>
-                      <w:sz w:val="22"/>
-                      <w:szCs w:val="22"/>
-                    </w:rPr>
-                  </w:pPr>
-                  <w:r>
-                    <w:rPr>
-                      <w:rFonts w:eastAsia="Times New Roman" w:cs="Calibri" w:cstheme="minorHAnsi" w:ascii="Calibri" w:hAnsi="Calibri"/>
-                      <w:kern w:val="0"/>
-                      <w:sz w:val="22"/>
-                      <w:szCs w:val="22"/>
-                      <w:lang w:bidi="ar-SA"/>
-                    </w:rPr>
-                  </w:r>
-                </w:p>
-                <w:p>
-                  <w:pPr>
-                    <w:pStyle w:val="Normal"/>
-                    <w:widowControl/>
-                    <w:spacing w:before="0" w:after="0"/>
-                    <w:jc w:val="start"/>
-                    <w:rPr>
-                      <w:rFonts w:ascii="Calibri" w:hAnsi="Calibri" w:cs="Calibri" w:asciiTheme="minorHAnsi" w:cstheme="minorHAnsi" w:hAnsiTheme="minorHAnsi"/>
-                      <w:sz w:val="22"/>
-                      <w:szCs w:val="22"/>
-                    </w:rPr>
-                  </w:pPr>
-                  <w:r>
-                    <w:rPr>
-                      <w:rFonts w:eastAsia="Times New Roman" w:cs="Calibri" w:cstheme="minorHAnsi" w:ascii="Calibri" w:hAnsi="Calibri"/>
-                      <w:kern w:val="0"/>
-                      <w:sz w:val="22"/>
-                      <w:szCs w:val="22"/>
-                      <w:lang w:bidi="ar-SA"/>
-                    </w:rPr>
-                  </w:r>
-                </w:p>
-              </w:tc>
-              <w:tc>
-                <w:tcPr>
-                  <w:tcW w:w="2101" w:type="dxa"/>
+                    <w:suppressAutoHyphens w:val="true"/>
+                    <w:spacing w:before="0" w:after="0"/>
+                    <w:jc w:val="start"/>
+                    <w:rPr>
+                      <w:rFonts w:ascii="Calibri" w:hAnsi="Calibri" w:cs="Calibri" w:asciiTheme="minorHAnsi" w:cstheme="minorHAnsi" w:hAnsiTheme="minorHAnsi"/>
+                      <w:sz w:val="22"/>
+                      <w:szCs w:val="22"/>
+                    </w:rPr>
+                  </w:pPr>
+                  <w:r>
+                    <w:rPr>
+                      <w:rFonts w:cs="Calibri" w:cstheme="minorHAnsi" w:ascii="Calibri" w:hAnsi="Calibri"/>
+                      <w:sz w:val="22"/>
+                      <w:szCs w:val="22"/>
+                    </w:rPr>
+                  </w:r>
+                </w:p>
+                <w:p>
+                  <w:pPr>
+                    <w:pStyle w:val="Normal"/>
+                    <w:widowControl/>
+                    <w:suppressAutoHyphens w:val="true"/>
+                    <w:spacing w:before="0" w:after="0"/>
+                    <w:jc w:val="start"/>
+                    <w:rPr>
+                      <w:rFonts w:ascii="Calibri" w:hAnsi="Calibri" w:cs="Calibri" w:asciiTheme="minorHAnsi" w:cstheme="minorHAnsi" w:hAnsiTheme="minorHAnsi"/>
+                      <w:sz w:val="22"/>
+                      <w:szCs w:val="22"/>
+                    </w:rPr>
+                  </w:pPr>
+                  <w:r>
+                    <w:rPr>
+                      <w:rFonts w:cs="Calibri" w:cstheme="minorHAnsi" w:ascii="Calibri" w:hAnsi="Calibri"/>
+                      <w:sz w:val="22"/>
+                      <w:szCs w:val="22"/>
+                    </w:rPr>
+                  </w:r>
+                </w:p>
+              </w:tc>
+              <w:tc>
+                <w:tcPr>
+                  <w:tcW w:w="2102" w:type="dxa"/>
                   <w:tcBorders/>
                   <w:vAlign w:val="bottom"/>
                 </w:tcPr>
@@ -4121,6 +3991,7 @@
                   <w:pPr>
                     <w:pStyle w:val="Normal"/>
                     <w:widowControl/>
+                    <w:suppressAutoHyphens w:val="true"/>
                     <w:spacing w:before="0" w:after="0"/>
                     <w:jc w:val="start"/>
                     <w:rPr>
@@ -4132,12 +4003,10 @@
                   </w:pPr>
                   <w:r>
                     <w:rPr>
-                      <w:rFonts w:eastAsia="Times New Roman" w:cs="Calibri" w:cstheme="minorHAnsi" w:ascii="Calibri" w:hAnsi="Calibri"/>
+                      <w:rFonts w:cs="Calibri" w:cstheme="minorHAnsi" w:ascii="Calibri" w:hAnsi="Calibri"/>
                       <w:b/>
-                      <w:kern w:val="0"/>
-                      <w:sz w:val="22"/>
-                      <w:szCs w:val="22"/>
-                      <w:lang w:bidi="ar-SA"/>
+                      <w:sz w:val="22"/>
+                      <w:szCs w:val="22"/>
                     </w:rPr>
                   </w:r>
                 </w:p>
@@ -4156,6 +4025,7 @@
                 <w:szCs w:val="22"/>
               </w:rPr>
             </w:pPr>
+            <w:r/>
             <w:r>
               <w:rPr>
                 <w:rFonts w:cs="Calibri" w:ascii="Calibri" w:hAnsi="Calibri" w:asciiTheme="minorHAnsi" w:cstheme="minorHAnsi" w:hAnsiTheme="minorHAnsi"/>
@@ -4183,17 +4053,17 @@
               <w:tblLook w:noHBand="0" w:lastColumn="0" w:firstColumn="1" w:lastRow="0" w:firstRow="1" w:noVBand="1" w:val="04a0"/>
             </w:tblPr>
             <w:tblGrid>
-              <w:gridCol w:w="5948"/>
+              <w:gridCol w:w="5947"/>
               <w:gridCol w:w="709"/>
               <w:gridCol w:w="708"/>
-              <w:gridCol w:w="710"/>
+              <w:gridCol w:w="711"/>
               <w:gridCol w:w="2385"/>
             </w:tblGrid>
             <w:tr>
               <w:trPr/>
               <w:tc>
                 <w:tcPr>
-                  <w:tcW w:w="5948" w:type="dxa"/>
+                  <w:tcW w:w="5947" w:type="dxa"/>
                   <w:tcBorders/>
                   <w:shd w:color="auto" w:fill="BFBFBF" w:themeFill="background1" w:themeFillShade="bf" w:val="clear"/>
                 </w:tcPr>
@@ -4201,6 +4071,7 @@
                   <w:pPr>
                     <w:pStyle w:val="Normal"/>
                     <w:widowControl/>
+                    <w:suppressAutoHyphens w:val="true"/>
                     <w:spacing w:before="0" w:after="0"/>
                     <w:jc w:val="start"/>
                     <w:rPr>
@@ -4235,6 +4106,7 @@
                   <w:pPr>
                     <w:pStyle w:val="Normal"/>
                     <w:widowControl/>
+                    <w:suppressAutoHyphens w:val="true"/>
                     <w:spacing w:before="0" w:after="0"/>
                     <w:jc w:val="start"/>
                     <w:rPr>
@@ -4269,6 +4141,7 @@
                   <w:pPr>
                     <w:pStyle w:val="Normal"/>
                     <w:widowControl/>
+                    <w:suppressAutoHyphens w:val="true"/>
                     <w:spacing w:before="0" w:after="0"/>
                     <w:jc w:val="start"/>
                     <w:rPr>
@@ -4295,7 +4168,7 @@
               </w:tc>
               <w:tc>
                 <w:tcPr>
-                  <w:tcW w:w="710" w:type="dxa"/>
+                  <w:tcW w:w="711" w:type="dxa"/>
                   <w:tcBorders/>
                   <w:shd w:color="auto" w:fill="BFBFBF" w:themeFill="background1" w:themeFillShade="bf" w:val="clear"/>
                 </w:tcPr>
@@ -4303,6 +4176,7 @@
                   <w:pPr>
                     <w:pStyle w:val="Normal"/>
                     <w:widowControl/>
+                    <w:suppressAutoHyphens w:val="true"/>
                     <w:spacing w:before="0" w:after="0"/>
                     <w:jc w:val="start"/>
                     <w:rPr>
@@ -4337,6 +4211,7 @@
                   <w:pPr>
                     <w:pStyle w:val="Normal"/>
                     <w:widowControl/>
+                    <w:suppressAutoHyphens w:val="true"/>
                     <w:spacing w:before="0" w:after="0"/>
                     <w:jc w:val="start"/>
                     <w:rPr>
@@ -4368,14 +4243,15 @@
               </w:trPr>
               <w:tc>
                 <w:tcPr>
-                  <w:tcW w:w="5948" w:type="dxa"/>
-                  <w:tcBorders/>
-                  <w:vAlign w:val="center"/>
-                </w:tcPr>
-                <w:p>
-                  <w:pPr>
-                    <w:pStyle w:val="Normal"/>
-                    <w:widowControl/>
+                  <w:tcW w:w="5947" w:type="dxa"/>
+                  <w:tcBorders/>
+                  <w:vAlign w:val="center"/>
+                </w:tcPr>
+                <w:p>
+                  <w:pPr>
+                    <w:pStyle w:val="Normal"/>
+                    <w:widowControl/>
+                    <w:suppressAutoHyphens w:val="true"/>
                     <w:spacing w:before="0" w:after="0"/>
                     <w:jc w:val="start"/>
                     <w:rPr>
@@ -4408,6 +4284,7 @@
                   <w:pPr>
                     <w:pStyle w:val="Normal"/>
                     <w:widowControl/>
+                    <w:suppressAutoHyphens w:val="true"/>
                     <w:spacing w:before="0" w:after="0"/>
                     <w:jc w:val="start"/>
                     <w:rPr>
@@ -4438,6 +4315,7 @@
                   <w:pPr>
                     <w:pStyle w:val="Normal"/>
                     <w:widowControl/>
+                    <w:suppressAutoHyphens w:val="true"/>
                     <w:spacing w:before="0" w:after="0"/>
                     <w:jc w:val="start"/>
                     <w:rPr>
@@ -4460,7 +4338,7 @@
               </w:tc>
               <w:tc>
                 <w:tcPr>
-                  <w:tcW w:w="710" w:type="dxa"/>
+                  <w:tcW w:w="711" w:type="dxa"/>
                   <w:tcBorders/>
                   <w:shd w:color="auto" w:fill="D9D9D9" w:themeFill="background1" w:themeFillShade="d9" w:val="clear"/>
                   <w:vAlign w:val="center"/>
@@ -4469,21 +4347,20 @@
                   <w:pPr>
                     <w:pStyle w:val="Normal"/>
                     <w:widowControl/>
-                    <w:spacing w:before="0" w:after="0"/>
-                    <w:jc w:val="start"/>
-                    <w:rPr>
-                      <w:rFonts w:ascii="Calibri" w:hAnsi="Calibri" w:cs="Calibri" w:asciiTheme="minorHAnsi" w:cstheme="minorHAnsi" w:hAnsiTheme="minorHAnsi"/>
-                      <w:sz w:val="22"/>
-                      <w:szCs w:val="22"/>
-                    </w:rPr>
-                  </w:pPr>
-                  <w:r>
-                    <w:rPr>
-                      <w:rFonts w:eastAsia="Times New Roman" w:cs="Calibri" w:cstheme="minorHAnsi" w:ascii="Calibri" w:hAnsi="Calibri"/>
-                      <w:kern w:val="0"/>
-                      <w:sz w:val="22"/>
-                      <w:szCs w:val="22"/>
-                      <w:lang w:bidi="ar-SA"/>
+                    <w:suppressAutoHyphens w:val="true"/>
+                    <w:spacing w:before="0" w:after="0"/>
+                    <w:jc w:val="start"/>
+                    <w:rPr>
+                      <w:rFonts w:ascii="Calibri" w:hAnsi="Calibri" w:cs="Calibri" w:asciiTheme="minorHAnsi" w:cstheme="minorHAnsi" w:hAnsiTheme="minorHAnsi"/>
+                      <w:sz w:val="22"/>
+                      <w:szCs w:val="22"/>
+                    </w:rPr>
+                  </w:pPr>
+                  <w:r>
+                    <w:rPr>
+                      <w:rFonts w:cs="Calibri" w:cstheme="minorHAnsi" w:ascii="Calibri" w:hAnsi="Calibri"/>
+                      <w:sz w:val="22"/>
+                      <w:szCs w:val="22"/>
                     </w:rPr>
                   </w:r>
                 </w:p>
@@ -4498,6 +4375,7 @@
                   <w:pPr>
                     <w:pStyle w:val="Normal"/>
                     <w:widowControl/>
+                    <w:suppressAutoHyphens w:val="true"/>
                     <w:spacing w:before="0" w:after="0"/>
                     <w:jc w:val="start"/>
                     <w:rPr>
@@ -4525,14 +4403,15 @@
               </w:trPr>
               <w:tc>
                 <w:tcPr>
-                  <w:tcW w:w="5948" w:type="dxa"/>
-                  <w:tcBorders/>
-                  <w:vAlign w:val="center"/>
-                </w:tcPr>
-                <w:p>
-                  <w:pPr>
-                    <w:pStyle w:val="Normal"/>
-                    <w:widowControl/>
+                  <w:tcW w:w="5947" w:type="dxa"/>
+                  <w:tcBorders/>
+                  <w:vAlign w:val="center"/>
+                </w:tcPr>
+                <w:p>
+                  <w:pPr>
+                    <w:pStyle w:val="Normal"/>
+                    <w:widowControl/>
+                    <w:suppressAutoHyphens w:val="true"/>
                     <w:spacing w:before="0" w:after="0"/>
                     <w:jc w:val="start"/>
                     <w:rPr>
@@ -4565,6 +4444,7 @@
                   <w:pPr>
                     <w:pStyle w:val="Normal"/>
                     <w:widowControl/>
+                    <w:suppressAutoHyphens w:val="true"/>
                     <w:spacing w:before="0" w:after="0"/>
                     <w:jc w:val="start"/>
                     <w:rPr>
@@ -4595,6 +4475,7 @@
                   <w:pPr>
                     <w:pStyle w:val="Normal"/>
                     <w:widowControl/>
+                    <w:suppressAutoHyphens w:val="true"/>
                     <w:spacing w:before="0" w:after="0"/>
                     <w:jc w:val="start"/>
                     <w:rPr>
@@ -4617,7 +4498,7 @@
               </w:tc>
               <w:tc>
                 <w:tcPr>
-                  <w:tcW w:w="710" w:type="dxa"/>
+                  <w:tcW w:w="711" w:type="dxa"/>
                   <w:tcBorders/>
                   <w:shd w:color="auto" w:fill="D9D9D9" w:themeFill="background1" w:themeFillShade="d9" w:val="clear"/>
                   <w:vAlign w:val="center"/>
@@ -4626,21 +4507,20 @@
                   <w:pPr>
                     <w:pStyle w:val="Normal"/>
                     <w:widowControl/>
-                    <w:spacing w:before="0" w:after="0"/>
-                    <w:jc w:val="start"/>
-                    <w:rPr>
-                      <w:rFonts w:ascii="Calibri" w:hAnsi="Calibri" w:cs="Calibri" w:asciiTheme="minorHAnsi" w:cstheme="minorHAnsi" w:hAnsiTheme="minorHAnsi"/>
-                      <w:sz w:val="22"/>
-                      <w:szCs w:val="22"/>
-                    </w:rPr>
-                  </w:pPr>
-                  <w:r>
-                    <w:rPr>
-                      <w:rFonts w:eastAsia="Times New Roman" w:cs="Calibri" w:cstheme="minorHAnsi" w:ascii="Calibri" w:hAnsi="Calibri"/>
-                      <w:kern w:val="0"/>
-                      <w:sz w:val="22"/>
-                      <w:szCs w:val="22"/>
-                      <w:lang w:bidi="ar-SA"/>
+                    <w:suppressAutoHyphens w:val="true"/>
+                    <w:spacing w:before="0" w:after="0"/>
+                    <w:jc w:val="start"/>
+                    <w:rPr>
+                      <w:rFonts w:ascii="Calibri" w:hAnsi="Calibri" w:cs="Calibri" w:asciiTheme="minorHAnsi" w:cstheme="minorHAnsi" w:hAnsiTheme="minorHAnsi"/>
+                      <w:sz w:val="22"/>
+                      <w:szCs w:val="22"/>
+                    </w:rPr>
+                  </w:pPr>
+                  <w:r>
+                    <w:rPr>
+                      <w:rFonts w:cs="Calibri" w:cstheme="minorHAnsi" w:ascii="Calibri" w:hAnsi="Calibri"/>
+                      <w:sz w:val="22"/>
+                      <w:szCs w:val="22"/>
                     </w:rPr>
                   </w:r>
                 </w:p>
@@ -4654,6 +4534,7 @@
                   <w:pPr>
                     <w:pStyle w:val="Normal"/>
                     <w:widowControl/>
+                    <w:suppressAutoHyphens w:val="true"/>
                     <w:spacing w:before="0" w:after="0"/>
                     <w:jc w:val="start"/>
                     <w:rPr>
@@ -4681,14 +4562,15 @@
               </w:trPr>
               <w:tc>
                 <w:tcPr>
-                  <w:tcW w:w="5948" w:type="dxa"/>
-                  <w:tcBorders/>
-                  <w:vAlign w:val="center"/>
-                </w:tcPr>
-                <w:p>
-                  <w:pPr>
-                    <w:pStyle w:val="Normal"/>
-                    <w:widowControl/>
+                  <w:tcW w:w="5947" w:type="dxa"/>
+                  <w:tcBorders/>
+                  <w:vAlign w:val="center"/>
+                </w:tcPr>
+                <w:p>
+                  <w:pPr>
+                    <w:pStyle w:val="Normal"/>
+                    <w:widowControl/>
+                    <w:suppressAutoHyphens w:val="true"/>
                     <w:spacing w:before="0" w:after="0"/>
                     <w:jc w:val="start"/>
                     <w:rPr>
@@ -4721,6 +4603,7 @@
                   <w:pPr>
                     <w:pStyle w:val="Normal"/>
                     <w:widowControl/>
+                    <w:suppressAutoHyphens w:val="true"/>
                     <w:spacing w:before="0" w:after="0"/>
                     <w:jc w:val="start"/>
                     <w:rPr>
@@ -4751,6 +4634,7 @@
                   <w:pPr>
                     <w:pStyle w:val="Normal"/>
                     <w:widowControl/>
+                    <w:suppressAutoHyphens w:val="true"/>
                     <w:spacing w:before="0" w:after="0"/>
                     <w:jc w:val="start"/>
                     <w:rPr>
@@ -4773,7 +4657,7 @@
               </w:tc>
               <w:tc>
                 <w:tcPr>
-                  <w:tcW w:w="710" w:type="dxa"/>
+                  <w:tcW w:w="711" w:type="dxa"/>
                   <w:tcBorders/>
                   <w:shd w:color="auto" w:fill="D9D9D9" w:themeFill="background1" w:themeFillShade="d9" w:val="clear"/>
                   <w:vAlign w:val="center"/>
@@ -4782,21 +4666,20 @@
                   <w:pPr>
                     <w:pStyle w:val="Normal"/>
                     <w:widowControl/>
-                    <w:spacing w:before="0" w:after="0"/>
-                    <w:jc w:val="start"/>
-                    <w:rPr>
-                      <w:rFonts w:ascii="Calibri" w:hAnsi="Calibri" w:cs="Calibri" w:asciiTheme="minorHAnsi" w:cstheme="minorHAnsi" w:hAnsiTheme="minorHAnsi"/>
-                      <w:sz w:val="22"/>
-                      <w:szCs w:val="22"/>
-                    </w:rPr>
-                  </w:pPr>
-                  <w:r>
-                    <w:rPr>
-                      <w:rFonts w:eastAsia="Times New Roman" w:cs="Calibri" w:cstheme="minorHAnsi" w:ascii="Calibri" w:hAnsi="Calibri"/>
-                      <w:kern w:val="0"/>
-                      <w:sz w:val="22"/>
-                      <w:szCs w:val="22"/>
-                      <w:lang w:bidi="ar-SA"/>
+                    <w:suppressAutoHyphens w:val="true"/>
+                    <w:spacing w:before="0" w:after="0"/>
+                    <w:jc w:val="start"/>
+                    <w:rPr>
+                      <w:rFonts w:ascii="Calibri" w:hAnsi="Calibri" w:cs="Calibri" w:asciiTheme="minorHAnsi" w:cstheme="minorHAnsi" w:hAnsiTheme="minorHAnsi"/>
+                      <w:sz w:val="22"/>
+                      <w:szCs w:val="22"/>
+                    </w:rPr>
+                  </w:pPr>
+                  <w:r>
+                    <w:rPr>
+                      <w:rFonts w:cs="Calibri" w:cstheme="minorHAnsi" w:ascii="Calibri" w:hAnsi="Calibri"/>
+                      <w:sz w:val="22"/>
+                      <w:szCs w:val="22"/>
                     </w:rPr>
                   </w:r>
                 </w:p>
@@ -4810,6 +4693,7 @@
                   <w:pPr>
                     <w:pStyle w:val="Normal"/>
                     <w:widowControl/>
+                    <w:suppressAutoHyphens w:val="true"/>
                     <w:spacing w:before="0" w:after="0"/>
                     <w:jc w:val="start"/>
                     <w:rPr>
@@ -4837,14 +4721,15 @@
               </w:trPr>
               <w:tc>
                 <w:tcPr>
-                  <w:tcW w:w="5948" w:type="dxa"/>
-                  <w:tcBorders/>
-                  <w:vAlign w:val="center"/>
-                </w:tcPr>
-                <w:p>
-                  <w:pPr>
-                    <w:pStyle w:val="Normal"/>
-                    <w:widowControl/>
+                  <w:tcW w:w="5947" w:type="dxa"/>
+                  <w:tcBorders/>
+                  <w:vAlign w:val="center"/>
+                </w:tcPr>
+                <w:p>
+                  <w:pPr>
+                    <w:pStyle w:val="Normal"/>
+                    <w:widowControl/>
+                    <w:suppressAutoHyphens w:val="true"/>
                     <w:spacing w:before="0" w:after="0"/>
                     <w:jc w:val="start"/>
                     <w:rPr>
@@ -4877,6 +4762,7 @@
                   <w:pPr>
                     <w:pStyle w:val="Normal"/>
                     <w:widowControl/>
+                    <w:suppressAutoHyphens w:val="true"/>
                     <w:spacing w:before="0" w:after="0"/>
                     <w:jc w:val="start"/>
                     <w:rPr>
@@ -4907,6 +4793,7 @@
                   <w:pPr>
                     <w:pStyle w:val="Normal"/>
                     <w:widowControl/>
+                    <w:suppressAutoHyphens w:val="true"/>
                     <w:spacing w:before="0" w:after="0"/>
                     <w:jc w:val="start"/>
                     <w:rPr>
@@ -4929,7 +4816,7 @@
               </w:tc>
               <w:tc>
                 <w:tcPr>
-                  <w:tcW w:w="710" w:type="dxa"/>
+                  <w:tcW w:w="711" w:type="dxa"/>
                   <w:tcBorders/>
                   <w:shd w:color="auto" w:fill="D9D9D9" w:themeFill="background1" w:themeFillShade="d9" w:val="clear"/>
                   <w:vAlign w:val="center"/>
@@ -4938,21 +4825,20 @@
                   <w:pPr>
                     <w:pStyle w:val="Normal"/>
                     <w:widowControl/>
-                    <w:spacing w:before="0" w:after="0"/>
-                    <w:jc w:val="start"/>
-                    <w:rPr>
-                      <w:rFonts w:ascii="Calibri" w:hAnsi="Calibri" w:cs="Calibri" w:asciiTheme="minorHAnsi" w:cstheme="minorHAnsi" w:hAnsiTheme="minorHAnsi"/>
-                      <w:sz w:val="22"/>
-                      <w:szCs w:val="22"/>
-                    </w:rPr>
-                  </w:pPr>
-                  <w:r>
-                    <w:rPr>
-                      <w:rFonts w:eastAsia="Times New Roman" w:cs="Calibri" w:cstheme="minorHAnsi" w:ascii="Calibri" w:hAnsi="Calibri"/>
-                      <w:kern w:val="0"/>
-                      <w:sz w:val="22"/>
-                      <w:szCs w:val="22"/>
-                      <w:lang w:bidi="ar-SA"/>
+                    <w:suppressAutoHyphens w:val="true"/>
+                    <w:spacing w:before="0" w:after="0"/>
+                    <w:jc w:val="start"/>
+                    <w:rPr>
+                      <w:rFonts w:ascii="Calibri" w:hAnsi="Calibri" w:cs="Calibri" w:asciiTheme="minorHAnsi" w:cstheme="minorHAnsi" w:hAnsiTheme="minorHAnsi"/>
+                      <w:sz w:val="22"/>
+                      <w:szCs w:val="22"/>
+                    </w:rPr>
+                  </w:pPr>
+                  <w:r>
+                    <w:rPr>
+                      <w:rFonts w:cs="Calibri" w:cstheme="minorHAnsi" w:ascii="Calibri" w:hAnsi="Calibri"/>
+                      <w:sz w:val="22"/>
+                      <w:szCs w:val="22"/>
                     </w:rPr>
                   </w:r>
                 </w:p>
@@ -4966,6 +4852,7 @@
                   <w:pPr>
                     <w:pStyle w:val="Normal"/>
                     <w:widowControl/>
+                    <w:suppressAutoHyphens w:val="true"/>
                     <w:spacing w:before="0" w:after="0"/>
                     <w:jc w:val="start"/>
                     <w:rPr>
@@ -4993,14 +4880,15 @@
               </w:trPr>
               <w:tc>
                 <w:tcPr>
-                  <w:tcW w:w="5948" w:type="dxa"/>
-                  <w:tcBorders/>
-                  <w:vAlign w:val="center"/>
-                </w:tcPr>
-                <w:p>
-                  <w:pPr>
-                    <w:pStyle w:val="Normal"/>
-                    <w:widowControl/>
+                  <w:tcW w:w="5947" w:type="dxa"/>
+                  <w:tcBorders/>
+                  <w:vAlign w:val="center"/>
+                </w:tcPr>
+                <w:p>
+                  <w:pPr>
+                    <w:pStyle w:val="Normal"/>
+                    <w:widowControl/>
+                    <w:suppressAutoHyphens w:val="true"/>
                     <w:spacing w:before="0" w:after="0"/>
                     <w:jc w:val="start"/>
                     <w:rPr>
@@ -5033,6 +4921,7 @@
                   <w:pPr>
                     <w:pStyle w:val="Normal"/>
                     <w:widowControl/>
+                    <w:suppressAutoHyphens w:val="true"/>
                     <w:spacing w:before="0" w:after="0"/>
                     <w:jc w:val="start"/>
                     <w:rPr>
@@ -5063,6 +4952,7 @@
                   <w:pPr>
                     <w:pStyle w:val="Normal"/>
                     <w:widowControl/>
+                    <w:suppressAutoHyphens w:val="true"/>
                     <w:spacing w:before="0" w:after="0"/>
                     <w:jc w:val="start"/>
                     <w:rPr>
@@ -5085,7 +4975,7 @@
               </w:tc>
               <w:tc>
                 <w:tcPr>
-                  <w:tcW w:w="710" w:type="dxa"/>
+                  <w:tcW w:w="711" w:type="dxa"/>
                   <w:tcBorders/>
                   <w:shd w:color="auto" w:fill="D9D9D9" w:themeFill="background1" w:themeFillShade="d9" w:val="clear"/>
                   <w:vAlign w:val="center"/>
@@ -5094,21 +4984,20 @@
                   <w:pPr>
                     <w:pStyle w:val="Normal"/>
                     <w:widowControl/>
-                    <w:spacing w:before="0" w:after="0"/>
-                    <w:jc w:val="start"/>
-                    <w:rPr>
-                      <w:rFonts w:ascii="Calibri" w:hAnsi="Calibri" w:cs="Calibri" w:asciiTheme="minorHAnsi" w:cstheme="minorHAnsi" w:hAnsiTheme="minorHAnsi"/>
-                      <w:sz w:val="22"/>
-                      <w:szCs w:val="22"/>
-                    </w:rPr>
-                  </w:pPr>
-                  <w:r>
-                    <w:rPr>
-                      <w:rFonts w:eastAsia="Times New Roman" w:cs="Calibri" w:cstheme="minorHAnsi" w:ascii="Calibri" w:hAnsi="Calibri"/>
-                      <w:kern w:val="0"/>
-                      <w:sz w:val="22"/>
-                      <w:szCs w:val="22"/>
-                      <w:lang w:bidi="ar-SA"/>
+                    <w:suppressAutoHyphens w:val="true"/>
+                    <w:spacing w:before="0" w:after="0"/>
+                    <w:jc w:val="start"/>
+                    <w:rPr>
+                      <w:rFonts w:ascii="Calibri" w:hAnsi="Calibri" w:cs="Calibri" w:asciiTheme="minorHAnsi" w:cstheme="minorHAnsi" w:hAnsiTheme="minorHAnsi"/>
+                      <w:sz w:val="22"/>
+                      <w:szCs w:val="22"/>
+                    </w:rPr>
+                  </w:pPr>
+                  <w:r>
+                    <w:rPr>
+                      <w:rFonts w:cs="Calibri" w:cstheme="minorHAnsi" w:ascii="Calibri" w:hAnsi="Calibri"/>
+                      <w:sz w:val="22"/>
+                      <w:szCs w:val="22"/>
                     </w:rPr>
                   </w:r>
                 </w:p>
@@ -5122,6 +5011,7 @@
                   <w:pPr>
                     <w:pStyle w:val="Normal"/>
                     <w:widowControl/>
+                    <w:suppressAutoHyphens w:val="true"/>
                     <w:spacing w:before="0" w:after="0"/>
                     <w:jc w:val="start"/>
                     <w:rPr>
@@ -5149,14 +5039,15 @@
               </w:trPr>
               <w:tc>
                 <w:tcPr>
-                  <w:tcW w:w="5948" w:type="dxa"/>
-                  <w:tcBorders/>
-                  <w:vAlign w:val="center"/>
-                </w:tcPr>
-                <w:p>
-                  <w:pPr>
-                    <w:pStyle w:val="Normal"/>
-                    <w:widowControl/>
+                  <w:tcW w:w="5947" w:type="dxa"/>
+                  <w:tcBorders/>
+                  <w:vAlign w:val="center"/>
+                </w:tcPr>
+                <w:p>
+                  <w:pPr>
+                    <w:pStyle w:val="Normal"/>
+                    <w:widowControl/>
+                    <w:suppressAutoHyphens w:val="true"/>
                     <w:spacing w:before="0" w:after="0"/>
                     <w:jc w:val="start"/>
                     <w:rPr>
@@ -5189,6 +5080,7 @@
                   <w:pPr>
                     <w:pStyle w:val="Normal"/>
                     <w:widowControl/>
+                    <w:suppressAutoHyphens w:val="true"/>
                     <w:spacing w:before="0" w:after="0"/>
                     <w:jc w:val="start"/>
                     <w:rPr>
@@ -5219,6 +5111,7 @@
                   <w:pPr>
                     <w:pStyle w:val="Normal"/>
                     <w:widowControl/>
+                    <w:suppressAutoHyphens w:val="true"/>
                     <w:spacing w:before="0" w:after="0"/>
                     <w:jc w:val="start"/>
                     <w:rPr>
@@ -5241,7 +5134,7 @@
               </w:tc>
               <w:tc>
                 <w:tcPr>
-                  <w:tcW w:w="710" w:type="dxa"/>
+                  <w:tcW w:w="711" w:type="dxa"/>
                   <w:tcBorders/>
                   <w:shd w:color="auto" w:fill="D9D9D9" w:themeFill="background1" w:themeFillShade="d9" w:val="clear"/>
                   <w:vAlign w:val="center"/>
@@ -5250,21 +5143,20 @@
                   <w:pPr>
                     <w:pStyle w:val="Normal"/>
                     <w:widowControl/>
-                    <w:spacing w:before="0" w:after="0"/>
-                    <w:jc w:val="start"/>
-                    <w:rPr>
-                      <w:rFonts w:ascii="Calibri" w:hAnsi="Calibri" w:cs="Calibri" w:asciiTheme="minorHAnsi" w:cstheme="minorHAnsi" w:hAnsiTheme="minorHAnsi"/>
-                      <w:sz w:val="22"/>
-                      <w:szCs w:val="22"/>
-                    </w:rPr>
-                  </w:pPr>
-                  <w:r>
-                    <w:rPr>
-                      <w:rFonts w:eastAsia="Times New Roman" w:cs="Calibri" w:cstheme="minorHAnsi" w:ascii="Calibri" w:hAnsi="Calibri"/>
-                      <w:kern w:val="0"/>
-                      <w:sz w:val="22"/>
-                      <w:szCs w:val="22"/>
-                      <w:lang w:bidi="ar-SA"/>
+                    <w:suppressAutoHyphens w:val="true"/>
+                    <w:spacing w:before="0" w:after="0"/>
+                    <w:jc w:val="start"/>
+                    <w:rPr>
+                      <w:rFonts w:ascii="Calibri" w:hAnsi="Calibri" w:cs="Calibri" w:asciiTheme="minorHAnsi" w:cstheme="minorHAnsi" w:hAnsiTheme="minorHAnsi"/>
+                      <w:sz w:val="22"/>
+                      <w:szCs w:val="22"/>
+                    </w:rPr>
+                  </w:pPr>
+                  <w:r>
+                    <w:rPr>
+                      <w:rFonts w:cs="Calibri" w:cstheme="minorHAnsi" w:ascii="Calibri" w:hAnsi="Calibri"/>
+                      <w:sz w:val="22"/>
+                      <w:szCs w:val="22"/>
                     </w:rPr>
                   </w:r>
                 </w:p>
@@ -5278,6 +5170,7 @@
                   <w:pPr>
                     <w:pStyle w:val="Normal"/>
                     <w:widowControl/>
+                    <w:suppressAutoHyphens w:val="true"/>
                     <w:spacing w:before="0" w:after="0"/>
                     <w:jc w:val="start"/>
                     <w:rPr>
@@ -5305,14 +5198,15 @@
               </w:trPr>
               <w:tc>
                 <w:tcPr>
-                  <w:tcW w:w="5948" w:type="dxa"/>
-                  <w:tcBorders/>
-                  <w:vAlign w:val="center"/>
-                </w:tcPr>
-                <w:p>
-                  <w:pPr>
-                    <w:pStyle w:val="Normal"/>
-                    <w:widowControl/>
+                  <w:tcW w:w="5947" w:type="dxa"/>
+                  <w:tcBorders/>
+                  <w:vAlign w:val="center"/>
+                </w:tcPr>
+                <w:p>
+                  <w:pPr>
+                    <w:pStyle w:val="Normal"/>
+                    <w:widowControl/>
+                    <w:suppressAutoHyphens w:val="true"/>
                     <w:spacing w:before="0" w:after="0"/>
                     <w:jc w:val="start"/>
                     <w:rPr>
@@ -5345,6 +5239,7 @@
                   <w:pPr>
                     <w:pStyle w:val="Normal"/>
                     <w:widowControl/>
+                    <w:suppressAutoHyphens w:val="true"/>
                     <w:spacing w:before="0" w:after="0"/>
                     <w:jc w:val="start"/>
                     <w:rPr>
@@ -5375,6 +5270,7 @@
                   <w:pPr>
                     <w:pStyle w:val="Normal"/>
                     <w:widowControl/>
+                    <w:suppressAutoHyphens w:val="true"/>
                     <w:spacing w:before="0" w:after="0"/>
                     <w:jc w:val="start"/>
                     <w:rPr>
@@ -5397,7 +5293,7 @@
               </w:tc>
               <w:tc>
                 <w:tcPr>
-                  <w:tcW w:w="710" w:type="dxa"/>
+                  <w:tcW w:w="711" w:type="dxa"/>
                   <w:tcBorders/>
                   <w:shd w:color="auto" w:fill="D9D9D9" w:themeFill="background1" w:themeFillShade="d9" w:val="clear"/>
                   <w:vAlign w:val="center"/>
@@ -5406,21 +5302,20 @@
                   <w:pPr>
                     <w:pStyle w:val="Normal"/>
                     <w:widowControl/>
-                    <w:spacing w:before="0" w:after="0"/>
-                    <w:jc w:val="start"/>
-                    <w:rPr>
-                      <w:rFonts w:ascii="Calibri" w:hAnsi="Calibri" w:cs="Calibri" w:asciiTheme="minorHAnsi" w:cstheme="minorHAnsi" w:hAnsiTheme="minorHAnsi"/>
-                      <w:sz w:val="22"/>
-                      <w:szCs w:val="22"/>
-                    </w:rPr>
-                  </w:pPr>
-                  <w:r>
-                    <w:rPr>
-                      <w:rFonts w:eastAsia="Times New Roman" w:cs="Calibri" w:cstheme="minorHAnsi" w:ascii="Calibri" w:hAnsi="Calibri"/>
-                      <w:kern w:val="0"/>
-                      <w:sz w:val="22"/>
-                      <w:szCs w:val="22"/>
-                      <w:lang w:bidi="ar-SA"/>
+                    <w:suppressAutoHyphens w:val="true"/>
+                    <w:spacing w:before="0" w:after="0"/>
+                    <w:jc w:val="start"/>
+                    <w:rPr>
+                      <w:rFonts w:ascii="Calibri" w:hAnsi="Calibri" w:cs="Calibri" w:asciiTheme="minorHAnsi" w:cstheme="minorHAnsi" w:hAnsiTheme="minorHAnsi"/>
+                      <w:sz w:val="22"/>
+                      <w:szCs w:val="22"/>
+                    </w:rPr>
+                  </w:pPr>
+                  <w:r>
+                    <w:rPr>
+                      <w:rFonts w:cs="Calibri" w:cstheme="minorHAnsi" w:ascii="Calibri" w:hAnsi="Calibri"/>
+                      <w:sz w:val="22"/>
+                      <w:szCs w:val="22"/>
                     </w:rPr>
                   </w:r>
                 </w:p>
@@ -5434,6 +5329,7 @@
                   <w:pPr>
                     <w:pStyle w:val="Normal"/>
                     <w:widowControl/>
+                    <w:suppressAutoHyphens w:val="true"/>
                     <w:spacing w:before="0" w:after="0"/>
                     <w:jc w:val="start"/>
                     <w:rPr>
@@ -5461,14 +5357,15 @@
               </w:trPr>
               <w:tc>
                 <w:tcPr>
-                  <w:tcW w:w="5948" w:type="dxa"/>
-                  <w:tcBorders/>
-                  <w:vAlign w:val="center"/>
-                </w:tcPr>
-                <w:p>
-                  <w:pPr>
-                    <w:pStyle w:val="Normal"/>
-                    <w:widowControl/>
+                  <w:tcW w:w="5947" w:type="dxa"/>
+                  <w:tcBorders/>
+                  <w:vAlign w:val="center"/>
+                </w:tcPr>
+                <w:p>
+                  <w:pPr>
+                    <w:pStyle w:val="Normal"/>
+                    <w:widowControl/>
+                    <w:suppressAutoHyphens w:val="true"/>
                     <w:spacing w:before="0" w:after="0"/>
                     <w:jc w:val="start"/>
                     <w:rPr>
@@ -5503,6 +5400,7 @@
                   <w:pPr>
                     <w:pStyle w:val="Normal"/>
                     <w:widowControl/>
+                    <w:suppressAutoHyphens w:val="true"/>
                     <w:spacing w:before="0" w:after="0"/>
                     <w:jc w:val="start"/>
                     <w:rPr>
@@ -5543,6 +5441,7 @@
                   <w:pPr>
                     <w:pStyle w:val="Normal"/>
                     <w:widowControl/>
+                    <w:suppressAutoHyphens w:val="true"/>
                     <w:spacing w:before="0" w:after="0"/>
                     <w:jc w:val="start"/>
                     <w:rPr>
@@ -5573,6 +5472,7 @@
                   <w:pPr>
                     <w:pStyle w:val="Normal"/>
                     <w:widowControl/>
+                    <w:suppressAutoHyphens w:val="true"/>
                     <w:spacing w:before="0" w:after="0"/>
                     <w:jc w:val="start"/>
                     <w:rPr>
@@ -5595,7 +5495,7 @@
               </w:tc>
               <w:tc>
                 <w:tcPr>
-                  <w:tcW w:w="710" w:type="dxa"/>
+                  <w:tcW w:w="711" w:type="dxa"/>
                   <w:tcBorders/>
                   <w:shd w:color="auto" w:fill="D9D9D9" w:themeFill="background1" w:themeFillShade="d9" w:val="clear"/>
                   <w:vAlign w:val="center"/>
@@ -5604,21 +5504,20 @@
                   <w:pPr>
                     <w:pStyle w:val="Normal"/>
                     <w:widowControl/>
-                    <w:spacing w:before="0" w:after="0"/>
-                    <w:jc w:val="start"/>
-                    <w:rPr>
-                      <w:rFonts w:ascii="Calibri" w:hAnsi="Calibri" w:cs="Calibri" w:asciiTheme="minorHAnsi" w:cstheme="minorHAnsi" w:hAnsiTheme="minorHAnsi"/>
-                      <w:sz w:val="22"/>
-                      <w:szCs w:val="22"/>
-                    </w:rPr>
-                  </w:pPr>
-                  <w:r>
-                    <w:rPr>
-                      <w:rFonts w:eastAsia="Times New Roman" w:cs="Calibri" w:cstheme="minorHAnsi" w:ascii="Calibri" w:hAnsi="Calibri"/>
-                      <w:kern w:val="0"/>
-                      <w:sz w:val="22"/>
-                      <w:szCs w:val="22"/>
-                      <w:lang w:bidi="ar-SA"/>
+                    <w:suppressAutoHyphens w:val="true"/>
+                    <w:spacing w:before="0" w:after="0"/>
+                    <w:jc w:val="start"/>
+                    <w:rPr>
+                      <w:rFonts w:ascii="Calibri" w:hAnsi="Calibri" w:cs="Calibri" w:asciiTheme="minorHAnsi" w:cstheme="minorHAnsi" w:hAnsiTheme="minorHAnsi"/>
+                      <w:sz w:val="22"/>
+                      <w:szCs w:val="22"/>
+                    </w:rPr>
+                  </w:pPr>
+                  <w:r>
+                    <w:rPr>
+                      <w:rFonts w:cs="Calibri" w:cstheme="minorHAnsi" w:ascii="Calibri" w:hAnsi="Calibri"/>
+                      <w:sz w:val="22"/>
+                      <w:szCs w:val="22"/>
                     </w:rPr>
                   </w:r>
                 </w:p>
@@ -5632,6 +5531,7 @@
                   <w:pPr>
                     <w:pStyle w:val="Normal"/>
                     <w:widowControl/>
+                    <w:suppressAutoHyphens w:val="true"/>
                     <w:spacing w:before="0" w:after="0"/>
                     <w:jc w:val="start"/>
                     <w:rPr>
@@ -5668,6 +5568,7 @@
                   <w:pPr>
                     <w:pStyle w:val="Normal"/>
                     <w:widowControl/>
+                    <w:suppressAutoHyphens w:val="true"/>
                     <w:spacing w:before="160" w:after="0"/>
                     <w:jc w:val="start"/>
                     <w:rPr>
@@ -5699,14 +5600,15 @@
               </w:trPr>
               <w:tc>
                 <w:tcPr>
-                  <w:tcW w:w="5948" w:type="dxa"/>
-                  <w:tcBorders/>
-                  <w:vAlign w:val="center"/>
-                </w:tcPr>
-                <w:p>
-                  <w:pPr>
-                    <w:pStyle w:val="Normal"/>
-                    <w:widowControl/>
+                  <w:tcW w:w="5947" w:type="dxa"/>
+                  <w:tcBorders/>
+                  <w:vAlign w:val="center"/>
+                </w:tcPr>
+                <w:p>
+                  <w:pPr>
+                    <w:pStyle w:val="Normal"/>
+                    <w:widowControl/>
+                    <w:suppressAutoHyphens w:val="true"/>
                     <w:spacing w:before="0" w:after="0"/>
                     <w:jc w:val="start"/>
                     <w:rPr>
@@ -5737,6 +5639,7 @@
                   <w:pPr>
                     <w:pStyle w:val="Normal"/>
                     <w:widowControl/>
+                    <w:suppressAutoHyphens w:val="true"/>
                     <w:spacing w:before="0" w:after="0"/>
                     <w:jc w:val="start"/>
                     <w:rPr>
@@ -5767,6 +5670,7 @@
                   <w:pPr>
                     <w:pStyle w:val="Normal"/>
                     <w:widowControl/>
+                    <w:suppressAutoHyphens w:val="true"/>
                     <w:spacing w:before="0" w:after="0"/>
                     <w:jc w:val="start"/>
                     <w:rPr>
@@ -5789,7 +5693,7 @@
               </w:tc>
               <w:tc>
                 <w:tcPr>
-                  <w:tcW w:w="710" w:type="dxa"/>
+                  <w:tcW w:w="711" w:type="dxa"/>
                   <w:tcBorders/>
                   <w:shd w:color="auto" w:fill="D9D9D9" w:themeFill="background1" w:themeFillShade="d9" w:val="clear"/>
                   <w:vAlign w:val="center"/>
@@ -5798,21 +5702,20 @@
                   <w:pPr>
                     <w:pStyle w:val="Normal"/>
                     <w:widowControl/>
-                    <w:spacing w:before="0" w:after="0"/>
-                    <w:jc w:val="start"/>
-                    <w:rPr>
-                      <w:rFonts w:ascii="Calibri" w:hAnsi="Calibri" w:cs="Calibri" w:asciiTheme="minorHAnsi" w:cstheme="minorHAnsi" w:hAnsiTheme="minorHAnsi"/>
-                      <w:sz w:val="22"/>
-                      <w:szCs w:val="22"/>
-                    </w:rPr>
-                  </w:pPr>
-                  <w:r>
-                    <w:rPr>
-                      <w:rFonts w:eastAsia="Times New Roman" w:cs="Calibri" w:cstheme="minorHAnsi" w:ascii="Calibri" w:hAnsi="Calibri"/>
-                      <w:kern w:val="0"/>
-                      <w:sz w:val="22"/>
-                      <w:szCs w:val="22"/>
-                      <w:lang w:bidi="ar-SA"/>
+                    <w:suppressAutoHyphens w:val="true"/>
+                    <w:spacing w:before="0" w:after="0"/>
+                    <w:jc w:val="start"/>
+                    <w:rPr>
+                      <w:rFonts w:ascii="Calibri" w:hAnsi="Calibri" w:cs="Calibri" w:asciiTheme="minorHAnsi" w:cstheme="minorHAnsi" w:hAnsiTheme="minorHAnsi"/>
+                      <w:sz w:val="22"/>
+                      <w:szCs w:val="22"/>
+                    </w:rPr>
+                  </w:pPr>
+                  <w:r>
+                    <w:rPr>
+                      <w:rFonts w:cs="Calibri" w:cstheme="minorHAnsi" w:ascii="Calibri" w:hAnsi="Calibri"/>
+                      <w:sz w:val="22"/>
+                      <w:szCs w:val="22"/>
                     </w:rPr>
                   </w:r>
                 </w:p>
@@ -5827,6 +5730,7 @@
                   <w:pPr>
                     <w:pStyle w:val="Normal"/>
                     <w:widowControl/>
+                    <w:suppressAutoHyphens w:val="true"/>
                     <w:spacing w:before="0" w:after="0"/>
                     <w:jc w:val="start"/>
                     <w:rPr>
@@ -5852,14 +5756,15 @@
               </w:trPr>
               <w:tc>
                 <w:tcPr>
-                  <w:tcW w:w="5948" w:type="dxa"/>
-                  <w:tcBorders/>
-                  <w:vAlign w:val="center"/>
-                </w:tcPr>
-                <w:p>
-                  <w:pPr>
-                    <w:pStyle w:val="Normal"/>
-                    <w:widowControl/>
+                  <w:tcW w:w="5947" w:type="dxa"/>
+                  <w:tcBorders/>
+                  <w:vAlign w:val="center"/>
+                </w:tcPr>
+                <w:p>
+                  <w:pPr>
+                    <w:pStyle w:val="Normal"/>
+                    <w:widowControl/>
+                    <w:suppressAutoHyphens w:val="true"/>
                     <w:spacing w:before="0" w:after="0"/>
                     <w:jc w:val="start"/>
                     <w:rPr>
@@ -5890,6 +5795,7 @@
                   <w:pPr>
                     <w:pStyle w:val="Normal"/>
                     <w:widowControl/>
+                    <w:suppressAutoHyphens w:val="true"/>
                     <w:spacing w:before="0" w:after="0"/>
                     <w:jc w:val="start"/>
                     <w:rPr>
@@ -5920,6 +5826,7 @@
                   <w:pPr>
                     <w:pStyle w:val="Normal"/>
                     <w:widowControl/>
+                    <w:suppressAutoHyphens w:val="true"/>
                     <w:spacing w:before="0" w:after="0"/>
                     <w:jc w:val="start"/>
                     <w:rPr>
@@ -5942,7 +5849,7 @@
               </w:tc>
               <w:tc>
                 <w:tcPr>
-                  <w:tcW w:w="710" w:type="dxa"/>
+                  <w:tcW w:w="711" w:type="dxa"/>
                   <w:tcBorders/>
                   <w:shd w:color="auto" w:fill="D9D9D9" w:themeFill="background1" w:themeFillShade="d9" w:val="clear"/>
                   <w:vAlign w:val="center"/>
@@ -5951,21 +5858,20 @@
                   <w:pPr>
                     <w:pStyle w:val="Normal"/>
                     <w:widowControl/>
-                    <w:spacing w:before="0" w:after="0"/>
-                    <w:jc w:val="start"/>
-                    <w:rPr>
-                      <w:rFonts w:ascii="Calibri" w:hAnsi="Calibri" w:cs="Calibri" w:asciiTheme="minorHAnsi" w:cstheme="minorHAnsi" w:hAnsiTheme="minorHAnsi"/>
-                      <w:sz w:val="22"/>
-                      <w:szCs w:val="22"/>
-                    </w:rPr>
-                  </w:pPr>
-                  <w:r>
-                    <w:rPr>
-                      <w:rFonts w:eastAsia="Times New Roman" w:cs="Calibri" w:cstheme="minorHAnsi" w:ascii="Calibri" w:hAnsi="Calibri"/>
-                      <w:kern w:val="0"/>
-                      <w:sz w:val="22"/>
-                      <w:szCs w:val="22"/>
-                      <w:lang w:bidi="ar-SA"/>
+                    <w:suppressAutoHyphens w:val="true"/>
+                    <w:spacing w:before="0" w:after="0"/>
+                    <w:jc w:val="start"/>
+                    <w:rPr>
+                      <w:rFonts w:ascii="Calibri" w:hAnsi="Calibri" w:cs="Calibri" w:asciiTheme="minorHAnsi" w:cstheme="minorHAnsi" w:hAnsiTheme="minorHAnsi"/>
+                      <w:sz w:val="22"/>
+                      <w:szCs w:val="22"/>
+                    </w:rPr>
+                  </w:pPr>
+                  <w:r>
+                    <w:rPr>
+                      <w:rFonts w:cs="Calibri" w:cstheme="minorHAnsi" w:ascii="Calibri" w:hAnsi="Calibri"/>
+                      <w:sz w:val="22"/>
+                      <w:szCs w:val="22"/>
                     </w:rPr>
                   </w:r>
                 </w:p>
@@ -5979,6 +5885,7 @@
                   <w:pPr>
                     <w:pStyle w:val="Normal"/>
                     <w:widowControl/>
+                    <w:suppressAutoHyphens w:val="true"/>
                     <w:spacing w:before="0" w:after="0"/>
                     <w:jc w:val="start"/>
                     <w:rPr>
@@ -6006,14 +5913,15 @@
               </w:trPr>
               <w:tc>
                 <w:tcPr>
-                  <w:tcW w:w="5948" w:type="dxa"/>
-                  <w:tcBorders/>
-                  <w:vAlign w:val="center"/>
-                </w:tcPr>
-                <w:p>
-                  <w:pPr>
-                    <w:pStyle w:val="Normal"/>
-                    <w:widowControl/>
+                  <w:tcW w:w="5947" w:type="dxa"/>
+                  <w:tcBorders/>
+                  <w:vAlign w:val="center"/>
+                </w:tcPr>
+                <w:p>
+                  <w:pPr>
+                    <w:pStyle w:val="Normal"/>
+                    <w:widowControl/>
+                    <w:suppressAutoHyphens w:val="true"/>
                     <w:spacing w:before="0" w:after="0"/>
                     <w:jc w:val="start"/>
                     <w:rPr>
@@ -6044,6 +5952,7 @@
                   <w:pPr>
                     <w:pStyle w:val="Normal"/>
                     <w:widowControl/>
+                    <w:suppressAutoHyphens w:val="true"/>
                     <w:spacing w:before="0" w:after="0"/>
                     <w:jc w:val="start"/>
                     <w:rPr>
@@ -6074,6 +5983,7 @@
                   <w:pPr>
                     <w:pStyle w:val="Normal"/>
                     <w:widowControl/>
+                    <w:suppressAutoHyphens w:val="true"/>
                     <w:spacing w:before="0" w:after="0"/>
                     <w:jc w:val="start"/>
                     <w:rPr>
@@ -6096,7 +6006,7 @@
               </w:tc>
               <w:tc>
                 <w:tcPr>
-                  <w:tcW w:w="710" w:type="dxa"/>
+                  <w:tcW w:w="711" w:type="dxa"/>
                   <w:tcBorders/>
                   <w:shd w:color="auto" w:fill="D9D9D9" w:themeFill="background1" w:themeFillShade="d9" w:val="clear"/>
                   <w:vAlign w:val="center"/>
@@ -6105,21 +6015,20 @@
                   <w:pPr>
                     <w:pStyle w:val="Normal"/>
                     <w:widowControl/>
-                    <w:spacing w:before="0" w:after="0"/>
-                    <w:jc w:val="start"/>
-                    <w:rPr>
-                      <w:rFonts w:ascii="Calibri" w:hAnsi="Calibri" w:cs="Calibri" w:asciiTheme="minorHAnsi" w:cstheme="minorHAnsi" w:hAnsiTheme="minorHAnsi"/>
-                      <w:sz w:val="22"/>
-                      <w:szCs w:val="22"/>
-                    </w:rPr>
-                  </w:pPr>
-                  <w:r>
-                    <w:rPr>
-                      <w:rFonts w:eastAsia="Times New Roman" w:cs="Calibri" w:cstheme="minorHAnsi" w:ascii="Calibri" w:hAnsi="Calibri"/>
-                      <w:kern w:val="0"/>
-                      <w:sz w:val="22"/>
-                      <w:szCs w:val="22"/>
-                      <w:lang w:bidi="ar-SA"/>
+                    <w:suppressAutoHyphens w:val="true"/>
+                    <w:spacing w:before="0" w:after="0"/>
+                    <w:jc w:val="start"/>
+                    <w:rPr>
+                      <w:rFonts w:ascii="Calibri" w:hAnsi="Calibri" w:cs="Calibri" w:asciiTheme="minorHAnsi" w:cstheme="minorHAnsi" w:hAnsiTheme="minorHAnsi"/>
+                      <w:sz w:val="22"/>
+                      <w:szCs w:val="22"/>
+                    </w:rPr>
+                  </w:pPr>
+                  <w:r>
+                    <w:rPr>
+                      <w:rFonts w:cs="Calibri" w:cstheme="minorHAnsi" w:ascii="Calibri" w:hAnsi="Calibri"/>
+                      <w:sz w:val="22"/>
+                      <w:szCs w:val="22"/>
                     </w:rPr>
                   </w:r>
                 </w:p>
@@ -6133,6 +6042,7 @@
                   <w:pPr>
                     <w:pStyle w:val="Normal"/>
                     <w:widowControl/>
+                    <w:suppressAutoHyphens w:val="true"/>
                     <w:spacing w:before="0" w:after="0"/>
                     <w:jc w:val="start"/>
                     <w:rPr>
@@ -6160,14 +6070,15 @@
               </w:trPr>
               <w:tc>
                 <w:tcPr>
-                  <w:tcW w:w="5948" w:type="dxa"/>
-                  <w:tcBorders/>
-                  <w:vAlign w:val="center"/>
-                </w:tcPr>
-                <w:p>
-                  <w:pPr>
-                    <w:pStyle w:val="Normal"/>
-                    <w:widowControl/>
+                  <w:tcW w:w="5947" w:type="dxa"/>
+                  <w:tcBorders/>
+                  <w:vAlign w:val="center"/>
+                </w:tcPr>
+                <w:p>
+                  <w:pPr>
+                    <w:pStyle w:val="Normal"/>
+                    <w:widowControl/>
+                    <w:suppressAutoHyphens w:val="true"/>
                     <w:spacing w:before="0" w:after="0"/>
                     <w:jc w:val="start"/>
                     <w:rPr>
@@ -6198,6 +6109,7 @@
                   <w:pPr>
                     <w:pStyle w:val="Normal"/>
                     <w:widowControl/>
+                    <w:suppressAutoHyphens w:val="true"/>
                     <w:spacing w:before="0" w:after="0"/>
                     <w:jc w:val="start"/>
                     <w:rPr>
@@ -6228,6 +6140,7 @@
                   <w:pPr>
                     <w:pStyle w:val="Normal"/>
                     <w:widowControl/>
+                    <w:suppressAutoHyphens w:val="true"/>
                     <w:spacing w:before="0" w:after="0"/>
                     <w:jc w:val="start"/>
                     <w:rPr>
@@ -6250,7 +6163,7 @@
               </w:tc>
               <w:tc>
                 <w:tcPr>
-                  <w:tcW w:w="710" w:type="dxa"/>
+                  <w:tcW w:w="711" w:type="dxa"/>
                   <w:tcBorders/>
                   <w:shd w:color="auto" w:fill="D9D9D9" w:themeFill="background1" w:themeFillShade="d9" w:val="clear"/>
                   <w:vAlign w:val="center"/>
@@ -6259,21 +6172,20 @@
                   <w:pPr>
                     <w:pStyle w:val="Normal"/>
                     <w:widowControl/>
-                    <w:spacing w:before="0" w:after="0"/>
-                    <w:jc w:val="start"/>
-                    <w:rPr>
-                      <w:rFonts w:ascii="Calibri" w:hAnsi="Calibri" w:cs="Calibri" w:asciiTheme="minorHAnsi" w:cstheme="minorHAnsi" w:hAnsiTheme="minorHAnsi"/>
-                      <w:sz w:val="22"/>
-                      <w:szCs w:val="22"/>
-                    </w:rPr>
-                  </w:pPr>
-                  <w:r>
-                    <w:rPr>
-                      <w:rFonts w:eastAsia="Times New Roman" w:cs="Calibri" w:cstheme="minorHAnsi" w:ascii="Calibri" w:hAnsi="Calibri"/>
-                      <w:kern w:val="0"/>
-                      <w:sz w:val="22"/>
-                      <w:szCs w:val="22"/>
-                      <w:lang w:bidi="ar-SA"/>
+                    <w:suppressAutoHyphens w:val="true"/>
+                    <w:spacing w:before="0" w:after="0"/>
+                    <w:jc w:val="start"/>
+                    <w:rPr>
+                      <w:rFonts w:ascii="Calibri" w:hAnsi="Calibri" w:cs="Calibri" w:asciiTheme="minorHAnsi" w:cstheme="minorHAnsi" w:hAnsiTheme="minorHAnsi"/>
+                      <w:sz w:val="22"/>
+                      <w:szCs w:val="22"/>
+                    </w:rPr>
+                  </w:pPr>
+                  <w:r>
+                    <w:rPr>
+                      <w:rFonts w:cs="Calibri" w:cstheme="minorHAnsi" w:ascii="Calibri" w:hAnsi="Calibri"/>
+                      <w:sz w:val="22"/>
+                      <w:szCs w:val="22"/>
                     </w:rPr>
                   </w:r>
                 </w:p>
@@ -6287,6 +6199,7 @@
                   <w:pPr>
                     <w:pStyle w:val="Normal"/>
                     <w:widowControl/>
+                    <w:suppressAutoHyphens w:val="true"/>
                     <w:spacing w:before="0" w:after="0"/>
                     <w:jc w:val="start"/>
                     <w:rPr>
@@ -6314,14 +6227,15 @@
               </w:trPr>
               <w:tc>
                 <w:tcPr>
-                  <w:tcW w:w="5948" w:type="dxa"/>
-                  <w:tcBorders/>
-                  <w:vAlign w:val="center"/>
-                </w:tcPr>
-                <w:p>
-                  <w:pPr>
-                    <w:pStyle w:val="Normal"/>
-                    <w:widowControl/>
+                  <w:tcW w:w="5947" w:type="dxa"/>
+                  <w:tcBorders/>
+                  <w:vAlign w:val="center"/>
+                </w:tcPr>
+                <w:p>
+                  <w:pPr>
+                    <w:pStyle w:val="Normal"/>
+                    <w:widowControl/>
+                    <w:suppressAutoHyphens w:val="true"/>
                     <w:spacing w:before="0" w:after="0"/>
                     <w:jc w:val="start"/>
                     <w:rPr>
@@ -6352,6 +6266,7 @@
                   <w:pPr>
                     <w:pStyle w:val="Normal"/>
                     <w:widowControl/>
+                    <w:suppressAutoHyphens w:val="true"/>
                     <w:spacing w:before="0" w:after="0"/>
                     <w:jc w:val="start"/>
                     <w:rPr>
@@ -6382,6 +6297,7 @@
                   <w:pPr>
                     <w:pStyle w:val="Normal"/>
                     <w:widowControl/>
+                    <w:suppressAutoHyphens w:val="true"/>
                     <w:spacing w:before="0" w:after="0"/>
                     <w:jc w:val="start"/>
                     <w:rPr>
@@ -6404,7 +6320,7 @@
               </w:tc>
               <w:tc>
                 <w:tcPr>
-                  <w:tcW w:w="710" w:type="dxa"/>
+                  <w:tcW w:w="711" w:type="dxa"/>
                   <w:tcBorders/>
                   <w:shd w:color="auto" w:fill="D9D9D9" w:themeFill="background1" w:themeFillShade="d9" w:val="clear"/>
                   <w:vAlign w:val="center"/>
@@ -6413,21 +6329,20 @@
                   <w:pPr>
                     <w:pStyle w:val="Normal"/>
                     <w:widowControl/>
-                    <w:spacing w:before="0" w:after="0"/>
-                    <w:jc w:val="start"/>
-                    <w:rPr>
-                      <w:rFonts w:ascii="Calibri" w:hAnsi="Calibri" w:cs="Calibri" w:asciiTheme="minorHAnsi" w:cstheme="minorHAnsi" w:hAnsiTheme="minorHAnsi"/>
-                      <w:sz w:val="22"/>
-                      <w:szCs w:val="22"/>
-                    </w:rPr>
-                  </w:pPr>
-                  <w:r>
-                    <w:rPr>
-                      <w:rFonts w:eastAsia="Times New Roman" w:cs="Calibri" w:cstheme="minorHAnsi" w:ascii="Calibri" w:hAnsi="Calibri"/>
-                      <w:kern w:val="0"/>
-                      <w:sz w:val="22"/>
-                      <w:szCs w:val="22"/>
-                      <w:lang w:bidi="ar-SA"/>
+                    <w:suppressAutoHyphens w:val="true"/>
+                    <w:spacing w:before="0" w:after="0"/>
+                    <w:jc w:val="start"/>
+                    <w:rPr>
+                      <w:rFonts w:ascii="Calibri" w:hAnsi="Calibri" w:cs="Calibri" w:asciiTheme="minorHAnsi" w:cstheme="minorHAnsi" w:hAnsiTheme="minorHAnsi"/>
+                      <w:sz w:val="22"/>
+                      <w:szCs w:val="22"/>
+                    </w:rPr>
+                  </w:pPr>
+                  <w:r>
+                    <w:rPr>
+                      <w:rFonts w:cs="Calibri" w:cstheme="minorHAnsi" w:ascii="Calibri" w:hAnsi="Calibri"/>
+                      <w:sz w:val="22"/>
+                      <w:szCs w:val="22"/>
                     </w:rPr>
                   </w:r>
                 </w:p>
@@ -6441,6 +6356,7 @@
                   <w:pPr>
                     <w:pStyle w:val="Normal"/>
                     <w:widowControl/>
+                    <w:suppressAutoHyphens w:val="true"/>
                     <w:spacing w:before="0" w:after="0"/>
                     <w:jc w:val="start"/>
                     <w:rPr>
@@ -6468,14 +6384,15 @@
               </w:trPr>
               <w:tc>
                 <w:tcPr>
-                  <w:tcW w:w="5948" w:type="dxa"/>
-                  <w:tcBorders/>
-                  <w:vAlign w:val="center"/>
-                </w:tcPr>
-                <w:p>
-                  <w:pPr>
-                    <w:pStyle w:val="Normal"/>
-                    <w:widowControl/>
+                  <w:tcW w:w="5947" w:type="dxa"/>
+                  <w:tcBorders/>
+                  <w:vAlign w:val="center"/>
+                </w:tcPr>
+                <w:p>
+                  <w:pPr>
+                    <w:pStyle w:val="Normal"/>
+                    <w:widowControl/>
+                    <w:suppressAutoHyphens w:val="true"/>
                     <w:spacing w:before="0" w:after="0"/>
                     <w:jc w:val="start"/>
                     <w:rPr>
@@ -6506,6 +6423,7 @@
                   <w:pPr>
                     <w:pStyle w:val="Normal"/>
                     <w:widowControl/>
+                    <w:suppressAutoHyphens w:val="true"/>
                     <w:spacing w:before="0" w:after="0"/>
                     <w:jc w:val="start"/>
                     <w:rPr>
@@ -6536,6 +6454,7 @@
                   <w:pPr>
                     <w:pStyle w:val="Normal"/>
                     <w:widowControl/>
+                    <w:suppressAutoHyphens w:val="true"/>
                     <w:spacing w:before="0" w:after="0"/>
                     <w:jc w:val="start"/>
                     <w:rPr>
@@ -6558,7 +6477,7 @@
               </w:tc>
               <w:tc>
                 <w:tcPr>
-                  <w:tcW w:w="710" w:type="dxa"/>
+                  <w:tcW w:w="711" w:type="dxa"/>
                   <w:tcBorders/>
                   <w:shd w:color="auto" w:fill="D9D9D9" w:themeFill="background1" w:themeFillShade="d9" w:val="clear"/>
                   <w:vAlign w:val="center"/>
@@ -6567,21 +6486,20 @@
                   <w:pPr>
                     <w:pStyle w:val="Normal"/>
                     <w:widowControl/>
-                    <w:spacing w:before="0" w:after="0"/>
-                    <w:jc w:val="start"/>
-                    <w:rPr>
-                      <w:rFonts w:ascii="Calibri" w:hAnsi="Calibri" w:cs="Calibri" w:asciiTheme="minorHAnsi" w:cstheme="minorHAnsi" w:hAnsiTheme="minorHAnsi"/>
-                      <w:sz w:val="22"/>
-                      <w:szCs w:val="22"/>
-                    </w:rPr>
-                  </w:pPr>
-                  <w:r>
-                    <w:rPr>
-                      <w:rFonts w:eastAsia="Times New Roman" w:cs="Calibri" w:cstheme="minorHAnsi" w:ascii="Calibri" w:hAnsi="Calibri"/>
-                      <w:kern w:val="0"/>
-                      <w:sz w:val="22"/>
-                      <w:szCs w:val="22"/>
-                      <w:lang w:bidi="ar-SA"/>
+                    <w:suppressAutoHyphens w:val="true"/>
+                    <w:spacing w:before="0" w:after="0"/>
+                    <w:jc w:val="start"/>
+                    <w:rPr>
+                      <w:rFonts w:ascii="Calibri" w:hAnsi="Calibri" w:cs="Calibri" w:asciiTheme="minorHAnsi" w:cstheme="minorHAnsi" w:hAnsiTheme="minorHAnsi"/>
+                      <w:sz w:val="22"/>
+                      <w:szCs w:val="22"/>
+                    </w:rPr>
+                  </w:pPr>
+                  <w:r>
+                    <w:rPr>
+                      <w:rFonts w:cs="Calibri" w:cstheme="minorHAnsi" w:ascii="Calibri" w:hAnsi="Calibri"/>
+                      <w:sz w:val="22"/>
+                      <w:szCs w:val="22"/>
                     </w:rPr>
                   </w:r>
                 </w:p>
@@ -6595,6 +6513,7 @@
                   <w:pPr>
                     <w:pStyle w:val="Normal"/>
                     <w:widowControl/>
+                    <w:suppressAutoHyphens w:val="true"/>
                     <w:spacing w:before="0" w:after="0"/>
                     <w:jc w:val="start"/>
                     <w:rPr>
@@ -6622,14 +6541,15 @@
               </w:trPr>
               <w:tc>
                 <w:tcPr>
-                  <w:tcW w:w="5948" w:type="dxa"/>
-                  <w:tcBorders/>
-                  <w:vAlign w:val="center"/>
-                </w:tcPr>
-                <w:p>
-                  <w:pPr>
-                    <w:pStyle w:val="Normal"/>
-                    <w:widowControl/>
+                  <w:tcW w:w="5947" w:type="dxa"/>
+                  <w:tcBorders/>
+                  <w:vAlign w:val="center"/>
+                </w:tcPr>
+                <w:p>
+                  <w:pPr>
+                    <w:pStyle w:val="Normal"/>
+                    <w:widowControl/>
+                    <w:suppressAutoHyphens w:val="true"/>
                     <w:spacing w:before="0" w:after="0"/>
                     <w:jc w:val="start"/>
                     <w:rPr>
@@ -6660,6 +6580,7 @@
                   <w:pPr>
                     <w:pStyle w:val="Normal"/>
                     <w:widowControl/>
+                    <w:suppressAutoHyphens w:val="true"/>
                     <w:spacing w:before="0" w:after="0"/>
                     <w:jc w:val="start"/>
                     <w:rPr>
@@ -6690,6 +6611,7 @@
                   <w:pPr>
                     <w:pStyle w:val="Normal"/>
                     <w:widowControl/>
+                    <w:suppressAutoHyphens w:val="true"/>
                     <w:spacing w:before="0" w:after="0"/>
                     <w:jc w:val="start"/>
                     <w:rPr>
@@ -6712,7 +6634,7 @@
               </w:tc>
               <w:tc>
                 <w:tcPr>
-                  <w:tcW w:w="710" w:type="dxa"/>
+                  <w:tcW w:w="711" w:type="dxa"/>
                   <w:tcBorders/>
                   <w:shd w:color="auto" w:fill="D9D9D9" w:themeFill="background1" w:themeFillShade="d9" w:val="clear"/>
                   <w:vAlign w:val="center"/>
@@ -6721,21 +6643,20 @@
                   <w:pPr>
                     <w:pStyle w:val="Normal"/>
                     <w:widowControl/>
-                    <w:spacing w:before="0" w:after="0"/>
-                    <w:jc w:val="start"/>
-                    <w:rPr>
-                      <w:rFonts w:ascii="Calibri" w:hAnsi="Calibri" w:cs="Calibri" w:asciiTheme="minorHAnsi" w:cstheme="minorHAnsi" w:hAnsiTheme="minorHAnsi"/>
-                      <w:sz w:val="22"/>
-                      <w:szCs w:val="22"/>
-                    </w:rPr>
-                  </w:pPr>
-                  <w:r>
-                    <w:rPr>
-                      <w:rFonts w:eastAsia="Times New Roman" w:cs="Calibri" w:cstheme="minorHAnsi" w:ascii="Calibri" w:hAnsi="Calibri"/>
-                      <w:kern w:val="0"/>
-                      <w:sz w:val="22"/>
-                      <w:szCs w:val="22"/>
-                      <w:lang w:bidi="ar-SA"/>
+                    <w:suppressAutoHyphens w:val="true"/>
+                    <w:spacing w:before="0" w:after="0"/>
+                    <w:jc w:val="start"/>
+                    <w:rPr>
+                      <w:rFonts w:ascii="Calibri" w:hAnsi="Calibri" w:cs="Calibri" w:asciiTheme="minorHAnsi" w:cstheme="minorHAnsi" w:hAnsiTheme="minorHAnsi"/>
+                      <w:sz w:val="22"/>
+                      <w:szCs w:val="22"/>
+                    </w:rPr>
+                  </w:pPr>
+                  <w:r>
+                    <w:rPr>
+                      <w:rFonts w:cs="Calibri" w:cstheme="minorHAnsi" w:ascii="Calibri" w:hAnsi="Calibri"/>
+                      <w:sz w:val="22"/>
+                      <w:szCs w:val="22"/>
                     </w:rPr>
                   </w:r>
                 </w:p>
@@ -6749,6 +6670,7 @@
                   <w:pPr>
                     <w:pStyle w:val="Normal"/>
                     <w:widowControl/>
+                    <w:suppressAutoHyphens w:val="true"/>
                     <w:spacing w:before="0" w:after="0"/>
                     <w:jc w:val="start"/>
                     <w:rPr>
@@ -6776,14 +6698,15 @@
               </w:trPr>
               <w:tc>
                 <w:tcPr>
-                  <w:tcW w:w="5948" w:type="dxa"/>
-                  <w:tcBorders/>
-                  <w:vAlign w:val="center"/>
-                </w:tcPr>
-                <w:p>
-                  <w:pPr>
-                    <w:pStyle w:val="Normal"/>
-                    <w:widowControl/>
+                  <w:tcW w:w="5947" w:type="dxa"/>
+                  <w:tcBorders/>
+                  <w:vAlign w:val="center"/>
+                </w:tcPr>
+                <w:p>
+                  <w:pPr>
+                    <w:pStyle w:val="Normal"/>
+                    <w:widowControl/>
+                    <w:suppressAutoHyphens w:val="true"/>
                     <w:spacing w:before="0" w:after="0"/>
                     <w:jc w:val="start"/>
                     <w:rPr>
@@ -6814,6 +6737,7 @@
                   <w:pPr>
                     <w:pStyle w:val="Normal"/>
                     <w:widowControl/>
+                    <w:suppressAutoHyphens w:val="true"/>
                     <w:spacing w:before="0" w:after="0"/>
                     <w:jc w:val="start"/>
                     <w:rPr>
@@ -6844,6 +6768,7 @@
                   <w:pPr>
                     <w:pStyle w:val="Normal"/>
                     <w:widowControl/>
+                    <w:suppressAutoHyphens w:val="true"/>
                     <w:spacing w:before="0" w:after="0"/>
                     <w:jc w:val="start"/>
                     <w:rPr>
@@ -6866,7 +6791,7 @@
               </w:tc>
               <w:tc>
                 <w:tcPr>
-                  <w:tcW w:w="710" w:type="dxa"/>
+                  <w:tcW w:w="711" w:type="dxa"/>
                   <w:tcBorders/>
                   <w:shd w:color="auto" w:fill="D9D9D9" w:themeFill="background1" w:themeFillShade="d9" w:val="clear"/>
                   <w:vAlign w:val="center"/>
@@ -6875,21 +6800,20 @@
                   <w:pPr>
                     <w:pStyle w:val="Normal"/>
                     <w:widowControl/>
-                    <w:spacing w:before="0" w:after="0"/>
-                    <w:jc w:val="start"/>
-                    <w:rPr>
-                      <w:rFonts w:ascii="Calibri" w:hAnsi="Calibri" w:cs="Calibri" w:asciiTheme="minorHAnsi" w:cstheme="minorHAnsi" w:hAnsiTheme="minorHAnsi"/>
-                      <w:sz w:val="22"/>
-                      <w:szCs w:val="22"/>
-                    </w:rPr>
-                  </w:pPr>
-                  <w:r>
-                    <w:rPr>
-                      <w:rFonts w:eastAsia="Times New Roman" w:cs="Calibri" w:cstheme="minorHAnsi" w:ascii="Calibri" w:hAnsi="Calibri"/>
-                      <w:kern w:val="0"/>
-                      <w:sz w:val="22"/>
-                      <w:szCs w:val="22"/>
-                      <w:lang w:bidi="ar-SA"/>
+                    <w:suppressAutoHyphens w:val="true"/>
+                    <w:spacing w:before="0" w:after="0"/>
+                    <w:jc w:val="start"/>
+                    <w:rPr>
+                      <w:rFonts w:ascii="Calibri" w:hAnsi="Calibri" w:cs="Calibri" w:asciiTheme="minorHAnsi" w:cstheme="minorHAnsi" w:hAnsiTheme="minorHAnsi"/>
+                      <w:sz w:val="22"/>
+                      <w:szCs w:val="22"/>
+                    </w:rPr>
+                  </w:pPr>
+                  <w:r>
+                    <w:rPr>
+                      <w:rFonts w:cs="Calibri" w:cstheme="minorHAnsi" w:ascii="Calibri" w:hAnsi="Calibri"/>
+                      <w:sz w:val="22"/>
+                      <w:szCs w:val="22"/>
                     </w:rPr>
                   </w:r>
                 </w:p>
@@ -6903,6 +6827,7 @@
                   <w:pPr>
                     <w:pStyle w:val="Normal"/>
                     <w:widowControl/>
+                    <w:suppressAutoHyphens w:val="true"/>
                     <w:spacing w:before="0" w:after="0"/>
                     <w:jc w:val="start"/>
                     <w:rPr>
@@ -6930,14 +6855,15 @@
               </w:trPr>
               <w:tc>
                 <w:tcPr>
-                  <w:tcW w:w="5948" w:type="dxa"/>
-                  <w:tcBorders/>
-                  <w:vAlign w:val="center"/>
-                </w:tcPr>
-                <w:p>
-                  <w:pPr>
-                    <w:pStyle w:val="Normal"/>
-                    <w:widowControl/>
+                  <w:tcW w:w="5947" w:type="dxa"/>
+                  <w:tcBorders/>
+                  <w:vAlign w:val="center"/>
+                </w:tcPr>
+                <w:p>
+                  <w:pPr>
+                    <w:pStyle w:val="Normal"/>
+                    <w:widowControl/>
+                    <w:suppressAutoHyphens w:val="true"/>
                     <w:spacing w:before="0" w:after="0"/>
                     <w:jc w:val="start"/>
                     <w:rPr>
@@ -6968,6 +6894,7 @@
                   <w:pPr>
                     <w:pStyle w:val="Normal"/>
                     <w:widowControl/>
+                    <w:suppressAutoHyphens w:val="true"/>
                     <w:spacing w:before="0" w:after="0"/>
                     <w:jc w:val="start"/>
                     <w:rPr>
@@ -6998,6 +6925,7 @@
                   <w:pPr>
                     <w:pStyle w:val="Normal"/>
                     <w:widowControl/>
+                    <w:suppressAutoHyphens w:val="true"/>
                     <w:spacing w:before="0" w:after="0"/>
                     <w:jc w:val="start"/>
                     <w:rPr>
@@ -7020,7 +6948,7 @@
               </w:tc>
               <w:tc>
                 <w:tcPr>
-                  <w:tcW w:w="710" w:type="dxa"/>
+                  <w:tcW w:w="711" w:type="dxa"/>
                   <w:tcBorders/>
                   <w:shd w:color="auto" w:fill="D9D9D9" w:themeFill="background1" w:themeFillShade="d9" w:val="clear"/>
                   <w:vAlign w:val="center"/>
@@ -7029,21 +6957,20 @@
                   <w:pPr>
                     <w:pStyle w:val="Normal"/>
                     <w:widowControl/>
-                    <w:spacing w:before="0" w:after="0"/>
-                    <w:jc w:val="start"/>
-                    <w:rPr>
-                      <w:rFonts w:ascii="Calibri" w:hAnsi="Calibri" w:cs="Calibri" w:asciiTheme="minorHAnsi" w:cstheme="minorHAnsi" w:hAnsiTheme="minorHAnsi"/>
-                      <w:sz w:val="22"/>
-                      <w:szCs w:val="22"/>
-                    </w:rPr>
-                  </w:pPr>
-                  <w:r>
-                    <w:rPr>
-                      <w:rFonts w:eastAsia="Times New Roman" w:cs="Calibri" w:cstheme="minorHAnsi" w:ascii="Calibri" w:hAnsi="Calibri"/>
-                      <w:kern w:val="0"/>
-                      <w:sz w:val="22"/>
-                      <w:szCs w:val="22"/>
-                      <w:lang w:bidi="ar-SA"/>
+                    <w:suppressAutoHyphens w:val="true"/>
+                    <w:spacing w:before="0" w:after="0"/>
+                    <w:jc w:val="start"/>
+                    <w:rPr>
+                      <w:rFonts w:ascii="Calibri" w:hAnsi="Calibri" w:cs="Calibri" w:asciiTheme="minorHAnsi" w:cstheme="minorHAnsi" w:hAnsiTheme="minorHAnsi"/>
+                      <w:sz w:val="22"/>
+                      <w:szCs w:val="22"/>
+                    </w:rPr>
+                  </w:pPr>
+                  <w:r>
+                    <w:rPr>
+                      <w:rFonts w:cs="Calibri" w:cstheme="minorHAnsi" w:ascii="Calibri" w:hAnsi="Calibri"/>
+                      <w:sz w:val="22"/>
+                      <w:szCs w:val="22"/>
                     </w:rPr>
                   </w:r>
                 </w:p>
@@ -7057,6 +6984,7 @@
                   <w:pPr>
                     <w:pStyle w:val="Normal"/>
                     <w:widowControl/>
+                    <w:suppressAutoHyphens w:val="true"/>
                     <w:spacing w:before="0" w:after="0"/>
                     <w:jc w:val="start"/>
                     <w:rPr>
@@ -7084,14 +7012,15 @@
               </w:trPr>
               <w:tc>
                 <w:tcPr>
-                  <w:tcW w:w="5948" w:type="dxa"/>
-                  <w:tcBorders/>
-                  <w:vAlign w:val="center"/>
-                </w:tcPr>
-                <w:p>
-                  <w:pPr>
-                    <w:pStyle w:val="Normal"/>
-                    <w:widowControl/>
+                  <w:tcW w:w="5947" w:type="dxa"/>
+                  <w:tcBorders/>
+                  <w:vAlign w:val="center"/>
+                </w:tcPr>
+                <w:p>
+                  <w:pPr>
+                    <w:pStyle w:val="Normal"/>
+                    <w:widowControl/>
+                    <w:suppressAutoHyphens w:val="true"/>
                     <w:spacing w:before="0" w:after="0"/>
                     <w:jc w:val="start"/>
                     <w:rPr>
@@ -7122,6 +7051,7 @@
                   <w:pPr>
                     <w:pStyle w:val="Normal"/>
                     <w:widowControl/>
+                    <w:suppressAutoHyphens w:val="true"/>
                     <w:spacing w:before="0" w:after="0"/>
                     <w:jc w:val="start"/>
                     <w:rPr>
@@ -7152,6 +7082,7 @@
                   <w:pPr>
                     <w:pStyle w:val="Normal"/>
                     <w:widowControl/>
+                    <w:suppressAutoHyphens w:val="true"/>
                     <w:spacing w:before="0" w:after="0"/>
                     <w:jc w:val="start"/>
                     <w:rPr>
@@ -7174,7 +7105,7 @@
               </w:tc>
               <w:tc>
                 <w:tcPr>
-                  <w:tcW w:w="710" w:type="dxa"/>
+                  <w:tcW w:w="711" w:type="dxa"/>
                   <w:tcBorders/>
                   <w:shd w:color="auto" w:fill="D9D9D9" w:themeFill="background1" w:themeFillShade="d9" w:val="clear"/>
                   <w:vAlign w:val="center"/>
@@ -7183,21 +7114,20 @@
                   <w:pPr>
                     <w:pStyle w:val="Normal"/>
                     <w:widowControl/>
-                    <w:spacing w:before="0" w:after="0"/>
-                    <w:jc w:val="start"/>
-                    <w:rPr>
-                      <w:rFonts w:ascii="Calibri" w:hAnsi="Calibri" w:cs="Calibri" w:asciiTheme="minorHAnsi" w:cstheme="minorHAnsi" w:hAnsiTheme="minorHAnsi"/>
-                      <w:sz w:val="22"/>
-                      <w:szCs w:val="22"/>
-                    </w:rPr>
-                  </w:pPr>
-                  <w:r>
-                    <w:rPr>
-                      <w:rFonts w:eastAsia="Times New Roman" w:cs="Calibri" w:cstheme="minorHAnsi" w:ascii="Calibri" w:hAnsi="Calibri"/>
-                      <w:kern w:val="0"/>
-                      <w:sz w:val="22"/>
-                      <w:szCs w:val="22"/>
-                      <w:lang w:bidi="ar-SA"/>
+                    <w:suppressAutoHyphens w:val="true"/>
+                    <w:spacing w:before="0" w:after="0"/>
+                    <w:jc w:val="start"/>
+                    <w:rPr>
+                      <w:rFonts w:ascii="Calibri" w:hAnsi="Calibri" w:cs="Calibri" w:asciiTheme="minorHAnsi" w:cstheme="minorHAnsi" w:hAnsiTheme="minorHAnsi"/>
+                      <w:sz w:val="22"/>
+                      <w:szCs w:val="22"/>
+                    </w:rPr>
+                  </w:pPr>
+                  <w:r>
+                    <w:rPr>
+                      <w:rFonts w:cs="Calibri" w:cstheme="minorHAnsi" w:ascii="Calibri" w:hAnsi="Calibri"/>
+                      <w:sz w:val="22"/>
+                      <w:szCs w:val="22"/>
                     </w:rPr>
                   </w:r>
                 </w:p>
@@ -7211,6 +7141,7 @@
                   <w:pPr>
                     <w:pStyle w:val="Normal"/>
                     <w:widowControl/>
+                    <w:suppressAutoHyphens w:val="true"/>
                     <w:spacing w:before="0" w:after="0"/>
                     <w:jc w:val="start"/>
                     <w:rPr>
@@ -7238,14 +7169,15 @@
               </w:trPr>
               <w:tc>
                 <w:tcPr>
-                  <w:tcW w:w="5948" w:type="dxa"/>
-                  <w:tcBorders/>
-                  <w:vAlign w:val="center"/>
-                </w:tcPr>
-                <w:p>
-                  <w:pPr>
-                    <w:pStyle w:val="Normal"/>
-                    <w:widowControl/>
+                  <w:tcW w:w="5947" w:type="dxa"/>
+                  <w:tcBorders/>
+                  <w:vAlign w:val="center"/>
+                </w:tcPr>
+                <w:p>
+                  <w:pPr>
+                    <w:pStyle w:val="Normal"/>
+                    <w:widowControl/>
+                    <w:suppressAutoHyphens w:val="true"/>
                     <w:spacing w:before="0" w:after="0"/>
                     <w:jc w:val="start"/>
                     <w:rPr>
@@ -7276,6 +7208,7 @@
                   <w:pPr>
                     <w:pStyle w:val="Normal"/>
                     <w:widowControl/>
+                    <w:suppressAutoHyphens w:val="true"/>
                     <w:spacing w:before="0" w:after="0"/>
                     <w:jc w:val="start"/>
                     <w:rPr>
@@ -7306,6 +7239,7 @@
                   <w:pPr>
                     <w:pStyle w:val="Normal"/>
                     <w:widowControl/>
+                    <w:suppressAutoHyphens w:val="true"/>
                     <w:spacing w:before="0" w:after="0"/>
                     <w:jc w:val="start"/>
                     <w:rPr>
@@ -7328,7 +7262,7 @@
               </w:tc>
               <w:tc>
                 <w:tcPr>
-                  <w:tcW w:w="710" w:type="dxa"/>
+                  <w:tcW w:w="711" w:type="dxa"/>
                   <w:tcBorders/>
                   <w:shd w:color="auto" w:fill="D9D9D9" w:themeFill="background1" w:themeFillShade="d9" w:val="clear"/>
                   <w:vAlign w:val="center"/>
@@ -7337,21 +7271,20 @@
                   <w:pPr>
                     <w:pStyle w:val="Normal"/>
                     <w:widowControl/>
-                    <w:spacing w:before="0" w:after="0"/>
-                    <w:jc w:val="start"/>
-                    <w:rPr>
-                      <w:rFonts w:ascii="Calibri" w:hAnsi="Calibri" w:cs="Calibri" w:asciiTheme="minorHAnsi" w:cstheme="minorHAnsi" w:hAnsiTheme="minorHAnsi"/>
-                      <w:sz w:val="22"/>
-                      <w:szCs w:val="22"/>
-                    </w:rPr>
-                  </w:pPr>
-                  <w:r>
-                    <w:rPr>
-                      <w:rFonts w:eastAsia="Times New Roman" w:cs="Calibri" w:cstheme="minorHAnsi" w:ascii="Calibri" w:hAnsi="Calibri"/>
-                      <w:kern w:val="0"/>
-                      <w:sz w:val="22"/>
-                      <w:szCs w:val="22"/>
-                      <w:lang w:bidi="ar-SA"/>
+                    <w:suppressAutoHyphens w:val="true"/>
+                    <w:spacing w:before="0" w:after="0"/>
+                    <w:jc w:val="start"/>
+                    <w:rPr>
+                      <w:rFonts w:ascii="Calibri" w:hAnsi="Calibri" w:cs="Calibri" w:asciiTheme="minorHAnsi" w:cstheme="minorHAnsi" w:hAnsiTheme="minorHAnsi"/>
+                      <w:sz w:val="22"/>
+                      <w:szCs w:val="22"/>
+                    </w:rPr>
+                  </w:pPr>
+                  <w:r>
+                    <w:rPr>
+                      <w:rFonts w:cs="Calibri" w:cstheme="minorHAnsi" w:ascii="Calibri" w:hAnsi="Calibri"/>
+                      <w:sz w:val="22"/>
+                      <w:szCs w:val="22"/>
                     </w:rPr>
                   </w:r>
                 </w:p>
@@ -7366,6 +7299,7 @@
                   <w:pPr>
                     <w:pStyle w:val="Normal"/>
                     <w:widowControl/>
+                    <w:suppressAutoHyphens w:val="true"/>
                     <w:spacing w:before="0" w:after="0"/>
                     <w:jc w:val="start"/>
                     <w:rPr>
@@ -7391,14 +7325,15 @@
               </w:trPr>
               <w:tc>
                 <w:tcPr>
-                  <w:tcW w:w="5948" w:type="dxa"/>
-                  <w:tcBorders/>
-                  <w:vAlign w:val="center"/>
-                </w:tcPr>
-                <w:p>
-                  <w:pPr>
-                    <w:pStyle w:val="Normal"/>
-                    <w:widowControl/>
+                  <w:tcW w:w="5947" w:type="dxa"/>
+                  <w:tcBorders/>
+                  <w:vAlign w:val="center"/>
+                </w:tcPr>
+                <w:p>
+                  <w:pPr>
+                    <w:pStyle w:val="Normal"/>
+                    <w:widowControl/>
+                    <w:suppressAutoHyphens w:val="true"/>
                     <w:spacing w:before="0" w:after="0"/>
                     <w:jc w:val="start"/>
                     <w:rPr>
@@ -7429,6 +7364,7 @@
                   <w:pPr>
                     <w:pStyle w:val="Normal"/>
                     <w:widowControl/>
+                    <w:suppressAutoHyphens w:val="true"/>
                     <w:spacing w:before="0" w:after="0"/>
                     <w:jc w:val="start"/>
                     <w:rPr>
@@ -7459,6 +7395,7 @@
                   <w:pPr>
                     <w:pStyle w:val="Normal"/>
                     <w:widowControl/>
+                    <w:suppressAutoHyphens w:val="true"/>
                     <w:spacing w:before="0" w:after="0"/>
                     <w:jc w:val="start"/>
                     <w:rPr>
@@ -7481,7 +7418,7 @@
               </w:tc>
               <w:tc>
                 <w:tcPr>
-                  <w:tcW w:w="710" w:type="dxa"/>
+                  <w:tcW w:w="711" w:type="dxa"/>
                   <w:tcBorders/>
                   <w:shd w:color="auto" w:fill="D9D9D9" w:themeFill="background1" w:themeFillShade="d9" w:val="clear"/>
                   <w:vAlign w:val="center"/>
@@ -7490,21 +7427,20 @@
                   <w:pPr>
                     <w:pStyle w:val="Normal"/>
                     <w:widowControl/>
-                    <w:spacing w:before="0" w:after="0"/>
-                    <w:jc w:val="start"/>
-                    <w:rPr>
-                      <w:rFonts w:ascii="Calibri" w:hAnsi="Calibri" w:cs="Calibri" w:asciiTheme="minorHAnsi" w:cstheme="minorHAnsi" w:hAnsiTheme="minorHAnsi"/>
-                      <w:sz w:val="22"/>
-                      <w:szCs w:val="22"/>
-                    </w:rPr>
-                  </w:pPr>
-                  <w:r>
-                    <w:rPr>
-                      <w:rFonts w:eastAsia="Times New Roman" w:cs="Calibri" w:cstheme="minorHAnsi" w:ascii="Calibri" w:hAnsi="Calibri"/>
-                      <w:kern w:val="0"/>
-                      <w:sz w:val="22"/>
-                      <w:szCs w:val="22"/>
-                      <w:lang w:bidi="ar-SA"/>
+                    <w:suppressAutoHyphens w:val="true"/>
+                    <w:spacing w:before="0" w:after="0"/>
+                    <w:jc w:val="start"/>
+                    <w:rPr>
+                      <w:rFonts w:ascii="Calibri" w:hAnsi="Calibri" w:cs="Calibri" w:asciiTheme="minorHAnsi" w:cstheme="minorHAnsi" w:hAnsiTheme="minorHAnsi"/>
+                      <w:sz w:val="22"/>
+                      <w:szCs w:val="22"/>
+                    </w:rPr>
+                  </w:pPr>
+                  <w:r>
+                    <w:rPr>
+                      <w:rFonts w:cs="Calibri" w:cstheme="minorHAnsi" w:ascii="Calibri" w:hAnsi="Calibri"/>
+                      <w:sz w:val="22"/>
+                      <w:szCs w:val="22"/>
                     </w:rPr>
                   </w:r>
                 </w:p>
@@ -7519,6 +7455,7 @@
                   <w:pPr>
                     <w:pStyle w:val="Normal"/>
                     <w:widowControl/>
+                    <w:suppressAutoHyphens w:val="true"/>
                     <w:spacing w:before="0" w:after="0"/>
                     <w:jc w:val="start"/>
                     <w:rPr>
@@ -7546,14 +7483,15 @@
               </w:trPr>
               <w:tc>
                 <w:tcPr>
-                  <w:tcW w:w="5948" w:type="dxa"/>
-                  <w:tcBorders/>
-                  <w:vAlign w:val="center"/>
-                </w:tcPr>
-                <w:p>
-                  <w:pPr>
-                    <w:pStyle w:val="Normal"/>
-                    <w:widowControl/>
+                  <w:tcW w:w="5947" w:type="dxa"/>
+                  <w:tcBorders/>
+                  <w:vAlign w:val="center"/>
+                </w:tcPr>
+                <w:p>
+                  <w:pPr>
+                    <w:pStyle w:val="Normal"/>
+                    <w:widowControl/>
+                    <w:suppressAutoHyphens w:val="true"/>
                     <w:spacing w:before="0" w:after="0"/>
                     <w:jc w:val="start"/>
                     <w:rPr>
@@ -7584,6 +7522,7 @@
                   <w:pPr>
                     <w:pStyle w:val="Normal"/>
                     <w:widowControl/>
+                    <w:suppressAutoHyphens w:val="true"/>
                     <w:spacing w:before="0" w:after="0"/>
                     <w:jc w:val="start"/>
                     <w:rPr>
@@ -7614,6 +7553,7 @@
                   <w:pPr>
                     <w:pStyle w:val="Normal"/>
                     <w:widowControl/>
+                    <w:suppressAutoHyphens w:val="true"/>
                     <w:spacing w:before="0" w:after="0"/>
                     <w:jc w:val="start"/>
                     <w:rPr>
@@ -7636,7 +7576,7 @@
               </w:tc>
               <w:tc>
                 <w:tcPr>
-                  <w:tcW w:w="710" w:type="dxa"/>
+                  <w:tcW w:w="711" w:type="dxa"/>
                   <w:tcBorders/>
                   <w:shd w:color="auto" w:fill="D9D9D9" w:themeFill="background1" w:themeFillShade="d9" w:val="clear"/>
                   <w:vAlign w:val="center"/>
@@ -7645,21 +7585,20 @@
                   <w:pPr>
                     <w:pStyle w:val="Normal"/>
                     <w:widowControl/>
-                    <w:spacing w:before="0" w:after="0"/>
-                    <w:jc w:val="start"/>
-                    <w:rPr>
-                      <w:rFonts w:ascii="Calibri" w:hAnsi="Calibri" w:cs="Calibri" w:asciiTheme="minorHAnsi" w:cstheme="minorHAnsi" w:hAnsiTheme="minorHAnsi"/>
-                      <w:sz w:val="22"/>
-                      <w:szCs w:val="22"/>
-                    </w:rPr>
-                  </w:pPr>
-                  <w:r>
-                    <w:rPr>
-                      <w:rFonts w:eastAsia="Times New Roman" w:cs="Calibri" w:cstheme="minorHAnsi" w:ascii="Calibri" w:hAnsi="Calibri"/>
-                      <w:kern w:val="0"/>
-                      <w:sz w:val="22"/>
-                      <w:szCs w:val="22"/>
-                      <w:lang w:bidi="ar-SA"/>
+                    <w:suppressAutoHyphens w:val="true"/>
+                    <w:spacing w:before="0" w:after="0"/>
+                    <w:jc w:val="start"/>
+                    <w:rPr>
+                      <w:rFonts w:ascii="Calibri" w:hAnsi="Calibri" w:cs="Calibri" w:asciiTheme="minorHAnsi" w:cstheme="minorHAnsi" w:hAnsiTheme="minorHAnsi"/>
+                      <w:sz w:val="22"/>
+                      <w:szCs w:val="22"/>
+                    </w:rPr>
+                  </w:pPr>
+                  <w:r>
+                    <w:rPr>
+                      <w:rFonts w:cs="Calibri" w:cstheme="minorHAnsi" w:ascii="Calibri" w:hAnsi="Calibri"/>
+                      <w:sz w:val="22"/>
+                      <w:szCs w:val="22"/>
                     </w:rPr>
                   </w:r>
                 </w:p>
@@ -7674,6 +7613,7 @@
                   <w:pPr>
                     <w:pStyle w:val="Normal"/>
                     <w:widowControl/>
+                    <w:suppressAutoHyphens w:val="true"/>
                     <w:spacing w:before="0" w:after="0"/>
                     <w:jc w:val="start"/>
                     <w:rPr>
@@ -7699,14 +7639,15 @@
               </w:trPr>
               <w:tc>
                 <w:tcPr>
-                  <w:tcW w:w="5948" w:type="dxa"/>
-                  <w:tcBorders/>
-                  <w:vAlign w:val="center"/>
-                </w:tcPr>
-                <w:p>
-                  <w:pPr>
-                    <w:pStyle w:val="Normal"/>
-                    <w:widowControl/>
+                  <w:tcW w:w="5947" w:type="dxa"/>
+                  <w:tcBorders/>
+                  <w:vAlign w:val="center"/>
+                </w:tcPr>
+                <w:p>
+                  <w:pPr>
+                    <w:pStyle w:val="Normal"/>
+                    <w:widowControl/>
+                    <w:suppressAutoHyphens w:val="true"/>
                     <w:spacing w:before="0" w:after="0"/>
                     <w:jc w:val="start"/>
                     <w:rPr>
@@ -7737,6 +7678,7 @@
                   <w:pPr>
                     <w:pStyle w:val="Normal"/>
                     <w:widowControl/>
+                    <w:suppressAutoHyphens w:val="true"/>
                     <w:spacing w:before="0" w:after="0"/>
                     <w:jc w:val="start"/>
                     <w:rPr>
@@ -7767,6 +7709,7 @@
                   <w:pPr>
                     <w:pStyle w:val="Normal"/>
                     <w:widowControl/>
+                    <w:suppressAutoHyphens w:val="true"/>
                     <w:spacing w:before="0" w:after="0"/>
                     <w:jc w:val="start"/>
                     <w:rPr>
@@ -7789,7 +7732,7 @@
               </w:tc>
               <w:tc>
                 <w:tcPr>
-                  <w:tcW w:w="710" w:type="dxa"/>
+                  <w:tcW w:w="711" w:type="dxa"/>
                   <w:tcBorders/>
                   <w:shd w:color="auto" w:fill="D9D9D9" w:themeFill="background1" w:themeFillShade="d9" w:val="clear"/>
                   <w:vAlign w:val="center"/>
@@ -7798,21 +7741,20 @@
                   <w:pPr>
                     <w:pStyle w:val="Normal"/>
                     <w:widowControl/>
-                    <w:spacing w:before="0" w:after="0"/>
-                    <w:jc w:val="start"/>
-                    <w:rPr>
-                      <w:rFonts w:ascii="Calibri" w:hAnsi="Calibri" w:cs="Calibri" w:asciiTheme="minorHAnsi" w:cstheme="minorHAnsi" w:hAnsiTheme="minorHAnsi"/>
-                      <w:sz w:val="22"/>
-                      <w:szCs w:val="22"/>
-                    </w:rPr>
-                  </w:pPr>
-                  <w:r>
-                    <w:rPr>
-                      <w:rFonts w:eastAsia="Times New Roman" w:cs="Calibri" w:cstheme="minorHAnsi" w:ascii="Calibri" w:hAnsi="Calibri"/>
-                      <w:kern w:val="0"/>
-                      <w:sz w:val="22"/>
-                      <w:szCs w:val="22"/>
-                      <w:lang w:bidi="ar-SA"/>
+                    <w:suppressAutoHyphens w:val="true"/>
+                    <w:spacing w:before="0" w:after="0"/>
+                    <w:jc w:val="start"/>
+                    <w:rPr>
+                      <w:rFonts w:ascii="Calibri" w:hAnsi="Calibri" w:cs="Calibri" w:asciiTheme="minorHAnsi" w:cstheme="minorHAnsi" w:hAnsiTheme="minorHAnsi"/>
+                      <w:sz w:val="22"/>
+                      <w:szCs w:val="22"/>
+                    </w:rPr>
+                  </w:pPr>
+                  <w:r>
+                    <w:rPr>
+                      <w:rFonts w:cs="Calibri" w:cstheme="minorHAnsi" w:ascii="Calibri" w:hAnsi="Calibri"/>
+                      <w:sz w:val="22"/>
+                      <w:szCs w:val="22"/>
                     </w:rPr>
                   </w:r>
                 </w:p>
@@ -7827,6 +7769,7 @@
                   <w:pPr>
                     <w:pStyle w:val="Normal"/>
                     <w:widowControl/>
+                    <w:suppressAutoHyphens w:val="true"/>
                     <w:spacing w:before="0" w:after="0"/>
                     <w:jc w:val="start"/>
                     <w:rPr>
@@ -7852,14 +7795,15 @@
               </w:trPr>
               <w:tc>
                 <w:tcPr>
-                  <w:tcW w:w="5948" w:type="dxa"/>
-                  <w:tcBorders/>
-                  <w:vAlign w:val="center"/>
-                </w:tcPr>
-                <w:p>
-                  <w:pPr>
-                    <w:pStyle w:val="Normal"/>
-                    <w:widowControl/>
+                  <w:tcW w:w="5947" w:type="dxa"/>
+                  <w:tcBorders/>
+                  <w:vAlign w:val="center"/>
+                </w:tcPr>
+                <w:p>
+                  <w:pPr>
+                    <w:pStyle w:val="Normal"/>
+                    <w:widowControl/>
+                    <w:suppressAutoHyphens w:val="true"/>
                     <w:spacing w:before="0" w:after="0"/>
                     <w:jc w:val="start"/>
                     <w:rPr>
@@ -7890,6 +7834,7 @@
                   <w:pPr>
                     <w:pStyle w:val="Normal"/>
                     <w:widowControl/>
+                    <w:suppressAutoHyphens w:val="true"/>
                     <w:spacing w:before="0" w:after="0"/>
                     <w:jc w:val="start"/>
                     <w:rPr>
@@ -7920,6 +7865,7 @@
                   <w:pPr>
                     <w:pStyle w:val="Normal"/>
                     <w:widowControl/>
+                    <w:suppressAutoHyphens w:val="true"/>
                     <w:spacing w:before="0" w:after="0"/>
                     <w:jc w:val="start"/>
                     <w:rPr>
@@ -7942,7 +7888,7 @@
               </w:tc>
               <w:tc>
                 <w:tcPr>
-                  <w:tcW w:w="710" w:type="dxa"/>
+                  <w:tcW w:w="711" w:type="dxa"/>
                   <w:tcBorders/>
                   <w:shd w:color="auto" w:fill="D9D9D9" w:themeFill="background1" w:themeFillShade="d9" w:val="clear"/>
                   <w:vAlign w:val="center"/>
@@ -7951,21 +7897,20 @@
                   <w:pPr>
                     <w:pStyle w:val="Normal"/>
                     <w:widowControl/>
-                    <w:spacing w:before="0" w:after="0"/>
-                    <w:jc w:val="start"/>
-                    <w:rPr>
-                      <w:rFonts w:ascii="Calibri" w:hAnsi="Calibri" w:cs="Calibri" w:asciiTheme="minorHAnsi" w:cstheme="minorHAnsi" w:hAnsiTheme="minorHAnsi"/>
-                      <w:sz w:val="22"/>
-                      <w:szCs w:val="22"/>
-                    </w:rPr>
-                  </w:pPr>
-                  <w:r>
-                    <w:rPr>
-                      <w:rFonts w:eastAsia="Times New Roman" w:cs="Calibri" w:cstheme="minorHAnsi" w:ascii="Calibri" w:hAnsi="Calibri"/>
-                      <w:kern w:val="0"/>
-                      <w:sz w:val="22"/>
-                      <w:szCs w:val="22"/>
-                      <w:lang w:bidi="ar-SA"/>
+                    <w:suppressAutoHyphens w:val="true"/>
+                    <w:spacing w:before="0" w:after="0"/>
+                    <w:jc w:val="start"/>
+                    <w:rPr>
+                      <w:rFonts w:ascii="Calibri" w:hAnsi="Calibri" w:cs="Calibri" w:asciiTheme="minorHAnsi" w:cstheme="minorHAnsi" w:hAnsiTheme="minorHAnsi"/>
+                      <w:sz w:val="22"/>
+                      <w:szCs w:val="22"/>
+                    </w:rPr>
+                  </w:pPr>
+                  <w:r>
+                    <w:rPr>
+                      <w:rFonts w:cs="Calibri" w:cstheme="minorHAnsi" w:ascii="Calibri" w:hAnsi="Calibri"/>
+                      <w:sz w:val="22"/>
+                      <w:szCs w:val="22"/>
                     </w:rPr>
                   </w:r>
                 </w:p>
@@ -7980,6 +7925,7 @@
                   <w:pPr>
                     <w:pStyle w:val="Normal"/>
                     <w:widowControl/>
+                    <w:suppressAutoHyphens w:val="true"/>
                     <w:spacing w:before="0" w:after="0"/>
                     <w:jc w:val="start"/>
                     <w:rPr>
@@ -8005,14 +7951,15 @@
               </w:trPr>
               <w:tc>
                 <w:tcPr>
-                  <w:tcW w:w="5948" w:type="dxa"/>
-                  <w:tcBorders/>
-                  <w:vAlign w:val="center"/>
-                </w:tcPr>
-                <w:p>
-                  <w:pPr>
-                    <w:pStyle w:val="Normal"/>
-                    <w:widowControl/>
+                  <w:tcW w:w="5947" w:type="dxa"/>
+                  <w:tcBorders/>
+                  <w:vAlign w:val="center"/>
+                </w:tcPr>
+                <w:p>
+                  <w:pPr>
+                    <w:pStyle w:val="Normal"/>
+                    <w:widowControl/>
+                    <w:suppressAutoHyphens w:val="true"/>
                     <w:spacing w:before="0" w:after="0"/>
                     <w:jc w:val="start"/>
                     <w:rPr>
@@ -8043,6 +7990,7 @@
                   <w:pPr>
                     <w:pStyle w:val="Normal"/>
                     <w:widowControl/>
+                    <w:suppressAutoHyphens w:val="true"/>
                     <w:spacing w:before="0" w:after="0"/>
                     <w:jc w:val="start"/>
                     <w:rPr>
@@ -8073,6 +8021,7 @@
                   <w:pPr>
                     <w:pStyle w:val="Normal"/>
                     <w:widowControl/>
+                    <w:suppressAutoHyphens w:val="true"/>
                     <w:spacing w:before="0" w:after="0"/>
                     <w:jc w:val="start"/>
                     <w:rPr>
@@ -8095,7 +8044,7 @@
               </w:tc>
               <w:tc>
                 <w:tcPr>
-                  <w:tcW w:w="710" w:type="dxa"/>
+                  <w:tcW w:w="711" w:type="dxa"/>
                   <w:tcBorders/>
                   <w:shd w:color="auto" w:fill="D9D9D9" w:themeFill="background1" w:themeFillShade="d9" w:val="clear"/>
                   <w:vAlign w:val="center"/>
@@ -8104,21 +8053,20 @@
                   <w:pPr>
                     <w:pStyle w:val="Normal"/>
                     <w:widowControl/>
-                    <w:spacing w:before="0" w:after="0"/>
-                    <w:jc w:val="start"/>
-                    <w:rPr>
-                      <w:rFonts w:ascii="Calibri" w:hAnsi="Calibri" w:cs="Calibri" w:asciiTheme="minorHAnsi" w:cstheme="minorHAnsi" w:hAnsiTheme="minorHAnsi"/>
-                      <w:sz w:val="22"/>
-                      <w:szCs w:val="22"/>
-                    </w:rPr>
-                  </w:pPr>
-                  <w:r>
-                    <w:rPr>
-                      <w:rFonts w:eastAsia="Times New Roman" w:cs="Calibri" w:cstheme="minorHAnsi" w:ascii="Calibri" w:hAnsi="Calibri"/>
-                      <w:kern w:val="0"/>
-                      <w:sz w:val="22"/>
-                      <w:szCs w:val="22"/>
-                      <w:lang w:bidi="ar-SA"/>
+                    <w:suppressAutoHyphens w:val="true"/>
+                    <w:spacing w:before="0" w:after="0"/>
+                    <w:jc w:val="start"/>
+                    <w:rPr>
+                      <w:rFonts w:ascii="Calibri" w:hAnsi="Calibri" w:cs="Calibri" w:asciiTheme="minorHAnsi" w:cstheme="minorHAnsi" w:hAnsiTheme="minorHAnsi"/>
+                      <w:sz w:val="22"/>
+                      <w:szCs w:val="22"/>
+                    </w:rPr>
+                  </w:pPr>
+                  <w:r>
+                    <w:rPr>
+                      <w:rFonts w:cs="Calibri" w:cstheme="minorHAnsi" w:ascii="Calibri" w:hAnsi="Calibri"/>
+                      <w:sz w:val="22"/>
+                      <w:szCs w:val="22"/>
                     </w:rPr>
                   </w:r>
                 </w:p>
@@ -8133,6 +8081,7 @@
                   <w:pPr>
                     <w:pStyle w:val="Normal"/>
                     <w:widowControl/>
+                    <w:suppressAutoHyphens w:val="true"/>
                     <w:spacing w:before="0" w:after="0"/>
                     <w:jc w:val="start"/>
                     <w:rPr>
@@ -8160,14 +8109,15 @@
               </w:trPr>
               <w:tc>
                 <w:tcPr>
-                  <w:tcW w:w="5948" w:type="dxa"/>
-                  <w:tcBorders/>
-                  <w:vAlign w:val="center"/>
-                </w:tcPr>
-                <w:p>
-                  <w:pPr>
-                    <w:pStyle w:val="Normal"/>
-                    <w:widowControl/>
+                  <w:tcW w:w="5947" w:type="dxa"/>
+                  <w:tcBorders/>
+                  <w:vAlign w:val="center"/>
+                </w:tcPr>
+                <w:p>
+                  <w:pPr>
+                    <w:pStyle w:val="Normal"/>
+                    <w:widowControl/>
+                    <w:suppressAutoHyphens w:val="true"/>
                     <w:spacing w:before="0" w:after="0"/>
                     <w:jc w:val="start"/>
                     <w:rPr>
@@ -8198,6 +8148,7 @@
                   <w:pPr>
                     <w:pStyle w:val="Normal"/>
                     <w:widowControl/>
+                    <w:suppressAutoHyphens w:val="true"/>
                     <w:spacing w:before="0" w:after="0"/>
                     <w:jc w:val="start"/>
                     <w:rPr>
@@ -8228,6 +8179,7 @@
                   <w:pPr>
                     <w:pStyle w:val="Normal"/>
                     <w:widowControl/>
+                    <w:suppressAutoHyphens w:val="true"/>
                     <w:spacing w:before="0" w:after="0"/>
                     <w:jc w:val="start"/>
                     <w:rPr>
@@ -8250,7 +8202,7 @@
               </w:tc>
               <w:tc>
                 <w:tcPr>
-                  <w:tcW w:w="710" w:type="dxa"/>
+                  <w:tcW w:w="711" w:type="dxa"/>
                   <w:tcBorders/>
                   <w:shd w:color="auto" w:fill="D9D9D9" w:themeFill="background1" w:themeFillShade="d9" w:val="clear"/>
                   <w:vAlign w:val="center"/>
@@ -8259,21 +8211,20 @@
                   <w:pPr>
                     <w:pStyle w:val="Normal"/>
                     <w:widowControl/>
-                    <w:spacing w:before="0" w:after="0"/>
-                    <w:jc w:val="start"/>
-                    <w:rPr>
-                      <w:rFonts w:ascii="Calibri" w:hAnsi="Calibri" w:cs="Calibri" w:asciiTheme="minorHAnsi" w:cstheme="minorHAnsi" w:hAnsiTheme="minorHAnsi"/>
-                      <w:sz w:val="22"/>
-                      <w:szCs w:val="22"/>
-                    </w:rPr>
-                  </w:pPr>
-                  <w:r>
-                    <w:rPr>
-                      <w:rFonts w:eastAsia="Times New Roman" w:cs="Calibri" w:cstheme="minorHAnsi" w:ascii="Calibri" w:hAnsi="Calibri"/>
-                      <w:kern w:val="0"/>
-                      <w:sz w:val="22"/>
-                      <w:szCs w:val="22"/>
-                      <w:lang w:bidi="ar-SA"/>
+                    <w:suppressAutoHyphens w:val="true"/>
+                    <w:spacing w:before="0" w:after="0"/>
+                    <w:jc w:val="start"/>
+                    <w:rPr>
+                      <w:rFonts w:ascii="Calibri" w:hAnsi="Calibri" w:cs="Calibri" w:asciiTheme="minorHAnsi" w:cstheme="minorHAnsi" w:hAnsiTheme="minorHAnsi"/>
+                      <w:sz w:val="22"/>
+                      <w:szCs w:val="22"/>
+                    </w:rPr>
+                  </w:pPr>
+                  <w:r>
+                    <w:rPr>
+                      <w:rFonts w:cs="Calibri" w:cstheme="minorHAnsi" w:ascii="Calibri" w:hAnsi="Calibri"/>
+                      <w:sz w:val="22"/>
+                      <w:szCs w:val="22"/>
                     </w:rPr>
                   </w:r>
                 </w:p>
@@ -8288,6 +8239,7 @@
                   <w:pPr>
                     <w:pStyle w:val="Normal"/>
                     <w:widowControl/>
+                    <w:suppressAutoHyphens w:val="true"/>
                     <w:spacing w:before="0" w:after="0"/>
                     <w:jc w:val="start"/>
                     <w:rPr>
@@ -8313,14 +8265,15 @@
               </w:trPr>
               <w:tc>
                 <w:tcPr>
-                  <w:tcW w:w="5948" w:type="dxa"/>
-                  <w:tcBorders/>
-                  <w:vAlign w:val="center"/>
-                </w:tcPr>
-                <w:p>
-                  <w:pPr>
-                    <w:pStyle w:val="Normal"/>
-                    <w:widowControl/>
+                  <w:tcW w:w="5947" w:type="dxa"/>
+                  <w:tcBorders/>
+                  <w:vAlign w:val="center"/>
+                </w:tcPr>
+                <w:p>
+                  <w:pPr>
+                    <w:pStyle w:val="Normal"/>
+                    <w:widowControl/>
+                    <w:suppressAutoHyphens w:val="true"/>
                     <w:spacing w:before="0" w:after="0"/>
                     <w:jc w:val="start"/>
                     <w:rPr>
@@ -8351,6 +8304,7 @@
                   <w:pPr>
                     <w:pStyle w:val="Normal"/>
                     <w:widowControl/>
+                    <w:suppressAutoHyphens w:val="true"/>
                     <w:spacing w:before="0" w:after="0"/>
                     <w:jc w:val="start"/>
                     <w:rPr>
@@ -8381,6 +8335,7 @@
                   <w:pPr>
                     <w:pStyle w:val="Normal"/>
                     <w:widowControl/>
+                    <w:suppressAutoHyphens w:val="true"/>
                     <w:spacing w:before="0" w:after="0"/>
                     <w:jc w:val="start"/>
                     <w:rPr>
@@ -8403,7 +8358,7 @@
               </w:tc>
               <w:tc>
                 <w:tcPr>
-                  <w:tcW w:w="710" w:type="dxa"/>
+                  <w:tcW w:w="711" w:type="dxa"/>
                   <w:tcBorders/>
                   <w:shd w:color="auto" w:fill="D9D9D9" w:themeFill="background1" w:themeFillShade="d9" w:val="clear"/>
                   <w:vAlign w:val="center"/>
@@ -8412,21 +8367,20 @@
                   <w:pPr>
                     <w:pStyle w:val="Normal"/>
                     <w:widowControl/>
-                    <w:spacing w:before="0" w:after="0"/>
-                    <w:jc w:val="start"/>
-                    <w:rPr>
-                      <w:rFonts w:ascii="Calibri" w:hAnsi="Calibri" w:cs="Calibri" w:asciiTheme="minorHAnsi" w:cstheme="minorHAnsi" w:hAnsiTheme="minorHAnsi"/>
-                      <w:sz w:val="22"/>
-                      <w:szCs w:val="22"/>
-                    </w:rPr>
-                  </w:pPr>
-                  <w:r>
-                    <w:rPr>
-                      <w:rFonts w:eastAsia="Times New Roman" w:cs="Calibri" w:cstheme="minorHAnsi" w:ascii="Calibri" w:hAnsi="Calibri"/>
-                      <w:kern w:val="0"/>
-                      <w:sz w:val="22"/>
-                      <w:szCs w:val="22"/>
-                      <w:lang w:bidi="ar-SA"/>
+                    <w:suppressAutoHyphens w:val="true"/>
+                    <w:spacing w:before="0" w:after="0"/>
+                    <w:jc w:val="start"/>
+                    <w:rPr>
+                      <w:rFonts w:ascii="Calibri" w:hAnsi="Calibri" w:cs="Calibri" w:asciiTheme="minorHAnsi" w:cstheme="minorHAnsi" w:hAnsiTheme="minorHAnsi"/>
+                      <w:sz w:val="22"/>
+                      <w:szCs w:val="22"/>
+                    </w:rPr>
+                  </w:pPr>
+                  <w:r>
+                    <w:rPr>
+                      <w:rFonts w:cs="Calibri" w:cstheme="minorHAnsi" w:ascii="Calibri" w:hAnsi="Calibri"/>
+                      <w:sz w:val="22"/>
+                      <w:szCs w:val="22"/>
                     </w:rPr>
                   </w:r>
                 </w:p>
@@ -8440,6 +8394,7 @@
                   <w:pPr>
                     <w:pStyle w:val="Normal"/>
                     <w:widowControl/>
+                    <w:suppressAutoHyphens w:val="true"/>
                     <w:spacing w:before="0" w:after="0"/>
                     <w:jc w:val="start"/>
                     <w:rPr>
@@ -8467,14 +8422,15 @@
               </w:trPr>
               <w:tc>
                 <w:tcPr>
-                  <w:tcW w:w="5948" w:type="dxa"/>
-                  <w:tcBorders/>
-                  <w:vAlign w:val="center"/>
-                </w:tcPr>
-                <w:p>
-                  <w:pPr>
-                    <w:pStyle w:val="Normal"/>
-                    <w:widowControl/>
+                  <w:tcW w:w="5947" w:type="dxa"/>
+                  <w:tcBorders/>
+                  <w:vAlign w:val="center"/>
+                </w:tcPr>
+                <w:p>
+                  <w:pPr>
+                    <w:pStyle w:val="Normal"/>
+                    <w:widowControl/>
+                    <w:suppressAutoHyphens w:val="true"/>
                     <w:spacing w:before="0" w:after="0"/>
                     <w:jc w:val="start"/>
                     <w:rPr>
@@ -8505,6 +8461,7 @@
                   <w:pPr>
                     <w:pStyle w:val="Normal"/>
                     <w:widowControl/>
+                    <w:suppressAutoHyphens w:val="true"/>
                     <w:spacing w:before="0" w:after="0"/>
                     <w:jc w:val="start"/>
                     <w:rPr>
@@ -8535,6 +8492,7 @@
                   <w:pPr>
                     <w:pStyle w:val="Normal"/>
                     <w:widowControl/>
+                    <w:suppressAutoHyphens w:val="true"/>
                     <w:spacing w:before="0" w:after="0"/>
                     <w:jc w:val="start"/>
                     <w:rPr>
@@ -8557,7 +8515,7 @@
               </w:tc>
               <w:tc>
                 <w:tcPr>
-                  <w:tcW w:w="710" w:type="dxa"/>
+                  <w:tcW w:w="711" w:type="dxa"/>
                   <w:tcBorders/>
                   <w:shd w:color="auto" w:fill="D9D9D9" w:themeFill="background1" w:themeFillShade="d9" w:val="clear"/>
                   <w:vAlign w:val="center"/>
@@ -8566,21 +8524,20 @@
                   <w:pPr>
                     <w:pStyle w:val="Normal"/>
                     <w:widowControl/>
-                    <w:spacing w:before="0" w:after="0"/>
-                    <w:jc w:val="start"/>
-                    <w:rPr>
-                      <w:rFonts w:ascii="Calibri" w:hAnsi="Calibri" w:cs="Calibri" w:asciiTheme="minorHAnsi" w:cstheme="minorHAnsi" w:hAnsiTheme="minorHAnsi"/>
-                      <w:sz w:val="22"/>
-                      <w:szCs w:val="22"/>
-                    </w:rPr>
-                  </w:pPr>
-                  <w:r>
-                    <w:rPr>
-                      <w:rFonts w:eastAsia="Times New Roman" w:cs="Calibri" w:cstheme="minorHAnsi" w:ascii="Calibri" w:hAnsi="Calibri"/>
-                      <w:kern w:val="0"/>
-                      <w:sz w:val="22"/>
-                      <w:szCs w:val="22"/>
-                      <w:lang w:bidi="ar-SA"/>
+                    <w:suppressAutoHyphens w:val="true"/>
+                    <w:spacing w:before="0" w:after="0"/>
+                    <w:jc w:val="start"/>
+                    <w:rPr>
+                      <w:rFonts w:ascii="Calibri" w:hAnsi="Calibri" w:cs="Calibri" w:asciiTheme="minorHAnsi" w:cstheme="minorHAnsi" w:hAnsiTheme="minorHAnsi"/>
+                      <w:sz w:val="22"/>
+                      <w:szCs w:val="22"/>
+                    </w:rPr>
+                  </w:pPr>
+                  <w:r>
+                    <w:rPr>
+                      <w:rFonts w:cs="Calibri" w:cstheme="minorHAnsi" w:ascii="Calibri" w:hAnsi="Calibri"/>
+                      <w:sz w:val="22"/>
+                      <w:szCs w:val="22"/>
                     </w:rPr>
                   </w:r>
                 </w:p>
@@ -8594,6 +8551,7 @@
                   <w:pPr>
                     <w:pStyle w:val="Normal"/>
                     <w:widowControl/>
+                    <w:suppressAutoHyphens w:val="true"/>
                     <w:spacing w:before="0" w:after="0"/>
                     <w:jc w:val="start"/>
                     <w:rPr>
@@ -8621,14 +8579,15 @@
               </w:trPr>
               <w:tc>
                 <w:tcPr>
-                  <w:tcW w:w="5948" w:type="dxa"/>
-                  <w:tcBorders/>
-                  <w:vAlign w:val="center"/>
-                </w:tcPr>
-                <w:p>
-                  <w:pPr>
-                    <w:pStyle w:val="Normal"/>
-                    <w:widowControl/>
+                  <w:tcW w:w="5947" w:type="dxa"/>
+                  <w:tcBorders/>
+                  <w:vAlign w:val="center"/>
+                </w:tcPr>
+                <w:p>
+                  <w:pPr>
+                    <w:pStyle w:val="Normal"/>
+                    <w:widowControl/>
+                    <w:suppressAutoHyphens w:val="true"/>
                     <w:spacing w:before="0" w:after="0"/>
                     <w:jc w:val="start"/>
                     <w:rPr>
@@ -8659,6 +8618,7 @@
                   <w:pPr>
                     <w:pStyle w:val="Normal"/>
                     <w:widowControl/>
+                    <w:suppressAutoHyphens w:val="true"/>
                     <w:spacing w:before="0" w:after="0"/>
                     <w:jc w:val="start"/>
                     <w:rPr>
@@ -8689,6 +8649,7 @@
                   <w:pPr>
                     <w:pStyle w:val="Normal"/>
                     <w:widowControl/>
+                    <w:suppressAutoHyphens w:val="true"/>
                     <w:spacing w:before="0" w:after="0"/>
                     <w:jc w:val="start"/>
                     <w:rPr>
@@ -8711,7 +8672,7 @@
               </w:tc>
               <w:tc>
                 <w:tcPr>
-                  <w:tcW w:w="710" w:type="dxa"/>
+                  <w:tcW w:w="711" w:type="dxa"/>
                   <w:tcBorders/>
                   <w:shd w:color="auto" w:fill="D9D9D9" w:themeFill="background1" w:themeFillShade="d9" w:val="clear"/>
                   <w:vAlign w:val="center"/>
@@ -8720,21 +8681,20 @@
                   <w:pPr>
                     <w:pStyle w:val="Normal"/>
                     <w:widowControl/>
-                    <w:spacing w:before="0" w:after="0"/>
-                    <w:jc w:val="start"/>
-                    <w:rPr>
-                      <w:rFonts w:ascii="Calibri" w:hAnsi="Calibri" w:cs="Calibri" w:asciiTheme="minorHAnsi" w:cstheme="minorHAnsi" w:hAnsiTheme="minorHAnsi"/>
-                      <w:sz w:val="22"/>
-                      <w:szCs w:val="22"/>
-                    </w:rPr>
-                  </w:pPr>
-                  <w:r>
-                    <w:rPr>
-                      <w:rFonts w:eastAsia="Times New Roman" w:cs="Calibri" w:cstheme="minorHAnsi" w:ascii="Calibri" w:hAnsi="Calibri"/>
-                      <w:kern w:val="0"/>
-                      <w:sz w:val="22"/>
-                      <w:szCs w:val="22"/>
-                      <w:lang w:bidi="ar-SA"/>
+                    <w:suppressAutoHyphens w:val="true"/>
+                    <w:spacing w:before="0" w:after="0"/>
+                    <w:jc w:val="start"/>
+                    <w:rPr>
+                      <w:rFonts w:ascii="Calibri" w:hAnsi="Calibri" w:cs="Calibri" w:asciiTheme="minorHAnsi" w:cstheme="minorHAnsi" w:hAnsiTheme="minorHAnsi"/>
+                      <w:sz w:val="22"/>
+                      <w:szCs w:val="22"/>
+                    </w:rPr>
+                  </w:pPr>
+                  <w:r>
+                    <w:rPr>
+                      <w:rFonts w:cs="Calibri" w:cstheme="minorHAnsi" w:ascii="Calibri" w:hAnsi="Calibri"/>
+                      <w:sz w:val="22"/>
+                      <w:szCs w:val="22"/>
                     </w:rPr>
                   </w:r>
                 </w:p>
@@ -8749,6 +8709,7 @@
                   <w:pPr>
                     <w:pStyle w:val="Normal"/>
                     <w:widowControl/>
+                    <w:suppressAutoHyphens w:val="true"/>
                     <w:spacing w:before="0" w:after="0"/>
                     <w:jc w:val="start"/>
                     <w:rPr>
@@ -8774,14 +8735,15 @@
               </w:trPr>
               <w:tc>
                 <w:tcPr>
-                  <w:tcW w:w="5948" w:type="dxa"/>
-                  <w:tcBorders/>
-                  <w:vAlign w:val="center"/>
-                </w:tcPr>
-                <w:p>
-                  <w:pPr>
-                    <w:pStyle w:val="Normal"/>
-                    <w:widowControl/>
+                  <w:tcW w:w="5947" w:type="dxa"/>
+                  <w:tcBorders/>
+                  <w:vAlign w:val="center"/>
+                </w:tcPr>
+                <w:p>
+                  <w:pPr>
+                    <w:pStyle w:val="Normal"/>
+                    <w:widowControl/>
+                    <w:suppressAutoHyphens w:val="true"/>
                     <w:spacing w:before="0" w:after="0"/>
                     <w:jc w:val="start"/>
                     <w:rPr>
@@ -8812,6 +8774,7 @@
                   <w:pPr>
                     <w:pStyle w:val="Normal"/>
                     <w:widowControl/>
+                    <w:suppressAutoHyphens w:val="true"/>
                     <w:spacing w:before="0" w:after="0"/>
                     <w:jc w:val="start"/>
                     <w:rPr>
@@ -8842,6 +8805,7 @@
                   <w:pPr>
                     <w:pStyle w:val="Normal"/>
                     <w:widowControl/>
+                    <w:suppressAutoHyphens w:val="true"/>
                     <w:spacing w:before="0" w:after="0"/>
                     <w:jc w:val="start"/>
                     <w:rPr>
@@ -8864,7 +8828,7 @@
               </w:tc>
               <w:tc>
                 <w:tcPr>
-                  <w:tcW w:w="710" w:type="dxa"/>
+                  <w:tcW w:w="711" w:type="dxa"/>
                   <w:tcBorders/>
                   <w:shd w:color="auto" w:fill="D9D9D9" w:themeFill="background1" w:themeFillShade="d9" w:val="clear"/>
                   <w:vAlign w:val="center"/>
@@ -8873,21 +8837,20 @@
                   <w:pPr>
                     <w:pStyle w:val="Normal"/>
                     <w:widowControl/>
-                    <w:spacing w:before="0" w:after="0"/>
-                    <w:jc w:val="start"/>
-                    <w:rPr>
-                      <w:rFonts w:ascii="Calibri" w:hAnsi="Calibri" w:cs="Calibri" w:asciiTheme="minorHAnsi" w:cstheme="minorHAnsi" w:hAnsiTheme="minorHAnsi"/>
-                      <w:sz w:val="22"/>
-                      <w:szCs w:val="22"/>
-                    </w:rPr>
-                  </w:pPr>
-                  <w:r>
-                    <w:rPr>
-                      <w:rFonts w:eastAsia="Times New Roman" w:cs="Calibri" w:cstheme="minorHAnsi" w:ascii="Calibri" w:hAnsi="Calibri"/>
-                      <w:kern w:val="0"/>
-                      <w:sz w:val="22"/>
-                      <w:szCs w:val="22"/>
-                      <w:lang w:bidi="ar-SA"/>
+                    <w:suppressAutoHyphens w:val="true"/>
+                    <w:spacing w:before="0" w:after="0"/>
+                    <w:jc w:val="start"/>
+                    <w:rPr>
+                      <w:rFonts w:ascii="Calibri" w:hAnsi="Calibri" w:cs="Calibri" w:asciiTheme="minorHAnsi" w:cstheme="minorHAnsi" w:hAnsiTheme="minorHAnsi"/>
+                      <w:sz w:val="22"/>
+                      <w:szCs w:val="22"/>
+                    </w:rPr>
+                  </w:pPr>
+                  <w:r>
+                    <w:rPr>
+                      <w:rFonts w:cs="Calibri" w:cstheme="minorHAnsi" w:ascii="Calibri" w:hAnsi="Calibri"/>
+                      <w:sz w:val="22"/>
+                      <w:szCs w:val="22"/>
                     </w:rPr>
                   </w:r>
                 </w:p>
@@ -8902,6 +8865,7 @@
                   <w:pPr>
                     <w:pStyle w:val="Normal"/>
                     <w:widowControl/>
+                    <w:suppressAutoHyphens w:val="true"/>
                     <w:spacing w:before="0" w:after="0"/>
                     <w:jc w:val="start"/>
                     <w:rPr>
@@ -8927,14 +8891,15 @@
               </w:trPr>
               <w:tc>
                 <w:tcPr>
-                  <w:tcW w:w="5948" w:type="dxa"/>
-                  <w:tcBorders/>
-                  <w:vAlign w:val="center"/>
-                </w:tcPr>
-                <w:p>
-                  <w:pPr>
-                    <w:pStyle w:val="Normal"/>
-                    <w:widowControl/>
+                  <w:tcW w:w="5947" w:type="dxa"/>
+                  <w:tcBorders/>
+                  <w:vAlign w:val="center"/>
+                </w:tcPr>
+                <w:p>
+                  <w:pPr>
+                    <w:pStyle w:val="Normal"/>
+                    <w:widowControl/>
+                    <w:suppressAutoHyphens w:val="true"/>
                     <w:spacing w:before="0" w:after="0"/>
                     <w:jc w:val="start"/>
                     <w:rPr>
@@ -8965,6 +8930,7 @@
                   <w:pPr>
                     <w:pStyle w:val="Normal"/>
                     <w:widowControl/>
+                    <w:suppressAutoHyphens w:val="true"/>
                     <w:spacing w:before="0" w:after="0"/>
                     <w:jc w:val="start"/>
                     <w:rPr>
@@ -8995,6 +8961,7 @@
                   <w:pPr>
                     <w:pStyle w:val="Normal"/>
                     <w:widowControl/>
+                    <w:suppressAutoHyphens w:val="true"/>
                     <w:spacing w:before="0" w:after="0"/>
                     <w:jc w:val="start"/>
                     <w:rPr>
@@ -9017,7 +8984,7 @@
               </w:tc>
               <w:tc>
                 <w:tcPr>
-                  <w:tcW w:w="710" w:type="dxa"/>
+                  <w:tcW w:w="711" w:type="dxa"/>
                   <w:tcBorders/>
                   <w:shd w:color="auto" w:fill="D9D9D9" w:themeFill="background1" w:themeFillShade="d9" w:val="clear"/>
                   <w:vAlign w:val="center"/>
@@ -9026,21 +8993,20 @@
                   <w:pPr>
                     <w:pStyle w:val="Normal"/>
                     <w:widowControl/>
-                    <w:spacing w:before="0" w:after="0"/>
-                    <w:jc w:val="start"/>
-                    <w:rPr>
-                      <w:rFonts w:ascii="Calibri" w:hAnsi="Calibri" w:cs="Calibri" w:asciiTheme="minorHAnsi" w:cstheme="minorHAnsi" w:hAnsiTheme="minorHAnsi"/>
-                      <w:sz w:val="22"/>
-                      <w:szCs w:val="22"/>
-                    </w:rPr>
-                  </w:pPr>
-                  <w:r>
-                    <w:rPr>
-                      <w:rFonts w:eastAsia="Times New Roman" w:cs="Calibri" w:cstheme="minorHAnsi" w:ascii="Calibri" w:hAnsi="Calibri"/>
-                      <w:kern w:val="0"/>
-                      <w:sz w:val="22"/>
-                      <w:szCs w:val="22"/>
-                      <w:lang w:bidi="ar-SA"/>
+                    <w:suppressAutoHyphens w:val="true"/>
+                    <w:spacing w:before="0" w:after="0"/>
+                    <w:jc w:val="start"/>
+                    <w:rPr>
+                      <w:rFonts w:ascii="Calibri" w:hAnsi="Calibri" w:cs="Calibri" w:asciiTheme="minorHAnsi" w:cstheme="minorHAnsi" w:hAnsiTheme="minorHAnsi"/>
+                      <w:sz w:val="22"/>
+                      <w:szCs w:val="22"/>
+                    </w:rPr>
+                  </w:pPr>
+                  <w:r>
+                    <w:rPr>
+                      <w:rFonts w:cs="Calibri" w:cstheme="minorHAnsi" w:ascii="Calibri" w:hAnsi="Calibri"/>
+                      <w:sz w:val="22"/>
+                      <w:szCs w:val="22"/>
                     </w:rPr>
                   </w:r>
                 </w:p>
@@ -9055,6 +9021,7 @@
                   <w:pPr>
                     <w:pStyle w:val="Normal"/>
                     <w:widowControl/>
+                    <w:suppressAutoHyphens w:val="true"/>
                     <w:spacing w:before="0" w:after="0"/>
                     <w:jc w:val="start"/>
                     <w:rPr>
@@ -9080,14 +9047,15 @@
               </w:trPr>
               <w:tc>
                 <w:tcPr>
-                  <w:tcW w:w="5948" w:type="dxa"/>
-                  <w:tcBorders/>
-                  <w:vAlign w:val="center"/>
-                </w:tcPr>
-                <w:p>
-                  <w:pPr>
-                    <w:pStyle w:val="Normal"/>
-                    <w:widowControl/>
+                  <w:tcW w:w="5947" w:type="dxa"/>
+                  <w:tcBorders/>
+                  <w:vAlign w:val="center"/>
+                </w:tcPr>
+                <w:p>
+                  <w:pPr>
+                    <w:pStyle w:val="Normal"/>
+                    <w:widowControl/>
+                    <w:suppressAutoHyphens w:val="true"/>
                     <w:spacing w:before="0" w:after="0"/>
                     <w:jc w:val="start"/>
                     <w:rPr>
@@ -9118,6 +9086,7 @@
                   <w:pPr>
                     <w:pStyle w:val="Normal"/>
                     <w:widowControl/>
+                    <w:suppressAutoHyphens w:val="true"/>
                     <w:spacing w:before="0" w:after="0"/>
                     <w:jc w:val="start"/>
                     <w:rPr>
@@ -9148,6 +9117,7 @@
                   <w:pPr>
                     <w:pStyle w:val="Normal"/>
                     <w:widowControl/>
+                    <w:suppressAutoHyphens w:val="true"/>
                     <w:spacing w:before="0" w:after="0"/>
                     <w:jc w:val="start"/>
                     <w:rPr>
@@ -9170,7 +9140,7 @@
               </w:tc>
               <w:tc>
                 <w:tcPr>
-                  <w:tcW w:w="710" w:type="dxa"/>
+                  <w:tcW w:w="711" w:type="dxa"/>
                   <w:tcBorders/>
                   <w:shd w:color="auto" w:fill="D9D9D9" w:themeFill="background1" w:themeFillShade="d9" w:val="clear"/>
                   <w:vAlign w:val="center"/>
@@ -9179,21 +9149,20 @@
                   <w:pPr>
                     <w:pStyle w:val="Normal"/>
                     <w:widowControl/>
-                    <w:spacing w:before="0" w:after="0"/>
-                    <w:jc w:val="start"/>
-                    <w:rPr>
-                      <w:rFonts w:ascii="Calibri" w:hAnsi="Calibri" w:cs="Calibri" w:asciiTheme="minorHAnsi" w:cstheme="minorHAnsi" w:hAnsiTheme="minorHAnsi"/>
-                      <w:sz w:val="22"/>
-                      <w:szCs w:val="22"/>
-                    </w:rPr>
-                  </w:pPr>
-                  <w:r>
-                    <w:rPr>
-                      <w:rFonts w:eastAsia="Times New Roman" w:cs="Calibri" w:cstheme="minorHAnsi" w:ascii="Calibri" w:hAnsi="Calibri"/>
-                      <w:kern w:val="0"/>
-                      <w:sz w:val="22"/>
-                      <w:szCs w:val="22"/>
-                      <w:lang w:bidi="ar-SA"/>
+                    <w:suppressAutoHyphens w:val="true"/>
+                    <w:spacing w:before="0" w:after="0"/>
+                    <w:jc w:val="start"/>
+                    <w:rPr>
+                      <w:rFonts w:ascii="Calibri" w:hAnsi="Calibri" w:cs="Calibri" w:asciiTheme="minorHAnsi" w:cstheme="minorHAnsi" w:hAnsiTheme="minorHAnsi"/>
+                      <w:sz w:val="22"/>
+                      <w:szCs w:val="22"/>
+                    </w:rPr>
+                  </w:pPr>
+                  <w:r>
+                    <w:rPr>
+                      <w:rFonts w:cs="Calibri" w:cstheme="minorHAnsi" w:ascii="Calibri" w:hAnsi="Calibri"/>
+                      <w:sz w:val="22"/>
+                      <w:szCs w:val="22"/>
                     </w:rPr>
                   </w:r>
                 </w:p>
@@ -9208,6 +9177,7 @@
                   <w:pPr>
                     <w:pStyle w:val="Normal"/>
                     <w:widowControl/>
+                    <w:suppressAutoHyphens w:val="true"/>
                     <w:spacing w:before="0" w:after="0"/>
                     <w:jc w:val="start"/>
                     <w:rPr>
@@ -9235,14 +9205,15 @@
               </w:trPr>
               <w:tc>
                 <w:tcPr>
-                  <w:tcW w:w="5948" w:type="dxa"/>
-                  <w:tcBorders/>
-                  <w:vAlign w:val="center"/>
-                </w:tcPr>
-                <w:p>
-                  <w:pPr>
-                    <w:pStyle w:val="Normal"/>
-                    <w:widowControl/>
+                  <w:tcW w:w="5947" w:type="dxa"/>
+                  <w:tcBorders/>
+                  <w:vAlign w:val="center"/>
+                </w:tcPr>
+                <w:p>
+                  <w:pPr>
+                    <w:pStyle w:val="Normal"/>
+                    <w:widowControl/>
+                    <w:suppressAutoHyphens w:val="true"/>
                     <w:spacing w:before="0" w:after="0"/>
                     <w:jc w:val="start"/>
                     <w:rPr>
@@ -9273,6 +9244,7 @@
                   <w:pPr>
                     <w:pStyle w:val="Normal"/>
                     <w:widowControl/>
+                    <w:suppressAutoHyphens w:val="true"/>
                     <w:spacing w:before="0" w:after="0"/>
                     <w:jc w:val="start"/>
                     <w:rPr>
@@ -9303,6 +9275,7 @@
                   <w:pPr>
                     <w:pStyle w:val="Normal"/>
                     <w:widowControl/>
+                    <w:suppressAutoHyphens w:val="true"/>
                     <w:spacing w:before="0" w:after="0"/>
                     <w:jc w:val="start"/>
                     <w:rPr>
@@ -9325,7 +9298,7 @@
               </w:tc>
               <w:tc>
                 <w:tcPr>
-                  <w:tcW w:w="710" w:type="dxa"/>
+                  <w:tcW w:w="711" w:type="dxa"/>
                   <w:tcBorders/>
                   <w:shd w:color="auto" w:fill="D9D9D9" w:themeFill="background1" w:themeFillShade="d9" w:val="clear"/>
                   <w:vAlign w:val="center"/>
@@ -9334,21 +9307,20 @@
                   <w:pPr>
                     <w:pStyle w:val="Normal"/>
                     <w:widowControl/>
-                    <w:spacing w:before="0" w:after="0"/>
-                    <w:jc w:val="start"/>
-                    <w:rPr>
-                      <w:rFonts w:ascii="Calibri" w:hAnsi="Calibri" w:cs="Calibri" w:asciiTheme="minorHAnsi" w:cstheme="minorHAnsi" w:hAnsiTheme="minorHAnsi"/>
-                      <w:sz w:val="22"/>
-                      <w:szCs w:val="22"/>
-                    </w:rPr>
-                  </w:pPr>
-                  <w:r>
-                    <w:rPr>
-                      <w:rFonts w:eastAsia="Times New Roman" w:cs="Calibri" w:cstheme="minorHAnsi" w:ascii="Calibri" w:hAnsi="Calibri"/>
-                      <w:kern w:val="0"/>
-                      <w:sz w:val="22"/>
-                      <w:szCs w:val="22"/>
-                      <w:lang w:bidi="ar-SA"/>
+                    <w:suppressAutoHyphens w:val="true"/>
+                    <w:spacing w:before="0" w:after="0"/>
+                    <w:jc w:val="start"/>
+                    <w:rPr>
+                      <w:rFonts w:ascii="Calibri" w:hAnsi="Calibri" w:cs="Calibri" w:asciiTheme="minorHAnsi" w:cstheme="minorHAnsi" w:hAnsiTheme="minorHAnsi"/>
+                      <w:sz w:val="22"/>
+                      <w:szCs w:val="22"/>
+                    </w:rPr>
+                  </w:pPr>
+                  <w:r>
+                    <w:rPr>
+                      <w:rFonts w:cs="Calibri" w:cstheme="minorHAnsi" w:ascii="Calibri" w:hAnsi="Calibri"/>
+                      <w:sz w:val="22"/>
+                      <w:szCs w:val="22"/>
                     </w:rPr>
                   </w:r>
                 </w:p>
@@ -9363,6 +9335,7 @@
                   <w:pPr>
                     <w:pStyle w:val="Normal"/>
                     <w:widowControl/>
+                    <w:suppressAutoHyphens w:val="true"/>
                     <w:spacing w:before="0" w:after="0"/>
                     <w:jc w:val="start"/>
                     <w:rPr>
@@ -9388,14 +9361,15 @@
               </w:trPr>
               <w:tc>
                 <w:tcPr>
-                  <w:tcW w:w="5948" w:type="dxa"/>
-                  <w:tcBorders/>
-                  <w:vAlign w:val="center"/>
-                </w:tcPr>
-                <w:p>
-                  <w:pPr>
-                    <w:pStyle w:val="Normal"/>
-                    <w:widowControl/>
+                  <w:tcW w:w="5947" w:type="dxa"/>
+                  <w:tcBorders/>
+                  <w:vAlign w:val="center"/>
+                </w:tcPr>
+                <w:p>
+                  <w:pPr>
+                    <w:pStyle w:val="Normal"/>
+                    <w:widowControl/>
+                    <w:suppressAutoHyphens w:val="true"/>
                     <w:spacing w:before="0" w:after="0"/>
                     <w:jc w:val="start"/>
                     <w:rPr>
@@ -9426,6 +9400,7 @@
                   <w:pPr>
                     <w:pStyle w:val="Normal"/>
                     <w:widowControl/>
+                    <w:suppressAutoHyphens w:val="true"/>
                     <w:spacing w:before="0" w:after="0"/>
                     <w:jc w:val="start"/>
                     <w:rPr>
@@ -9456,6 +9431,7 @@
                   <w:pPr>
                     <w:pStyle w:val="Normal"/>
                     <w:widowControl/>
+                    <w:suppressAutoHyphens w:val="true"/>
                     <w:spacing w:before="0" w:after="0"/>
                     <w:jc w:val="start"/>
                     <w:rPr>
@@ -9478,7 +9454,7 @@
               </w:tc>
               <w:tc>
                 <w:tcPr>
-                  <w:tcW w:w="710" w:type="dxa"/>
+                  <w:tcW w:w="711" w:type="dxa"/>
                   <w:tcBorders/>
                   <w:shd w:color="auto" w:fill="D9D9D9" w:themeFill="background1" w:themeFillShade="d9" w:val="clear"/>
                   <w:vAlign w:val="center"/>
@@ -9487,21 +9463,20 @@
                   <w:pPr>
                     <w:pStyle w:val="Normal"/>
                     <w:widowControl/>
-                    <w:spacing w:before="0" w:after="0"/>
-                    <w:jc w:val="start"/>
-                    <w:rPr>
-                      <w:rFonts w:ascii="Calibri" w:hAnsi="Calibri" w:cs="Calibri" w:asciiTheme="minorHAnsi" w:cstheme="minorHAnsi" w:hAnsiTheme="minorHAnsi"/>
-                      <w:sz w:val="22"/>
-                      <w:szCs w:val="22"/>
-                    </w:rPr>
-                  </w:pPr>
-                  <w:r>
-                    <w:rPr>
-                      <w:rFonts w:eastAsia="Times New Roman" w:cs="Calibri" w:cstheme="minorHAnsi" w:ascii="Calibri" w:hAnsi="Calibri"/>
-                      <w:kern w:val="0"/>
-                      <w:sz w:val="22"/>
-                      <w:szCs w:val="22"/>
-                      <w:lang w:bidi="ar-SA"/>
+                    <w:suppressAutoHyphens w:val="true"/>
+                    <w:spacing w:before="0" w:after="0"/>
+                    <w:jc w:val="start"/>
+                    <w:rPr>
+                      <w:rFonts w:ascii="Calibri" w:hAnsi="Calibri" w:cs="Calibri" w:asciiTheme="minorHAnsi" w:cstheme="minorHAnsi" w:hAnsiTheme="minorHAnsi"/>
+                      <w:sz w:val="22"/>
+                      <w:szCs w:val="22"/>
+                    </w:rPr>
+                  </w:pPr>
+                  <w:r>
+                    <w:rPr>
+                      <w:rFonts w:cs="Calibri" w:cstheme="minorHAnsi" w:ascii="Calibri" w:hAnsi="Calibri"/>
+                      <w:sz w:val="22"/>
+                      <w:szCs w:val="22"/>
                     </w:rPr>
                   </w:r>
                 </w:p>
@@ -9516,6 +9491,7 @@
                   <w:pPr>
                     <w:pStyle w:val="Normal"/>
                     <w:widowControl/>
+                    <w:suppressAutoHyphens w:val="true"/>
                     <w:spacing w:before="0" w:after="0"/>
                     <w:jc w:val="start"/>
                     <w:rPr>
@@ -9550,6 +9526,7 @@
                   <w:pPr>
                     <w:pStyle w:val="Normal"/>
                     <w:widowControl/>
+                    <w:suppressAutoHyphens w:val="true"/>
                     <w:spacing w:before="0" w:after="0"/>
                     <w:jc w:val="start"/>
                     <w:rPr>
@@ -9580,21 +9557,20 @@
                   <w:pPr>
                     <w:pStyle w:val="Normal"/>
                     <w:widowControl/>
-                    <w:spacing w:before="0" w:after="0"/>
-                    <w:jc w:val="start"/>
-                    <w:rPr>
-                      <w:rFonts w:ascii="Calibri" w:hAnsi="Calibri" w:cs="Calibri" w:asciiTheme="minorHAnsi" w:cstheme="minorHAnsi" w:hAnsiTheme="minorHAnsi"/>
-                      <w:sz w:val="22"/>
-                      <w:szCs w:val="22"/>
-                    </w:rPr>
-                  </w:pPr>
-                  <w:r>
-                    <w:rPr>
-                      <w:rFonts w:eastAsia="Times New Roman" w:cs="Calibri" w:cstheme="minorHAnsi" w:ascii="Calibri" w:hAnsi="Calibri"/>
-                      <w:kern w:val="0"/>
-                      <w:sz w:val="22"/>
-                      <w:szCs w:val="22"/>
-                      <w:lang w:bidi="ar-SA"/>
+                    <w:suppressAutoHyphens w:val="true"/>
+                    <w:spacing w:before="0" w:after="0"/>
+                    <w:jc w:val="start"/>
+                    <w:rPr>
+                      <w:rFonts w:ascii="Calibri" w:hAnsi="Calibri" w:cs="Calibri" w:asciiTheme="minorHAnsi" w:cstheme="minorHAnsi" w:hAnsiTheme="minorHAnsi"/>
+                      <w:sz w:val="22"/>
+                      <w:szCs w:val="22"/>
+                    </w:rPr>
+                  </w:pPr>
+                  <w:r>
+                    <w:rPr>
+                      <w:rFonts w:cs="Calibri" w:cstheme="minorHAnsi" w:ascii="Calibri" w:hAnsi="Calibri"/>
+                      <w:sz w:val="22"/>
+                      <w:szCs w:val="22"/>
                     </w:rPr>
                   </w:r>
                 </w:p>
@@ -9677,8 +9653,8 @@
       <w:tblGrid>
         <w:gridCol w:w="2127"/>
         <w:gridCol w:w="3102"/>
-        <w:gridCol w:w="1574"/>
-        <w:gridCol w:w="3656"/>
+        <w:gridCol w:w="1573"/>
+        <w:gridCol w:w="3657"/>
       </w:tblGrid>
       <w:tr>
         <w:trPr/>
@@ -9696,6 +9672,7 @@
             <w:pPr>
               <w:pStyle w:val="Normal"/>
               <w:widowControl/>
+              <w:suppressAutoHyphens w:val="true"/>
               <w:spacing w:before="0" w:after="0"/>
               <w:jc w:val="start"/>
               <w:rPr>
@@ -9740,6 +9717,7 @@
             <w:pPr>
               <w:pStyle w:val="Normal"/>
               <w:widowControl/>
+              <w:suppressAutoHyphens w:val="true"/>
               <w:spacing w:before="0" w:after="0"/>
               <w:jc w:val="start"/>
               <w:rPr>
@@ -9762,7 +9740,7 @@
         </w:tc>
         <w:tc>
           <w:tcPr>
-            <w:tcW w:w="1574" w:type="dxa"/>
+            <w:tcW w:w="1573" w:type="dxa"/>
             <w:tcBorders>
               <w:top w:val="nil"/>
               <w:start w:val="nil"/>
@@ -9774,6 +9752,7 @@
             <w:pPr>
               <w:pStyle w:val="Normal"/>
               <w:widowControl/>
+              <w:suppressAutoHyphens w:val="true"/>
               <w:spacing w:before="0" w:after="0"/>
               <w:jc w:val="start"/>
               <w:rPr>
@@ -9796,7 +9775,7 @@
         </w:tc>
         <w:tc>
           <w:tcPr>
-            <w:tcW w:w="3656" w:type="dxa"/>
+            <w:tcW w:w="3657" w:type="dxa"/>
             <w:tcBorders>
               <w:top w:val="nil"/>
               <w:start w:val="nil"/>
@@ -9808,6 +9787,7 @@
             <w:pPr>
               <w:pStyle w:val="Normal"/>
               <w:widowControl/>
+              <w:suppressAutoHyphens w:val="true"/>
               <w:spacing w:before="0" w:after="0"/>
               <w:jc w:val="start"/>
               <w:rPr>
@@ -9847,6 +9827,7 @@
             <w:pPr>
               <w:pStyle w:val="Normal"/>
               <w:widowControl/>
+              <w:suppressAutoHyphens w:val="true"/>
               <w:spacing w:before="0" w:after="0"/>
               <w:jc w:val="start"/>
               <w:rPr>
@@ -9891,6 +9872,7 @@
             <w:pPr>
               <w:pStyle w:val="Normal"/>
               <w:widowControl/>
+              <w:suppressAutoHyphens w:val="true"/>
               <w:spacing w:before="0" w:after="0"/>
               <w:jc w:val="start"/>
               <w:rPr>
@@ -9913,7 +9895,7 @@
         </w:tc>
         <w:tc>
           <w:tcPr>
-            <w:tcW w:w="1574" w:type="dxa"/>
+            <w:tcW w:w="1573" w:type="dxa"/>
             <w:tcBorders>
               <w:top w:val="nil"/>
               <w:start w:val="nil"/>
@@ -9925,6 +9907,7 @@
             <w:pPr>
               <w:pStyle w:val="Normal"/>
               <w:widowControl/>
+              <w:suppressAutoHyphens w:val="true"/>
               <w:spacing w:before="0" w:after="0"/>
               <w:jc w:val="start"/>
               <w:rPr>
@@ -9947,7 +9930,7 @@
         </w:tc>
         <w:tc>
           <w:tcPr>
-            <w:tcW w:w="3656" w:type="dxa"/>
+            <w:tcW w:w="3657" w:type="dxa"/>
             <w:tcBorders>
               <w:top w:val="nil"/>
               <w:start w:val="nil"/>
@@ -9959,6 +9942,7 @@
             <w:pPr>
               <w:pStyle w:val="Normal"/>
               <w:widowControl/>
+              <w:suppressAutoHyphens w:val="true"/>
               <w:spacing w:before="0" w:after="0"/>
               <w:jc w:val="start"/>
               <w:rPr>
@@ -10001,12 +9985,12 @@
       </w:r>
     </w:p>
     <w:sectPr>
-      <w:headerReference w:type="even" r:id="rId7"/>
-      <w:headerReference w:type="default" r:id="rId8"/>
-      <w:headerReference w:type="first" r:id="rId9"/>
-      <w:footerReference w:type="even" r:id="rId10"/>
-      <w:footerReference w:type="default" r:id="rId11"/>
-      <w:footerReference w:type="first" r:id="rId12"/>
+      <w:headerReference w:type="even" r:id="rId3"/>
+      <w:headerReference w:type="default" r:id="rId4"/>
+      <w:headerReference w:type="first" r:id="rId5"/>
+      <w:footerReference w:type="even" r:id="rId6"/>
+      <w:footerReference w:type="default" r:id="rId7"/>
+      <w:footerReference w:type="first" r:id="rId8"/>
       <w:type w:val="nextPage"/>
       <w:pgSz w:w="11906" w:h="16838"/>
       <w:pgMar w:left="720" w:right="720" w:gutter="0" w:header="748" w:top="805" w:footer="720" w:bottom="777"/>
@@ -10152,7 +10136,7 @@
         <wp:inline distT="0" distB="0" distL="0" distR="0">
           <wp:extent cx="1562100" cy="333375"/>
           <wp:effectExtent l="0" t="0" r="0" b="0"/>
-          <wp:docPr id="5" name="Image3"/>
+          <wp:docPr id="1" name="Image3"/>
           <wp:cNvGraphicFramePr>
             <a:graphicFrameLocks xmlns:a="http://schemas.openxmlformats.org/drawingml/2006/main" noChangeAspect="1"/>
           </wp:cNvGraphicFramePr>
@@ -10160,7 +10144,7 @@
             <a:graphicData uri="http://schemas.openxmlformats.org/drawingml/2006/picture">
               <pic:pic xmlns:pic="http://schemas.openxmlformats.org/drawingml/2006/picture">
                 <pic:nvPicPr>
-                  <pic:cNvPr id="5" name="Image3"/>
+                  <pic:cNvPr id="1" name="Image3"/>
                   <pic:cNvPicPr>
                     <a:picLocks noChangeAspect="1" noChangeArrowheads="1"/>
                   </pic:cNvPicPr>
@@ -10244,7 +10228,7 @@
         <wp:inline distT="0" distB="0" distL="0" distR="0">
           <wp:extent cx="1562100" cy="333375"/>
           <wp:effectExtent l="0" t="0" r="0" b="0"/>
-          <wp:docPr id="6" name="Image3"/>
+          <wp:docPr id="2" name="Image3"/>
           <wp:cNvGraphicFramePr>
             <a:graphicFrameLocks xmlns:a="http://schemas.openxmlformats.org/drawingml/2006/main" noChangeAspect="1"/>
           </wp:cNvGraphicFramePr>
@@ -10252,7 +10236,7 @@
             <a:graphicData uri="http://schemas.openxmlformats.org/drawingml/2006/picture">
               <pic:pic xmlns:pic="http://schemas.openxmlformats.org/drawingml/2006/picture">
                 <pic:nvPicPr>
-                  <pic:cNvPr id="6" name="Image3"/>
+                  <pic:cNvPr id="2" name="Image3"/>
                   <pic:cNvPicPr>
                     <a:picLocks noChangeAspect="1" noChangeArrowheads="1"/>
                   </pic:cNvPicPr>
@@ -10696,6 +10680,7 @@
     <w:rsid w:val="008d1ece"/>
     <w:pPr>
       <w:widowControl/>
+      <w:suppressAutoHyphens w:val="true"/>
       <w:bidi w:val="0"/>
       <w:spacing w:before="0" w:after="0"/>
       <w:jc w:val="start"/>
@@ -10928,6 +10913,7 @@
     <w:rsid w:val="003f732a"/>
     <w:pPr>
       <w:widowControl/>
+      <w:suppressAutoHyphens w:val="true"/>
       <w:bidi w:val="0"/>
       <w:spacing w:before="0" w:after="0"/>
       <w:jc w:val="start"/>
@@ -10940,6 +10926,13 @@
       <w:szCs w:val="24"/>
       <w:lang w:val="en-IN" w:eastAsia="en-US" w:bidi="ar-SA"/>
     </w:rPr>
+  </w:style>
+  <w:style w:type="paragraph" w:styleId="FrameContentsuser">
+    <w:name w:val="Frame Contents (user)"/>
+    <w:basedOn w:val="Normal"/>
+    <w:qFormat/>
+    <w:pPr/>
+    <w:rPr/>
   </w:style>
   <w:style w:type="paragraph" w:styleId="FrameContents">
     <w:name w:val="Frame Contents"/>

</xml_diff>

<commit_message>
feat: add today day
</commit_message>
<xml_diff>
--- a/src/assets/profiles/Clarity-Staff-Profile_-_Care_UK_Care_Profile_Template_updated_May_2026.docx
+++ b/src/assets/profiles/Clarity-Staff-Profile_-_Care_UK_Care_Profile_Template_updated_May_2026.docx
@@ -1922,11 +1922,7 @@
             </w:pPr>
             <w:r>
               <w:rPr/>
-              <w:t>{%images.TermLetter}</w:t>
-            </w:r>
-            <w:r>
-              <w:rPr/>
-              <w:t>{%images.CosLetter}</w:t>
+              <w:t>{%images.TermLetter}{%images.CosLetter}</w:t>
             </w:r>
           </w:p>
         </w:tc>
@@ -3355,7 +3351,7 @@
           <w:tbl>
             <w:tblPr>
               <w:tblStyle w:val="TableGrid"/>
-              <w:tblpPr w:vertAnchor="margin" w:horzAnchor="margin" w:leftFromText="180" w:rightFromText="180" w:tblpX="-137" w:tblpY="-1020"/>
+              <w:tblpPr w:vertAnchor="margin" w:horzAnchor="margin" w:leftFromText="180" w:rightFromText="180" w:tblpX="-132" w:tblpY="-1020"/>
               <w:tblOverlap w:val="never"/>
               <w:tblW w:w="10454" w:type="dxa"/>
               <w:jc w:val="start"/>
@@ -3372,8 +3368,8 @@
             <w:tblGrid>
               <w:gridCol w:w="6942"/>
               <w:gridCol w:w="706"/>
-              <w:gridCol w:w="704"/>
-              <w:gridCol w:w="2102"/>
+              <w:gridCol w:w="703"/>
+              <w:gridCol w:w="2103"/>
             </w:tblGrid>
             <w:tr>
               <w:trPr>
@@ -3463,7 +3459,7 @@
               </w:tc>
               <w:tc>
                 <w:tcPr>
-                  <w:tcW w:w="704" w:type="dxa"/>
+                  <w:tcW w:w="703" w:type="dxa"/>
                   <w:tcBorders/>
                   <w:vAlign w:val="center"/>
                 </w:tcPr>
@@ -3510,7 +3506,7 @@
               </w:tc>
               <w:tc>
                 <w:tcPr>
-                  <w:tcW w:w="2102" w:type="dxa"/>
+                  <w:tcW w:w="2103" w:type="dxa"/>
                   <w:tcBorders/>
                   <w:vAlign w:val="center"/>
                 </w:tcPr>
@@ -3664,7 +3660,7 @@
               </w:tc>
               <w:tc>
                 <w:tcPr>
-                  <w:tcW w:w="704" w:type="dxa"/>
+                  <w:tcW w:w="703" w:type="dxa"/>
                   <w:tcBorders/>
                   <w:vAlign w:val="center"/>
                 </w:tcPr>
@@ -3710,7 +3706,7 @@
               </w:tc>
               <w:tc>
                 <w:tcPr>
-                  <w:tcW w:w="2102" w:type="dxa"/>
+                  <w:tcW w:w="2103" w:type="dxa"/>
                   <w:tcBorders/>
                   <w:vAlign w:val="bottom"/>
                 </w:tcPr>
@@ -3825,7 +3821,7 @@
               </w:tc>
               <w:tc>
                 <w:tcPr>
-                  <w:tcW w:w="704" w:type="dxa"/>
+                  <w:tcW w:w="703" w:type="dxa"/>
                   <w:tcBorders/>
                   <w:vAlign w:val="center"/>
                 </w:tcPr>
@@ -3871,7 +3867,7 @@
               </w:tc>
               <w:tc>
                 <w:tcPr>
-                  <w:tcW w:w="2102" w:type="dxa"/>
+                  <w:tcW w:w="2103" w:type="dxa"/>
                   <w:tcBorders/>
                   <w:vAlign w:val="bottom"/>
                 </w:tcPr>
@@ -3909,7 +3905,7 @@
               </w:trPr>
               <w:tc>
                 <w:tcPr>
-                  <w:tcW w:w="8352" w:type="dxa"/>
+                  <w:tcW w:w="8351" w:type="dxa"/>
                   <w:gridSpan w:val="3"/>
                   <w:tcBorders/>
                   <w:vAlign w:val="center"/>
@@ -3983,7 +3979,7 @@
               </w:tc>
               <w:tc>
                 <w:tcPr>
-                  <w:tcW w:w="2102" w:type="dxa"/>
+                  <w:tcW w:w="2103" w:type="dxa"/>
                   <w:tcBorders/>
                   <w:vAlign w:val="bottom"/>
                 </w:tcPr>
@@ -4053,17 +4049,17 @@
               <w:tblLook w:noHBand="0" w:lastColumn="0" w:firstColumn="1" w:lastRow="0" w:firstRow="1" w:noVBand="1" w:val="04a0"/>
             </w:tblPr>
             <w:tblGrid>
-              <w:gridCol w:w="5947"/>
+              <w:gridCol w:w="5946"/>
               <w:gridCol w:w="709"/>
               <w:gridCol w:w="708"/>
-              <w:gridCol w:w="711"/>
+              <w:gridCol w:w="712"/>
               <w:gridCol w:w="2385"/>
             </w:tblGrid>
             <w:tr>
               <w:trPr/>
               <w:tc>
                 <w:tcPr>
-                  <w:tcW w:w="5947" w:type="dxa"/>
+                  <w:tcW w:w="5946" w:type="dxa"/>
                   <w:tcBorders/>
                   <w:shd w:color="auto" w:fill="BFBFBF" w:themeFill="background1" w:themeFillShade="bf" w:val="clear"/>
                 </w:tcPr>
@@ -4168,7 +4164,7 @@
               </w:tc>
               <w:tc>
                 <w:tcPr>
-                  <w:tcW w:w="711" w:type="dxa"/>
+                  <w:tcW w:w="712" w:type="dxa"/>
                   <w:tcBorders/>
                   <w:shd w:color="auto" w:fill="BFBFBF" w:themeFill="background1" w:themeFillShade="bf" w:val="clear"/>
                 </w:tcPr>
@@ -4243,7 +4239,7 @@
               </w:trPr>
               <w:tc>
                 <w:tcPr>
-                  <w:tcW w:w="5947" w:type="dxa"/>
+                  <w:tcW w:w="5946" w:type="dxa"/>
                   <w:tcBorders/>
                   <w:vAlign w:val="center"/>
                 </w:tcPr>
@@ -4338,7 +4334,7 @@
               </w:tc>
               <w:tc>
                 <w:tcPr>
-                  <w:tcW w:w="711" w:type="dxa"/>
+                  <w:tcW w:w="712" w:type="dxa"/>
                   <w:tcBorders/>
                   <w:shd w:color="auto" w:fill="D9D9D9" w:themeFill="background1" w:themeFillShade="d9" w:val="clear"/>
                   <w:vAlign w:val="center"/>
@@ -4403,7 +4399,7 @@
               </w:trPr>
               <w:tc>
                 <w:tcPr>
-                  <w:tcW w:w="5947" w:type="dxa"/>
+                  <w:tcW w:w="5946" w:type="dxa"/>
                   <w:tcBorders/>
                   <w:vAlign w:val="center"/>
                 </w:tcPr>
@@ -4498,7 +4494,7 @@
               </w:tc>
               <w:tc>
                 <w:tcPr>
-                  <w:tcW w:w="711" w:type="dxa"/>
+                  <w:tcW w:w="712" w:type="dxa"/>
                   <w:tcBorders/>
                   <w:shd w:color="auto" w:fill="D9D9D9" w:themeFill="background1" w:themeFillShade="d9" w:val="clear"/>
                   <w:vAlign w:val="center"/>
@@ -4562,7 +4558,7 @@
               </w:trPr>
               <w:tc>
                 <w:tcPr>
-                  <w:tcW w:w="5947" w:type="dxa"/>
+                  <w:tcW w:w="5946" w:type="dxa"/>
                   <w:tcBorders/>
                   <w:vAlign w:val="center"/>
                 </w:tcPr>
@@ -4657,7 +4653,7 @@
               </w:tc>
               <w:tc>
                 <w:tcPr>
-                  <w:tcW w:w="711" w:type="dxa"/>
+                  <w:tcW w:w="712" w:type="dxa"/>
                   <w:tcBorders/>
                   <w:shd w:color="auto" w:fill="D9D9D9" w:themeFill="background1" w:themeFillShade="d9" w:val="clear"/>
                   <w:vAlign w:val="center"/>
@@ -4721,7 +4717,7 @@
               </w:trPr>
               <w:tc>
                 <w:tcPr>
-                  <w:tcW w:w="5947" w:type="dxa"/>
+                  <w:tcW w:w="5946" w:type="dxa"/>
                   <w:tcBorders/>
                   <w:vAlign w:val="center"/>
                 </w:tcPr>
@@ -4816,7 +4812,7 @@
               </w:tc>
               <w:tc>
                 <w:tcPr>
-                  <w:tcW w:w="711" w:type="dxa"/>
+                  <w:tcW w:w="712" w:type="dxa"/>
                   <w:tcBorders/>
                   <w:shd w:color="auto" w:fill="D9D9D9" w:themeFill="background1" w:themeFillShade="d9" w:val="clear"/>
                   <w:vAlign w:val="center"/>
@@ -4880,7 +4876,7 @@
               </w:trPr>
               <w:tc>
                 <w:tcPr>
-                  <w:tcW w:w="5947" w:type="dxa"/>
+                  <w:tcW w:w="5946" w:type="dxa"/>
                   <w:tcBorders/>
                   <w:vAlign w:val="center"/>
                 </w:tcPr>
@@ -4975,7 +4971,7 @@
               </w:tc>
               <w:tc>
                 <w:tcPr>
-                  <w:tcW w:w="711" w:type="dxa"/>
+                  <w:tcW w:w="712" w:type="dxa"/>
                   <w:tcBorders/>
                   <w:shd w:color="auto" w:fill="D9D9D9" w:themeFill="background1" w:themeFillShade="d9" w:val="clear"/>
                   <w:vAlign w:val="center"/>
@@ -5039,7 +5035,7 @@
               </w:trPr>
               <w:tc>
                 <w:tcPr>
-                  <w:tcW w:w="5947" w:type="dxa"/>
+                  <w:tcW w:w="5946" w:type="dxa"/>
                   <w:tcBorders/>
                   <w:vAlign w:val="center"/>
                 </w:tcPr>
@@ -5134,7 +5130,7 @@
               </w:tc>
               <w:tc>
                 <w:tcPr>
-                  <w:tcW w:w="711" w:type="dxa"/>
+                  <w:tcW w:w="712" w:type="dxa"/>
                   <w:tcBorders/>
                   <w:shd w:color="auto" w:fill="D9D9D9" w:themeFill="background1" w:themeFillShade="d9" w:val="clear"/>
                   <w:vAlign w:val="center"/>
@@ -5198,7 +5194,7 @@
               </w:trPr>
               <w:tc>
                 <w:tcPr>
-                  <w:tcW w:w="5947" w:type="dxa"/>
+                  <w:tcW w:w="5946" w:type="dxa"/>
                   <w:tcBorders/>
                   <w:vAlign w:val="center"/>
                 </w:tcPr>
@@ -5293,7 +5289,7 @@
               </w:tc>
               <w:tc>
                 <w:tcPr>
-                  <w:tcW w:w="711" w:type="dxa"/>
+                  <w:tcW w:w="712" w:type="dxa"/>
                   <w:tcBorders/>
                   <w:shd w:color="auto" w:fill="D9D9D9" w:themeFill="background1" w:themeFillShade="d9" w:val="clear"/>
                   <w:vAlign w:val="center"/>
@@ -5357,7 +5353,7 @@
               </w:trPr>
               <w:tc>
                 <w:tcPr>
-                  <w:tcW w:w="5947" w:type="dxa"/>
+                  <w:tcW w:w="5946" w:type="dxa"/>
                   <w:tcBorders/>
                   <w:vAlign w:val="center"/>
                 </w:tcPr>
@@ -5495,7 +5491,7 @@
               </w:tc>
               <w:tc>
                 <w:tcPr>
-                  <w:tcW w:w="711" w:type="dxa"/>
+                  <w:tcW w:w="712" w:type="dxa"/>
                   <w:tcBorders/>
                   <w:shd w:color="auto" w:fill="D9D9D9" w:themeFill="background1" w:themeFillShade="d9" w:val="clear"/>
                   <w:vAlign w:val="center"/>
@@ -5600,7 +5596,7 @@
               </w:trPr>
               <w:tc>
                 <w:tcPr>
-                  <w:tcW w:w="5947" w:type="dxa"/>
+                  <w:tcW w:w="5946" w:type="dxa"/>
                   <w:tcBorders/>
                   <w:vAlign w:val="center"/>
                 </w:tcPr>
@@ -5693,7 +5689,7 @@
               </w:tc>
               <w:tc>
                 <w:tcPr>
-                  <w:tcW w:w="711" w:type="dxa"/>
+                  <w:tcW w:w="712" w:type="dxa"/>
                   <w:tcBorders/>
                   <w:shd w:color="auto" w:fill="D9D9D9" w:themeFill="background1" w:themeFillShade="d9" w:val="clear"/>
                   <w:vAlign w:val="center"/>
@@ -5756,7 +5752,7 @@
               </w:trPr>
               <w:tc>
                 <w:tcPr>
-                  <w:tcW w:w="5947" w:type="dxa"/>
+                  <w:tcW w:w="5946" w:type="dxa"/>
                   <w:tcBorders/>
                   <w:vAlign w:val="center"/>
                 </w:tcPr>
@@ -5849,7 +5845,7 @@
               </w:tc>
               <w:tc>
                 <w:tcPr>
-                  <w:tcW w:w="711" w:type="dxa"/>
+                  <w:tcW w:w="712" w:type="dxa"/>
                   <w:tcBorders/>
                   <w:shd w:color="auto" w:fill="D9D9D9" w:themeFill="background1" w:themeFillShade="d9" w:val="clear"/>
                   <w:vAlign w:val="center"/>
@@ -5913,7 +5909,7 @@
               </w:trPr>
               <w:tc>
                 <w:tcPr>
-                  <w:tcW w:w="5947" w:type="dxa"/>
+                  <w:tcW w:w="5946" w:type="dxa"/>
                   <w:tcBorders/>
                   <w:vAlign w:val="center"/>
                 </w:tcPr>
@@ -6006,7 +6002,7 @@
               </w:tc>
               <w:tc>
                 <w:tcPr>
-                  <w:tcW w:w="711" w:type="dxa"/>
+                  <w:tcW w:w="712" w:type="dxa"/>
                   <w:tcBorders/>
                   <w:shd w:color="auto" w:fill="D9D9D9" w:themeFill="background1" w:themeFillShade="d9" w:val="clear"/>
                   <w:vAlign w:val="center"/>
@@ -6070,7 +6066,7 @@
               </w:trPr>
               <w:tc>
                 <w:tcPr>
-                  <w:tcW w:w="5947" w:type="dxa"/>
+                  <w:tcW w:w="5946" w:type="dxa"/>
                   <w:tcBorders/>
                   <w:vAlign w:val="center"/>
                 </w:tcPr>
@@ -6163,7 +6159,7 @@
               </w:tc>
               <w:tc>
                 <w:tcPr>
-                  <w:tcW w:w="711" w:type="dxa"/>
+                  <w:tcW w:w="712" w:type="dxa"/>
                   <w:tcBorders/>
                   <w:shd w:color="auto" w:fill="D9D9D9" w:themeFill="background1" w:themeFillShade="d9" w:val="clear"/>
                   <w:vAlign w:val="center"/>
@@ -6227,7 +6223,7 @@
               </w:trPr>
               <w:tc>
                 <w:tcPr>
-                  <w:tcW w:w="5947" w:type="dxa"/>
+                  <w:tcW w:w="5946" w:type="dxa"/>
                   <w:tcBorders/>
                   <w:vAlign w:val="center"/>
                 </w:tcPr>
@@ -6320,7 +6316,7 @@
               </w:tc>
               <w:tc>
                 <w:tcPr>
-                  <w:tcW w:w="711" w:type="dxa"/>
+                  <w:tcW w:w="712" w:type="dxa"/>
                   <w:tcBorders/>
                   <w:shd w:color="auto" w:fill="D9D9D9" w:themeFill="background1" w:themeFillShade="d9" w:val="clear"/>
                   <w:vAlign w:val="center"/>
@@ -6384,7 +6380,7 @@
               </w:trPr>
               <w:tc>
                 <w:tcPr>
-                  <w:tcW w:w="5947" w:type="dxa"/>
+                  <w:tcW w:w="5946" w:type="dxa"/>
                   <w:tcBorders/>
                   <w:vAlign w:val="center"/>
                 </w:tcPr>
@@ -6477,7 +6473,7 @@
               </w:tc>
               <w:tc>
                 <w:tcPr>
-                  <w:tcW w:w="711" w:type="dxa"/>
+                  <w:tcW w:w="712" w:type="dxa"/>
                   <w:tcBorders/>
                   <w:shd w:color="auto" w:fill="D9D9D9" w:themeFill="background1" w:themeFillShade="d9" w:val="clear"/>
                   <w:vAlign w:val="center"/>
@@ -6541,7 +6537,7 @@
               </w:trPr>
               <w:tc>
                 <w:tcPr>
-                  <w:tcW w:w="5947" w:type="dxa"/>
+                  <w:tcW w:w="5946" w:type="dxa"/>
                   <w:tcBorders/>
                   <w:vAlign w:val="center"/>
                 </w:tcPr>
@@ -6634,7 +6630,7 @@
               </w:tc>
               <w:tc>
                 <w:tcPr>
-                  <w:tcW w:w="711" w:type="dxa"/>
+                  <w:tcW w:w="712" w:type="dxa"/>
                   <w:tcBorders/>
                   <w:shd w:color="auto" w:fill="D9D9D9" w:themeFill="background1" w:themeFillShade="d9" w:val="clear"/>
                   <w:vAlign w:val="center"/>
@@ -6698,7 +6694,7 @@
               </w:trPr>
               <w:tc>
                 <w:tcPr>
-                  <w:tcW w:w="5947" w:type="dxa"/>
+                  <w:tcW w:w="5946" w:type="dxa"/>
                   <w:tcBorders/>
                   <w:vAlign w:val="center"/>
                 </w:tcPr>
@@ -6791,7 +6787,7 @@
               </w:tc>
               <w:tc>
                 <w:tcPr>
-                  <w:tcW w:w="711" w:type="dxa"/>
+                  <w:tcW w:w="712" w:type="dxa"/>
                   <w:tcBorders/>
                   <w:shd w:color="auto" w:fill="D9D9D9" w:themeFill="background1" w:themeFillShade="d9" w:val="clear"/>
                   <w:vAlign w:val="center"/>
@@ -6855,7 +6851,7 @@
               </w:trPr>
               <w:tc>
                 <w:tcPr>
-                  <w:tcW w:w="5947" w:type="dxa"/>
+                  <w:tcW w:w="5946" w:type="dxa"/>
                   <w:tcBorders/>
                   <w:vAlign w:val="center"/>
                 </w:tcPr>
@@ -6948,7 +6944,7 @@
               </w:tc>
               <w:tc>
                 <w:tcPr>
-                  <w:tcW w:w="711" w:type="dxa"/>
+                  <w:tcW w:w="712" w:type="dxa"/>
                   <w:tcBorders/>
                   <w:shd w:color="auto" w:fill="D9D9D9" w:themeFill="background1" w:themeFillShade="d9" w:val="clear"/>
                   <w:vAlign w:val="center"/>
@@ -7012,7 +7008,7 @@
               </w:trPr>
               <w:tc>
                 <w:tcPr>
-                  <w:tcW w:w="5947" w:type="dxa"/>
+                  <w:tcW w:w="5946" w:type="dxa"/>
                   <w:tcBorders/>
                   <w:vAlign w:val="center"/>
                 </w:tcPr>
@@ -7105,7 +7101,7 @@
               </w:tc>
               <w:tc>
                 <w:tcPr>
-                  <w:tcW w:w="711" w:type="dxa"/>
+                  <w:tcW w:w="712" w:type="dxa"/>
                   <w:tcBorders/>
                   <w:shd w:color="auto" w:fill="D9D9D9" w:themeFill="background1" w:themeFillShade="d9" w:val="clear"/>
                   <w:vAlign w:val="center"/>
@@ -7169,7 +7165,7 @@
               </w:trPr>
               <w:tc>
                 <w:tcPr>
-                  <w:tcW w:w="5947" w:type="dxa"/>
+                  <w:tcW w:w="5946" w:type="dxa"/>
                   <w:tcBorders/>
                   <w:vAlign w:val="center"/>
                 </w:tcPr>
@@ -7262,7 +7258,7 @@
               </w:tc>
               <w:tc>
                 <w:tcPr>
-                  <w:tcW w:w="711" w:type="dxa"/>
+                  <w:tcW w:w="712" w:type="dxa"/>
                   <w:tcBorders/>
                   <w:shd w:color="auto" w:fill="D9D9D9" w:themeFill="background1" w:themeFillShade="d9" w:val="clear"/>
                   <w:vAlign w:val="center"/>
@@ -7325,7 +7321,7 @@
               </w:trPr>
               <w:tc>
                 <w:tcPr>
-                  <w:tcW w:w="5947" w:type="dxa"/>
+                  <w:tcW w:w="5946" w:type="dxa"/>
                   <w:tcBorders/>
                   <w:vAlign w:val="center"/>
                 </w:tcPr>
@@ -7418,7 +7414,7 @@
               </w:tc>
               <w:tc>
                 <w:tcPr>
-                  <w:tcW w:w="711" w:type="dxa"/>
+                  <w:tcW w:w="712" w:type="dxa"/>
                   <w:tcBorders/>
                   <w:shd w:color="auto" w:fill="D9D9D9" w:themeFill="background1" w:themeFillShade="d9" w:val="clear"/>
                   <w:vAlign w:val="center"/>
@@ -7483,7 +7479,7 @@
               </w:trPr>
               <w:tc>
                 <w:tcPr>
-                  <w:tcW w:w="5947" w:type="dxa"/>
+                  <w:tcW w:w="5946" w:type="dxa"/>
                   <w:tcBorders/>
                   <w:vAlign w:val="center"/>
                 </w:tcPr>
@@ -7576,7 +7572,7 @@
               </w:tc>
               <w:tc>
                 <w:tcPr>
-                  <w:tcW w:w="711" w:type="dxa"/>
+                  <w:tcW w:w="712" w:type="dxa"/>
                   <w:tcBorders/>
                   <w:shd w:color="auto" w:fill="D9D9D9" w:themeFill="background1" w:themeFillShade="d9" w:val="clear"/>
                   <w:vAlign w:val="center"/>
@@ -7639,7 +7635,7 @@
               </w:trPr>
               <w:tc>
                 <w:tcPr>
-                  <w:tcW w:w="5947" w:type="dxa"/>
+                  <w:tcW w:w="5946" w:type="dxa"/>
                   <w:tcBorders/>
                   <w:vAlign w:val="center"/>
                 </w:tcPr>
@@ -7732,7 +7728,7 @@
               </w:tc>
               <w:tc>
                 <w:tcPr>
-                  <w:tcW w:w="711" w:type="dxa"/>
+                  <w:tcW w:w="712" w:type="dxa"/>
                   <w:tcBorders/>
                   <w:shd w:color="auto" w:fill="D9D9D9" w:themeFill="background1" w:themeFillShade="d9" w:val="clear"/>
                   <w:vAlign w:val="center"/>
@@ -7795,7 +7791,7 @@
               </w:trPr>
               <w:tc>
                 <w:tcPr>
-                  <w:tcW w:w="5947" w:type="dxa"/>
+                  <w:tcW w:w="5946" w:type="dxa"/>
                   <w:tcBorders/>
                   <w:vAlign w:val="center"/>
                 </w:tcPr>
@@ -7888,7 +7884,7 @@
               </w:tc>
               <w:tc>
                 <w:tcPr>
-                  <w:tcW w:w="711" w:type="dxa"/>
+                  <w:tcW w:w="712" w:type="dxa"/>
                   <w:tcBorders/>
                   <w:shd w:color="auto" w:fill="D9D9D9" w:themeFill="background1" w:themeFillShade="d9" w:val="clear"/>
                   <w:vAlign w:val="center"/>
@@ -7951,7 +7947,7 @@
               </w:trPr>
               <w:tc>
                 <w:tcPr>
-                  <w:tcW w:w="5947" w:type="dxa"/>
+                  <w:tcW w:w="5946" w:type="dxa"/>
                   <w:tcBorders/>
                   <w:vAlign w:val="center"/>
                 </w:tcPr>
@@ -8044,7 +8040,7 @@
               </w:tc>
               <w:tc>
                 <w:tcPr>
-                  <w:tcW w:w="711" w:type="dxa"/>
+                  <w:tcW w:w="712" w:type="dxa"/>
                   <w:tcBorders/>
                   <w:shd w:color="auto" w:fill="D9D9D9" w:themeFill="background1" w:themeFillShade="d9" w:val="clear"/>
                   <w:vAlign w:val="center"/>
@@ -8109,7 +8105,7 @@
               </w:trPr>
               <w:tc>
                 <w:tcPr>
-                  <w:tcW w:w="5947" w:type="dxa"/>
+                  <w:tcW w:w="5946" w:type="dxa"/>
                   <w:tcBorders/>
                   <w:vAlign w:val="center"/>
                 </w:tcPr>
@@ -8202,7 +8198,7 @@
               </w:tc>
               <w:tc>
                 <w:tcPr>
-                  <w:tcW w:w="711" w:type="dxa"/>
+                  <w:tcW w:w="712" w:type="dxa"/>
                   <w:tcBorders/>
                   <w:shd w:color="auto" w:fill="D9D9D9" w:themeFill="background1" w:themeFillShade="d9" w:val="clear"/>
                   <w:vAlign w:val="center"/>
@@ -8265,7 +8261,7 @@
               </w:trPr>
               <w:tc>
                 <w:tcPr>
-                  <w:tcW w:w="5947" w:type="dxa"/>
+                  <w:tcW w:w="5946" w:type="dxa"/>
                   <w:tcBorders/>
                   <w:vAlign w:val="center"/>
                 </w:tcPr>
@@ -8358,7 +8354,7 @@
               </w:tc>
               <w:tc>
                 <w:tcPr>
-                  <w:tcW w:w="711" w:type="dxa"/>
+                  <w:tcW w:w="712" w:type="dxa"/>
                   <w:tcBorders/>
                   <w:shd w:color="auto" w:fill="D9D9D9" w:themeFill="background1" w:themeFillShade="d9" w:val="clear"/>
                   <w:vAlign w:val="center"/>
@@ -8422,7 +8418,7 @@
               </w:trPr>
               <w:tc>
                 <w:tcPr>
-                  <w:tcW w:w="5947" w:type="dxa"/>
+                  <w:tcW w:w="5946" w:type="dxa"/>
                   <w:tcBorders/>
                   <w:vAlign w:val="center"/>
                 </w:tcPr>
@@ -8515,7 +8511,7 @@
               </w:tc>
               <w:tc>
                 <w:tcPr>
-                  <w:tcW w:w="711" w:type="dxa"/>
+                  <w:tcW w:w="712" w:type="dxa"/>
                   <w:tcBorders/>
                   <w:shd w:color="auto" w:fill="D9D9D9" w:themeFill="background1" w:themeFillShade="d9" w:val="clear"/>
                   <w:vAlign w:val="center"/>
@@ -8579,7 +8575,7 @@
               </w:trPr>
               <w:tc>
                 <w:tcPr>
-                  <w:tcW w:w="5947" w:type="dxa"/>
+                  <w:tcW w:w="5946" w:type="dxa"/>
                   <w:tcBorders/>
                   <w:vAlign w:val="center"/>
                 </w:tcPr>
@@ -8672,7 +8668,7 @@
               </w:tc>
               <w:tc>
                 <w:tcPr>
-                  <w:tcW w:w="711" w:type="dxa"/>
+                  <w:tcW w:w="712" w:type="dxa"/>
                   <w:tcBorders/>
                   <w:shd w:color="auto" w:fill="D9D9D9" w:themeFill="background1" w:themeFillShade="d9" w:val="clear"/>
                   <w:vAlign w:val="center"/>
@@ -8735,7 +8731,7 @@
               </w:trPr>
               <w:tc>
                 <w:tcPr>
-                  <w:tcW w:w="5947" w:type="dxa"/>
+                  <w:tcW w:w="5946" w:type="dxa"/>
                   <w:tcBorders/>
                   <w:vAlign w:val="center"/>
                 </w:tcPr>
@@ -8828,7 +8824,7 @@
               </w:tc>
               <w:tc>
                 <w:tcPr>
-                  <w:tcW w:w="711" w:type="dxa"/>
+                  <w:tcW w:w="712" w:type="dxa"/>
                   <w:tcBorders/>
                   <w:shd w:color="auto" w:fill="D9D9D9" w:themeFill="background1" w:themeFillShade="d9" w:val="clear"/>
                   <w:vAlign w:val="center"/>
@@ -8891,7 +8887,7 @@
               </w:trPr>
               <w:tc>
                 <w:tcPr>
-                  <w:tcW w:w="5947" w:type="dxa"/>
+                  <w:tcW w:w="5946" w:type="dxa"/>
                   <w:tcBorders/>
                   <w:vAlign w:val="center"/>
                 </w:tcPr>
@@ -8984,7 +8980,7 @@
               </w:tc>
               <w:tc>
                 <w:tcPr>
-                  <w:tcW w:w="711" w:type="dxa"/>
+                  <w:tcW w:w="712" w:type="dxa"/>
                   <w:tcBorders/>
                   <w:shd w:color="auto" w:fill="D9D9D9" w:themeFill="background1" w:themeFillShade="d9" w:val="clear"/>
                   <w:vAlign w:val="center"/>
@@ -9047,7 +9043,7 @@
               </w:trPr>
               <w:tc>
                 <w:tcPr>
-                  <w:tcW w:w="5947" w:type="dxa"/>
+                  <w:tcW w:w="5946" w:type="dxa"/>
                   <w:tcBorders/>
                   <w:vAlign w:val="center"/>
                 </w:tcPr>
@@ -9140,7 +9136,7 @@
               </w:tc>
               <w:tc>
                 <w:tcPr>
-                  <w:tcW w:w="711" w:type="dxa"/>
+                  <w:tcW w:w="712" w:type="dxa"/>
                   <w:tcBorders/>
                   <w:shd w:color="auto" w:fill="D9D9D9" w:themeFill="background1" w:themeFillShade="d9" w:val="clear"/>
                   <w:vAlign w:val="center"/>
@@ -9205,7 +9201,7 @@
               </w:trPr>
               <w:tc>
                 <w:tcPr>
-                  <w:tcW w:w="5947" w:type="dxa"/>
+                  <w:tcW w:w="5946" w:type="dxa"/>
                   <w:tcBorders/>
                   <w:vAlign w:val="center"/>
                 </w:tcPr>
@@ -9298,7 +9294,7 @@
               </w:tc>
               <w:tc>
                 <w:tcPr>
-                  <w:tcW w:w="711" w:type="dxa"/>
+                  <w:tcW w:w="712" w:type="dxa"/>
                   <w:tcBorders/>
                   <w:shd w:color="auto" w:fill="D9D9D9" w:themeFill="background1" w:themeFillShade="d9" w:val="clear"/>
                   <w:vAlign w:val="center"/>
@@ -9361,7 +9357,7 @@
               </w:trPr>
               <w:tc>
                 <w:tcPr>
-                  <w:tcW w:w="5947" w:type="dxa"/>
+                  <w:tcW w:w="5946" w:type="dxa"/>
                   <w:tcBorders/>
                   <w:vAlign w:val="center"/>
                 </w:tcPr>
@@ -9454,7 +9450,7 @@
               </w:tc>
               <w:tc>
                 <w:tcPr>
-                  <w:tcW w:w="711" w:type="dxa"/>
+                  <w:tcW w:w="712" w:type="dxa"/>
                   <w:tcBorders/>
                   <w:shd w:color="auto" w:fill="D9D9D9" w:themeFill="background1" w:themeFillShade="d9" w:val="clear"/>
                   <w:vAlign w:val="center"/>
@@ -9653,8 +9649,8 @@
       <w:tblGrid>
         <w:gridCol w:w="2127"/>
         <w:gridCol w:w="3102"/>
-        <w:gridCol w:w="1573"/>
-        <w:gridCol w:w="3657"/>
+        <w:gridCol w:w="1572"/>
+        <w:gridCol w:w="3658"/>
       </w:tblGrid>
       <w:tr>
         <w:trPr/>
@@ -9740,7 +9736,7 @@
         </w:tc>
         <w:tc>
           <w:tcPr>
-            <w:tcW w:w="1573" w:type="dxa"/>
+            <w:tcW w:w="1572" w:type="dxa"/>
             <w:tcBorders>
               <w:top w:val="nil"/>
               <w:start w:val="nil"/>
@@ -9775,7 +9771,7 @@
         </w:tc>
         <w:tc>
           <w:tcPr>
-            <w:tcW w:w="3657" w:type="dxa"/>
+            <w:tcW w:w="3658" w:type="dxa"/>
             <w:tcBorders>
               <w:top w:val="nil"/>
               <w:start w:val="nil"/>
@@ -9895,7 +9891,7 @@
         </w:tc>
         <w:tc>
           <w:tcPr>
-            <w:tcW w:w="1573" w:type="dxa"/>
+            <w:tcW w:w="1572" w:type="dxa"/>
             <w:tcBorders>
               <w:top w:val="nil"/>
               <w:start w:val="nil"/>
@@ -9930,7 +9926,7 @@
         </w:tc>
         <w:tc>
           <w:tcPr>
-            <w:tcW w:w="3657" w:type="dxa"/>
+            <w:tcW w:w="3658" w:type="dxa"/>
             <w:tcBorders>
               <w:top w:val="nil"/>
               <w:start w:val="nil"/>
@@ -9959,7 +9955,7 @@
                 <w:szCs w:val="22"/>
                 <w:lang w:bidi="ar-SA"/>
               </w:rPr>
-              <w:t>12/06/2026</w:t>
+              <w:t>{todayDate}</w:t>
             </w:r>
           </w:p>
         </w:tc>
@@ -10927,15 +10923,15 @@
       <w:lang w:val="en-IN" w:eastAsia="en-US" w:bidi="ar-SA"/>
     </w:rPr>
   </w:style>
-  <w:style w:type="paragraph" w:styleId="FrameContentsuser">
-    <w:name w:val="Frame Contents (user)"/>
+  <w:style w:type="paragraph" w:styleId="FrameContents">
+    <w:name w:val="Frame Contents"/>
     <w:basedOn w:val="Normal"/>
     <w:qFormat/>
     <w:pPr/>
     <w:rPr/>
   </w:style>
-  <w:style w:type="paragraph" w:styleId="FrameContents">
-    <w:name w:val="Frame Contents"/>
+  <w:style w:type="paragraph" w:styleId="FrameContentsuser">
+    <w:name w:val="Frame Contents (user)"/>
     <w:basedOn w:val="Normal"/>
     <w:qFormat/>
     <w:pPr/>

</xml_diff>